<commit_message>
docs: improve academic formatting, embed 5 rendered PNG diagrams in DOCX, and remove all emojis
</commit_message>
<xml_diff>
--- a/T5 - Proyecto-20260527/DOCUMENTACION_COMPLETA.docx
+++ b/T5 - Proyecto-20260527/DOCUMENTACION_COMPLETA.docx
@@ -6,21 +6,22 @@
       <w:pPr>
         <w:pStyle w:val="Heading1"/>
         <w:keepNext/>
-        <w:spacing w:before="360" w:after="160"/>
+        <w:spacing w:before="480" w:after="240"/>
       </w:pPr>
       <w:r>
         <w:rPr>
-          <w:rFonts w:ascii="Arial" w:hAnsi="Arial"/>
+          <w:rFonts w:ascii="Times New Roman" w:hAnsi="Times New Roman"/>
           <w:b/>
-          <w:color w:val="1A5276"/>
-          <w:sz w:val="40"/>
+          <w:color w:val="000000"/>
+          <w:sz w:val="36"/>
         </w:rPr>
-        <w:t>🎓 TRABAJO FIN DE GRADO — CHESS LEGACY</w:t>
+        <w:t>TRABAJO FIN DE GRADO — CHESS LEGACY</w:t>
       </w:r>
     </w:p>
     <w:p>
       <w:pPr>
-        <w:spacing w:after="120" w:line="276" w:lineRule="auto"/>
+        <w:spacing w:after="160" w:line="276" w:lineRule="auto"/>
+        <w:jc w:val="both"/>
       </w:pPr>
       <w:r>
         <w:rPr>
@@ -28,13 +29,11 @@
         </w:rPr>
         <w:t>UNIVERSIDAD MIGUEL HERNÁNDEZ DE ELCHE</w:t>
       </w:r>
-      <w:r>
-        <w:t xml:space="preserve">  </w:t>
-      </w:r>
     </w:p>
     <w:p>
       <w:pPr>
-        <w:spacing w:after="120" w:line="276" w:lineRule="auto"/>
+        <w:spacing w:after="160" w:line="276" w:lineRule="auto"/>
+        <w:jc w:val="both"/>
       </w:pPr>
       <w:r>
         <w:rPr>
@@ -42,13 +41,11 @@
         </w:rPr>
         <w:t>ESCUELA POLITÉCNICA SUPERIOR DE ELCHE</w:t>
       </w:r>
-      <w:r>
-        <w:t xml:space="preserve">  </w:t>
-      </w:r>
     </w:p>
     <w:p>
       <w:pPr>
-        <w:spacing w:after="120" w:line="276" w:lineRule="auto"/>
+        <w:spacing w:after="160" w:line="276" w:lineRule="auto"/>
+        <w:jc w:val="both"/>
       </w:pPr>
       <w:r>
         <w:rPr>
@@ -66,21 +63,22 @@
       <w:pPr>
         <w:pStyle w:val="Heading1"/>
         <w:keepNext/>
-        <w:spacing w:before="360" w:after="160"/>
+        <w:spacing w:before="480" w:after="240"/>
       </w:pPr>
       <w:r>
         <w:rPr>
-          <w:rFonts w:ascii="Arial" w:hAnsi="Arial"/>
+          <w:rFonts w:ascii="Times New Roman" w:hAnsi="Times New Roman"/>
           <w:b/>
-          <w:color w:val="1A5276"/>
-          <w:sz w:val="40"/>
+          <w:color w:val="000000"/>
+          <w:sz w:val="36"/>
         </w:rPr>
         <w:t>Memoria Técnica del Proyecto: Chess Legacy</w:t>
       </w:r>
     </w:p>
     <w:p>
       <w:pPr>
-        <w:spacing w:after="120" w:line="276" w:lineRule="auto"/>
+        <w:spacing w:after="160" w:line="276" w:lineRule="auto"/>
+        <w:jc w:val="both"/>
       </w:pPr>
       <w:r>
         <w:rPr>
@@ -92,12 +90,9 @@
     <w:p>
       <w:pPr>
         <w:pStyle w:val="ListBullet"/>
-        <w:spacing w:after="60"/>
+        <w:spacing w:after="80"/>
         <w:ind w:left="360"/>
       </w:pPr>
-      <w:r>
-        <w:t xml:space="preserve">  </w:t>
-      </w:r>
       <w:r>
         <w:rPr>
           <w:b/>
@@ -111,12 +106,9 @@
     <w:p>
       <w:pPr>
         <w:pStyle w:val="ListBullet"/>
-        <w:spacing w:after="60"/>
+        <w:spacing w:after="80"/>
         <w:ind w:left="360"/>
       </w:pPr>
-      <w:r>
-        <w:t xml:space="preserve">  </w:t>
-      </w:r>
       <w:r>
         <w:rPr>
           <w:b/>
@@ -130,12 +122,9 @@
     <w:p>
       <w:pPr>
         <w:pStyle w:val="ListBullet"/>
-        <w:spacing w:after="60"/>
+        <w:spacing w:after="80"/>
         <w:ind w:left="360"/>
       </w:pPr>
-      <w:r>
-        <w:t xml:space="preserve">  </w:t>
-      </w:r>
       <w:r>
         <w:rPr>
           <w:b/>
@@ -155,29 +144,31 @@
       <w:pPr>
         <w:pStyle w:val="Heading2"/>
         <w:keepNext/>
-        <w:spacing w:before="280" w:after="120"/>
+        <w:spacing w:before="360" w:after="160"/>
       </w:pPr>
       <w:r>
         <w:rPr>
-          <w:rFonts w:ascii="Arial" w:hAnsi="Arial"/>
+          <w:rFonts w:ascii="Times New Roman" w:hAnsi="Times New Roman"/>
           <w:b/>
-          <w:color w:val="2980B9"/>
-          <w:sz w:val="30"/>
+          <w:color w:val="000000"/>
+          <w:sz w:val="28"/>
         </w:rPr>
-        <w:t>📝 Resumen del Proyecto</w:t>
+        <w:t>Resumen del Proyecto</w:t>
       </w:r>
     </w:p>
     <w:p>
       <w:pPr>
-        <w:spacing w:after="120" w:line="276" w:lineRule="auto"/>
+        <w:spacing w:after="160" w:line="276" w:lineRule="auto"/>
+        <w:jc w:val="both"/>
       </w:pPr>
       <w:r>
-        <w:t xml:space="preserve">Chess Legacy es una plataforma web integral de entrenamiento, juego y análisis de ajedrez diseñada para resolver las limitaciones de accesibilidad técnica y de coste de las plataformas comerciales actuales. El sistema permite a los estudiantes jugar contra 20 maestros históricos con perfiles de personalidad de juego adaptativos (tales como Mikhail Tal o Bobby Fischer), realizar análisis avanzados con el motor Stockfish integrado localmente, visualizar analytics de juego e historial, y seguir una progresión ludificada por XP. </w:t>
+        <w:t>Chess Legacy es una plataforma web integral de entrenamiento, juego y análisis de ajedrez diseñada para resolver las limitaciones de accesibilidad técnica y de coste de las plataformas comerciales actuales. El sistema permite a los estudiantes jugar contra 20 maestros históricos con perfiles de personalidad de juego adaptativos (tales como Mikhail Tal o Bobby Fischer), realizar análisis avanzados con el motor Stockfish integrado localmente, visualizar analytics de juego e historial, y seguir una progresión ludificada por XP.</w:t>
       </w:r>
     </w:p>
     <w:p>
       <w:pPr>
-        <w:spacing w:after="120" w:line="276" w:lineRule="auto"/>
+        <w:spacing w:after="160" w:line="276" w:lineRule="auto"/>
+        <w:jc w:val="both"/>
       </w:pPr>
       <w:r>
         <w:t>La solución técnica adopta un stack robusto de última generación: frontend reactivo Single Page (React 18 + Vite), backend empresarial en capas (ASP.NET Core 10.0 + Entity Framework Core), base de datos integrada (SQLite), y orquestación multiplataforma completa en contenedores independientes y persistentes (Docker + Docker Compose).</w:t>
@@ -192,126 +183,126 @@
       <w:pPr>
         <w:pStyle w:val="Heading2"/>
         <w:keepNext/>
-        <w:spacing w:before="280" w:after="120"/>
+        <w:spacing w:before="360" w:after="160"/>
       </w:pPr>
       <w:r>
         <w:rPr>
-          <w:rFonts w:ascii="Arial" w:hAnsi="Arial"/>
+          <w:rFonts w:ascii="Times New Roman" w:hAnsi="Times New Roman"/>
           <w:b/>
-          <w:color w:val="2980B9"/>
-          <w:sz w:val="30"/>
+          <w:color w:val="000000"/>
+          <w:sz w:val="28"/>
         </w:rPr>
-        <w:t>📑 Índice General</w:t>
+        <w:t>Índice General</w:t>
       </w:r>
     </w:p>
     <w:p>
       <w:pPr>
         <w:pStyle w:val="ListBullet"/>
-        <w:spacing w:after="60"/>
+        <w:spacing w:after="80"/>
         <w:ind w:left="360"/>
       </w:pPr>
       <w:r>
-        <w:t xml:space="preserve">  [Capítulo 1: Introducción y Objetivos](#capítulo-1-introducción-y-objetivos)</w:t>
+        <w:t>[Capítulo 1: Introducción y Objetivos](#capítulo-1-introducción-y-objetivos)</w:t>
       </w:r>
     </w:p>
     <w:p>
       <w:pPr>
         <w:pStyle w:val="ListBullet"/>
-        <w:spacing w:after="60"/>
+        <w:spacing w:after="80"/>
         <w:ind w:left="360"/>
       </w:pPr>
       <w:r>
-        <w:t xml:space="preserve">  [Capítulo 2: Antecedentes y Estado de la Cuestión](#capítulo-2-antecedentes-y-estado-de-la-cuestión)</w:t>
+        <w:t>[Capítulo 2: Antecedentes y Estado de la Cuestión](#capítulo-2-antecedentes-y-estado-de-la-cuestión)</w:t>
       </w:r>
     </w:p>
     <w:p>
       <w:pPr>
         <w:pStyle w:val="ListBullet"/>
-        <w:spacing w:after="60"/>
+        <w:spacing w:after="80"/>
         <w:ind w:left="360"/>
       </w:pPr>
       <w:r>
-        <w:t xml:space="preserve">  [Capítulo 3: Hipótesis de Trabajo y Tecnologías](#capítulo-3-hipótesis-de-trabajo-y-tecnologías)</w:t>
+        <w:t>[Capítulo 3: Hipótesis de Trabajo y Tecnologías](#capítulo-3-hipótesis-de-trabajo-y-tecnologías)</w:t>
       </w:r>
     </w:p>
     <w:p>
       <w:pPr>
         <w:pStyle w:val="ListBullet"/>
-        <w:spacing w:after="60"/>
+        <w:spacing w:after="80"/>
         <w:ind w:left="360"/>
       </w:pPr>
       <w:r>
-        <w:t xml:space="preserve">  [Capítulo 4: Metodología, Diseño y Resultados](#capítulo-4-metodología-diseño-y-resultados)</w:t>
+        <w:t>[Capítulo 4: Metodología, Diseño y Resultados](#capítulo-4-metodología-diseño-y-resultados)</w:t>
       </w:r>
     </w:p>
     <w:p>
       <w:pPr>
         <w:pStyle w:val="ListBullet"/>
-        <w:spacing w:after="60"/>
+        <w:spacing w:after="80"/>
         <w:ind w:left="1080"/>
       </w:pPr>
       <w:r>
-        <w:t xml:space="preserve">  [4.1 Planificación Temporal (Gantt)](#41-planificación-temporal-gantt)</w:t>
+        <w:t>[4.1 Planificación Temporal (Gantt)](#41-planificación-temporal-gantt)</w:t>
       </w:r>
     </w:p>
     <w:p>
       <w:pPr>
         <w:pStyle w:val="ListBullet"/>
-        <w:spacing w:after="60"/>
+        <w:spacing w:after="80"/>
         <w:ind w:left="1080"/>
       </w:pPr>
       <w:r>
-        <w:t xml:space="preserve">  [4.2 Captura de Requisitos (Casos de Uso)](#42-captura-de-requisitos-casos-de-uso)</w:t>
+        <w:t>[4.2 Captura de Requisitos (Casos de Uso)](#42-captura-de-requisitos-casos-de-uso)</w:t>
       </w:r>
     </w:p>
     <w:p>
       <w:pPr>
         <w:pStyle w:val="ListBullet"/>
-        <w:spacing w:after="60"/>
+        <w:spacing w:after="80"/>
         <w:ind w:left="1080"/>
       </w:pPr>
       <w:r>
-        <w:t xml:space="preserve">  [4.3 Diseño Arquitectónico y Base de Datos (E/R y UML)](#43-diseño-arquitectónico-y-base-de-datos-er-y-uml)</w:t>
+        <w:t>[4.3 Diseño Arquitectónico y Base de Datos (E/R y UML)](#43-diseño-arquitectónico-y-base-de-datos-er-y-uml)</w:t>
       </w:r>
     </w:p>
     <w:p>
       <w:pPr>
         <w:pStyle w:val="ListBullet"/>
-        <w:spacing w:after="60"/>
+        <w:spacing w:after="80"/>
         <w:ind w:left="1080"/>
       </w:pPr>
       <w:r>
-        <w:t xml:space="preserve">  [4.4 Dinámica del Sistema (Diagrama de Secuencia)](#44-dinámica-del-sistema-diagrama-de-secuencia)</w:t>
+        <w:t>[4.4 Dinámica del Sistema (Diagrama de Secuencia)](#44-dinámica-del-sistema-diagrama-de-secuencia)</w:t>
       </w:r>
     </w:p>
     <w:p>
       <w:pPr>
         <w:pStyle w:val="ListBullet"/>
-        <w:spacing w:after="60"/>
+        <w:spacing w:after="80"/>
         <w:ind w:left="1080"/>
       </w:pPr>
       <w:r>
-        <w:t xml:space="preserve">  [4.5 Resultados e Implementación](#45-resultados-e-implementación)</w:t>
+        <w:t>[4.5 Resultados e Implementación](#45-resultados-e-implementación)</w:t>
       </w:r>
     </w:p>
     <w:p>
       <w:pPr>
         <w:pStyle w:val="ListBullet"/>
-        <w:spacing w:after="60"/>
+        <w:spacing w:after="80"/>
         <w:ind w:left="360"/>
       </w:pPr>
       <w:r>
-        <w:t xml:space="preserve">  [Capítulo 5: Conclusiones y Trabajo Futuro](#capítulo-5-conclusiones-y-trabajo-futuro)</w:t>
+        <w:t>[Capítulo 5: Conclusiones y Trabajo Futuro](#capítulo-5-conclusiones-y-trabajo-futuro)</w:t>
       </w:r>
     </w:p>
     <w:p>
       <w:pPr>
         <w:pStyle w:val="ListBullet"/>
-        <w:spacing w:after="60"/>
+        <w:spacing w:after="80"/>
         <w:ind w:left="360"/>
       </w:pPr>
       <w:r>
-        <w:t xml:space="preserve">  [Capítulo 6: Bibliografía](#capítulo-6-bibliografía)</w:t>
+        <w:t>[Capítulo 6: Bibliografía](#capítulo-6-bibliografía)</w:t>
       </w:r>
     </w:p>
     <w:p>
@@ -323,14 +314,14 @@
       <w:pPr>
         <w:pStyle w:val="Heading1"/>
         <w:keepNext/>
-        <w:spacing w:before="360" w:after="160"/>
+        <w:spacing w:before="480" w:after="240"/>
       </w:pPr>
       <w:r>
         <w:rPr>
-          <w:rFonts w:ascii="Arial" w:hAnsi="Arial"/>
+          <w:rFonts w:ascii="Times New Roman" w:hAnsi="Times New Roman"/>
           <w:b/>
-          <w:color w:val="1A5276"/>
-          <w:sz w:val="40"/>
+          <w:color w:val="000000"/>
+          <w:sz w:val="36"/>
         </w:rPr>
         <w:t>Capítulo 1: Introducción y Objetivos</w:t>
       </w:r>
@@ -339,21 +330,22 @@
       <w:pPr>
         <w:pStyle w:val="Heading2"/>
         <w:keepNext/>
-        <w:spacing w:before="280" w:after="120"/>
+        <w:spacing w:before="360" w:after="160"/>
       </w:pPr>
       <w:r>
         <w:rPr>
-          <w:rFonts w:ascii="Arial" w:hAnsi="Arial"/>
+          <w:rFonts w:ascii="Times New Roman" w:hAnsi="Times New Roman"/>
           <w:b/>
-          <w:color w:val="2980B9"/>
-          <w:sz w:val="30"/>
+          <w:color w:val="000000"/>
+          <w:sz w:val="28"/>
         </w:rPr>
         <w:t>1.1.- Entorno de Aplicación</w:t>
       </w:r>
     </w:p>
     <w:p>
       <w:pPr>
-        <w:spacing w:after="120" w:line="276" w:lineRule="auto"/>
+        <w:spacing w:after="160" w:line="276" w:lineRule="auto"/>
+        <w:jc w:val="both"/>
       </w:pPr>
       <w:r>
         <w:t>El ajedrez es una herramienta científica y pedagógica de incalculable valor, ampliamente reconocida por mejorar la capacidad analítica, la toma de decisiones bajo presión y la memoria de trabajo. En el entorno universitario y académico, los clubes y estudiantes de ajedrez requieren herramientas informáticas de calidad que integren análisis asistido por ordenador y bases de datos históricas. Chess Legacy nace en la Escuela Politécnica Superior de Elche de la UMH como una solución abierta y local para ofrecer un entorno libre de coste, escalable y robusto para estos estudiantes.</w:t>
@@ -363,29 +355,31 @@
       <w:pPr>
         <w:pStyle w:val="Heading2"/>
         <w:keepNext/>
-        <w:spacing w:before="280" w:after="120"/>
+        <w:spacing w:before="360" w:after="160"/>
       </w:pPr>
       <w:r>
         <w:rPr>
-          <w:rFonts w:ascii="Arial" w:hAnsi="Arial"/>
+          <w:rFonts w:ascii="Times New Roman" w:hAnsi="Times New Roman"/>
           <w:b/>
-          <w:color w:val="2980B9"/>
-          <w:sz w:val="30"/>
+          <w:color w:val="000000"/>
+          <w:sz w:val="28"/>
         </w:rPr>
         <w:t>1.2.- Justificación del Proyecto</w:t>
       </w:r>
     </w:p>
     <w:p>
       <w:pPr>
-        <w:spacing w:after="120" w:line="276" w:lineRule="auto"/>
+        <w:spacing w:after="160" w:line="276" w:lineRule="auto"/>
+        <w:jc w:val="both"/>
       </w:pPr>
       <w:r>
-        <w:t xml:space="preserve">Las plataformas de ajedrez dominantes en el mercado (Chess.com, ChessBase) están muy monetizadas. Las opciones premium bloquean las herramientas de análisis continuo por Stockfish y la exploración libre de bases de datos detrás de muros de pago mensuales. Además, jugar contra "bots" de IA en estas redes carece de rigor histórico o personalización adaptada al estilo de juego real de los campeones mundiales del pasado. </w:t>
+        <w:t>Las plataformas de ajedrez dominantes en el mercado (Chess.com, ChessBase) están muy monetizadas. Las opciones premium bloquean las herramientas de análisis continuo por Stockfish y la exploración libre de bases de datos detrás de muros de pago mensuales. Además, jugar contra "bots" de IA en estas redes carece de rigor histórico o personalización adaptada al estilo de juego real de los campeones mundiales del pasado.</w:t>
       </w:r>
     </w:p>
     <w:p>
       <w:pPr>
-        <w:spacing w:after="120" w:line="276" w:lineRule="auto"/>
+        <w:spacing w:after="160" w:line="276" w:lineRule="auto"/>
+        <w:jc w:val="both"/>
       </w:pPr>
       <w:r>
         <w:t>Chess Legacy se justifica al proveer un entorno completamente libre y empaquetado donde todo el procesamiento (motor de análisis Stockfish 16.1 y motor de persistencia SQLite) ocurre localmente, eliminando costes de servidores en la nube y garantizando el acceso universal.</w:t>
@@ -395,14 +389,14 @@
       <w:pPr>
         <w:pStyle w:val="Heading2"/>
         <w:keepNext/>
-        <w:spacing w:before="280" w:after="120"/>
+        <w:spacing w:before="360" w:after="160"/>
       </w:pPr>
       <w:r>
         <w:rPr>
-          <w:rFonts w:ascii="Arial" w:hAnsi="Arial"/>
+          <w:rFonts w:ascii="Times New Roman" w:hAnsi="Times New Roman"/>
           <w:b/>
-          <w:color w:val="2980B9"/>
-          <w:sz w:val="30"/>
+          <w:color w:val="000000"/>
+          <w:sz w:val="28"/>
         </w:rPr>
         <w:t>1.3.- Objetivos del Proyecto</w:t>
       </w:r>
@@ -411,13 +405,13 @@
       <w:pPr>
         <w:pStyle w:val="Heading3"/>
         <w:keepNext/>
-        <w:spacing w:before="200" w:after="80"/>
+        <w:spacing w:before="280" w:after="120"/>
       </w:pPr>
       <w:r>
         <w:rPr>
-          <w:rFonts w:ascii="Arial" w:hAnsi="Arial"/>
+          <w:rFonts w:ascii="Times New Roman" w:hAnsi="Times New Roman"/>
           <w:b/>
-          <w:color w:val="6E6E6E"/>
+          <w:color w:val="000000"/>
           <w:sz w:val="24"/>
         </w:rPr>
         <w:t>Objetivos Principales</w:t>
@@ -426,54 +420,54 @@
     <w:p>
       <w:pPr>
         <w:pStyle w:val="ListBullet"/>
-        <w:spacing w:after="60"/>
+        <w:spacing w:after="80"/>
         <w:ind w:left="360"/>
       </w:pPr>
       <w:r>
-        <w:t xml:space="preserve">  Desarrollar una aplicación web full-stack reactiva y de alto rendimiento para el juego y análisis de ajedrez.</w:t>
+        <w:t>Desarrollar una aplicación web full-stack reactiva y de alto rendimiento para el juego y análisis de ajedrez.</w:t>
       </w:r>
     </w:p>
     <w:p>
       <w:pPr>
         <w:pStyle w:val="ListBullet"/>
-        <w:spacing w:after="60"/>
+        <w:spacing w:after="80"/>
         <w:ind w:left="360"/>
       </w:pPr>
       <w:r>
-        <w:t xml:space="preserve">  Integrar un motor de análisis posicional en tiempo real (Stockfish) que funcione de forma local.</w:t>
+        <w:t>Integrar un motor de análisis posicional en tiempo real (Stockfish) que funcione de forma local.</w:t>
       </w:r>
     </w:p>
     <w:p>
       <w:pPr>
         <w:pStyle w:val="ListBullet"/>
-        <w:spacing w:after="60"/>
+        <w:spacing w:after="80"/>
         <w:ind w:left="360"/>
       </w:pPr>
       <w:r>
-        <w:t xml:space="preserve">  Poblar una base de datos histórica robusta con más de 40,000 partidas y fichas biográficas detalladas de los 20 máximos exponentes de la historia del ajedrez.</w:t>
+        <w:t>Poblar una base de datos histórica robusta con más de 40,000 partidas y fichas biográficas detalladas de los 20 máximos exponentes de la historia del ajedrez.</w:t>
       </w:r>
     </w:p>
     <w:p>
       <w:pPr>
         <w:pStyle w:val="ListBullet"/>
-        <w:spacing w:after="60"/>
+        <w:spacing w:after="80"/>
         <w:ind w:left="360"/>
       </w:pPr>
       <w:r>
-        <w:t xml:space="preserve">  Asegurar el despliegue universal multiplataforma del sistema completo mediante contenedores Docker.</w:t>
+        <w:t>Asegurar el despliegue universal multiplataforma del sistema completo mediante contenedores Docker.</w:t>
       </w:r>
     </w:p>
     <w:p>
       <w:pPr>
         <w:pStyle w:val="Heading3"/>
         <w:keepNext/>
-        <w:spacing w:before="200" w:after="80"/>
+        <w:spacing w:before="280" w:after="120"/>
       </w:pPr>
       <w:r>
         <w:rPr>
-          <w:rFonts w:ascii="Arial" w:hAnsi="Arial"/>
+          <w:rFonts w:ascii="Times New Roman" w:hAnsi="Times New Roman"/>
           <w:b/>
-          <w:color w:val="6E6E6E"/>
+          <w:color w:val="000000"/>
           <w:sz w:val="24"/>
         </w:rPr>
         <w:t>Objetivos Secundarios e Instrumentales</w:t>
@@ -482,52 +476,53 @@
     <w:p>
       <w:pPr>
         <w:pStyle w:val="ListBullet"/>
-        <w:spacing w:after="60"/>
+        <w:spacing w:after="80"/>
         <w:ind w:left="360"/>
       </w:pPr>
       <w:r>
-        <w:t xml:space="preserve">  Implementar una experiencia de usuario (UX) rica y adaptada a accesibilidad con controles por teclado fluidos.</w:t>
+        <w:t>Implementar una experiencia de usuario (UX) rica y adaptada a accesibilidad con controles por teclado fluidos.</w:t>
       </w:r>
     </w:p>
     <w:p>
       <w:pPr>
         <w:pStyle w:val="ListBullet"/>
-        <w:spacing w:after="60"/>
+        <w:spacing w:after="80"/>
         <w:ind w:left="360"/>
       </w:pPr>
       <w:r>
-        <w:t xml:space="preserve">  Introducir mecánicas de ludificación (xp, racha diaria, retos del día y logros).</w:t>
+        <w:t>Introducir mecánicas de ludificación (xp, racha diaria, retos del día y logros).</w:t>
       </w:r>
     </w:p>
     <w:p>
       <w:pPr>
         <w:pStyle w:val="ListBullet"/>
-        <w:spacing w:after="60"/>
+        <w:spacing w:after="80"/>
         <w:ind w:left="360"/>
       </w:pPr>
       <w:r>
-        <w:t xml:space="preserve">  Garantizar la resiliencia en base de datos mediante el control de migraciones automatizadas en Entity Framework Core.</w:t>
+        <w:t>Garantizar la resiliencia en base de datos mediante el control de migraciones automatizadas en Entity Framework Core.</w:t>
       </w:r>
     </w:p>
     <w:p>
       <w:pPr>
         <w:pStyle w:val="Heading2"/>
         <w:keepNext/>
-        <w:spacing w:before="280" w:after="120"/>
+        <w:spacing w:before="360" w:after="160"/>
       </w:pPr>
       <w:r>
         <w:rPr>
-          <w:rFonts w:ascii="Arial" w:hAnsi="Arial"/>
+          <w:rFonts w:ascii="Times New Roman" w:hAnsi="Times New Roman"/>
           <w:b/>
-          <w:color w:val="2980B9"/>
-          <w:sz w:val="30"/>
+          <w:color w:val="000000"/>
+          <w:sz w:val="28"/>
         </w:rPr>
         <w:t>1.4.- Límites del Proyecto</w:t>
       </w:r>
     </w:p>
     <w:p>
       <w:pPr>
-        <w:spacing w:after="120" w:line="276" w:lineRule="auto"/>
+        <w:spacing w:after="160" w:line="276" w:lineRule="auto"/>
+        <w:jc w:val="both"/>
       </w:pPr>
       <w:r>
         <w:t>Queda fuera del alcance actual de esta memoria el desarrollo de un módulo de juego multijugador (PvP) online en tiempo real basado en WebSockets, centrándose exclusivamente en la vertiente formativa, interactiva, de análisis táctico y de juego contra maestros asistido por IA local.</w:t>
@@ -542,14 +537,14 @@
       <w:pPr>
         <w:pStyle w:val="Heading1"/>
         <w:keepNext/>
-        <w:spacing w:before="360" w:after="160"/>
+        <w:spacing w:before="480" w:after="240"/>
       </w:pPr>
       <w:r>
         <w:rPr>
-          <w:rFonts w:ascii="Arial" w:hAnsi="Arial"/>
+          <w:rFonts w:ascii="Times New Roman" w:hAnsi="Times New Roman"/>
           <w:b/>
-          <w:color w:val="1A5276"/>
-          <w:sz w:val="40"/>
+          <w:color w:val="000000"/>
+          <w:sz w:val="36"/>
         </w:rPr>
         <w:t>Capítulo 2: Antecedentes y Estado de la Cuestión</w:t>
       </w:r>
@@ -558,21 +553,22 @@
       <w:pPr>
         <w:pStyle w:val="Heading2"/>
         <w:keepNext/>
-        <w:spacing w:before="280" w:after="120"/>
+        <w:spacing w:before="360" w:after="160"/>
       </w:pPr>
       <w:r>
         <w:rPr>
-          <w:rFonts w:ascii="Arial" w:hAnsi="Arial"/>
+          <w:rFonts w:ascii="Times New Roman" w:hAnsi="Times New Roman"/>
           <w:b/>
-          <w:color w:val="2980B9"/>
-          <w:sz w:val="30"/>
+          <w:color w:val="000000"/>
+          <w:sz w:val="28"/>
         </w:rPr>
         <w:t>2.1.- Situación Actual</w:t>
       </w:r>
     </w:p>
     <w:p>
       <w:pPr>
-        <w:spacing w:after="120" w:line="276" w:lineRule="auto"/>
+        <w:spacing w:after="160" w:line="276" w:lineRule="auto"/>
+        <w:jc w:val="both"/>
       </w:pPr>
       <w:r>
         <w:t>Actualmente, los aficionados al ajedrez estudian combinando múltiples aplicaciones fragmentadas: un software para ver vídeos, otro para resolver problemas tácticos (Puzzles), hojas de cálculo para rastrear aperturas, y costosas licencias de ChessBase para estudiar partidas históricas. Esto dificulta la curva de aprendizaje de los alumnos de ingeniería y computación que buscan una solución integrada y fluida.</w:t>
@@ -582,14 +578,14 @@
       <w:pPr>
         <w:pStyle w:val="Heading2"/>
         <w:keepNext/>
-        <w:spacing w:before="280" w:after="120"/>
+        <w:spacing w:before="360" w:after="160"/>
       </w:pPr>
       <w:r>
         <w:rPr>
-          <w:rFonts w:ascii="Arial" w:hAnsi="Arial"/>
+          <w:rFonts w:ascii="Times New Roman" w:hAnsi="Times New Roman"/>
           <w:b/>
-          <w:color w:val="2980B9"/>
-          <w:sz w:val="30"/>
+          <w:color w:val="000000"/>
+          <w:sz w:val="28"/>
         </w:rPr>
         <w:t>2.2.- Herramientas Disponibles en el Mercado</w:t>
       </w:r>
@@ -597,7 +593,7 @@
     <w:p>
       <w:pPr>
         <w:pStyle w:val="ListNumber"/>
-        <w:spacing w:after="60"/>
+        <w:spacing w:after="80"/>
       </w:pPr>
       <w:r>
         <w:rPr>
@@ -612,7 +608,7 @@
     <w:p>
       <w:pPr>
         <w:pStyle w:val="ListNumber"/>
-        <w:spacing w:after="60"/>
+        <w:spacing w:after="80"/>
       </w:pPr>
       <w:r>
         <w:rPr>
@@ -627,7 +623,7 @@
     <w:p>
       <w:pPr>
         <w:pStyle w:val="ListNumber"/>
-        <w:spacing w:after="60"/>
+        <w:spacing w:after="80"/>
       </w:pPr>
       <w:r>
         <w:rPr>
@@ -643,13 +639,13 @@
       <w:pPr>
         <w:pStyle w:val="Heading3"/>
         <w:keepNext/>
-        <w:spacing w:before="200" w:after="80"/>
+        <w:spacing w:before="280" w:after="120"/>
       </w:pPr>
       <w:r>
         <w:rPr>
-          <w:rFonts w:ascii="Arial" w:hAnsi="Arial"/>
+          <w:rFonts w:ascii="Times New Roman" w:hAnsi="Times New Roman"/>
           <w:b/>
-          <w:color w:val="6E6E6E"/>
+          <w:color w:val="000000"/>
           <w:sz w:val="24"/>
         </w:rPr>
         <w:t>📊 Cuadro Comparativo de Herramientas</w:t>
@@ -658,6 +654,7 @@
     <w:tbl>
       <w:tblPr>
         <w:tblW w:type="auto" w:w="0"/>
+        <w:jc w:val="center"/>
         <w:tblLayout w:type="autofit"/>
         <w:tblLook w:firstColumn="1" w:firstRow="1" w:lastColumn="0" w:lastRow="0" w:noHBand="0" w:noVBand="1" w:val="04A0"/>
       </w:tblPr>
@@ -673,28 +670,35 @@
           <w:tcPr>
             <w:tcW w:type="dxa" w:w="1872"/>
             <w:tcMar>
-              <w:top w:w="120" w:type="dxa"/>
-              <w:bottom w:w="120" w:type="dxa"/>
+              <w:top w:w="100" w:type="dxa"/>
+              <w:bottom w:w="100" w:type="dxa"/>
               <w:left w:w="150" w:type="dxa"/>
               <w:right w:w="150" w:type="dxa"/>
             </w:tcMar>
-            <w:shd w:fill="1A5276"/>
-            <w:shd w:fill="F4F6F7"/>
+            <w:tcBorders>
+              <w:top w:val="none"/>
+              <w:left w:val="none"/>
+              <w:bottom w:val="none"/>
+              <w:right w:val="none"/>
+              <w:insideH w:val="none"/>
+              <w:insideV w:val="none"/>
+              <w:top w:val="single" w:sz="4" w:color="000000"/>
+              <w:bottom w:val="single" w:sz="4" w:color="000000"/>
+            </w:tcBorders>
           </w:tcPr>
           <w:p>
             <w:pPr>
-              <w:spacing w:after="40" w:before="40"/>
+              <w:spacing w:after="80" w:before="80"/>
+              <w:jc w:val="left"/>
             </w:pPr>
             <w:r>
               <w:rPr>
                 <w:b/>
-                <w:color w:val="FFFFFF"/>
               </w:rPr>
             </w:r>
             <w:r>
               <w:rPr>
                 <w:b/>
-                <w:color w:val="FFFFFF"/>
               </w:rPr>
               <w:t>Característica</w:t>
             </w:r>
@@ -704,28 +708,35 @@
           <w:tcPr>
             <w:tcW w:type="dxa" w:w="1872"/>
             <w:tcMar>
-              <w:top w:w="120" w:type="dxa"/>
-              <w:bottom w:w="120" w:type="dxa"/>
+              <w:top w:w="100" w:type="dxa"/>
+              <w:bottom w:w="100" w:type="dxa"/>
               <w:left w:w="150" w:type="dxa"/>
               <w:right w:w="150" w:type="dxa"/>
             </w:tcMar>
-            <w:shd w:fill="1A5276"/>
-            <w:shd w:fill="F4F6F7"/>
+            <w:tcBorders>
+              <w:top w:val="none"/>
+              <w:left w:val="none"/>
+              <w:bottom w:val="none"/>
+              <w:right w:val="none"/>
+              <w:insideH w:val="none"/>
+              <w:insideV w:val="none"/>
+              <w:top w:val="single" w:sz="4" w:color="000000"/>
+              <w:bottom w:val="single" w:sz="4" w:color="000000"/>
+            </w:tcBorders>
           </w:tcPr>
           <w:p>
             <w:pPr>
-              <w:spacing w:after="40" w:before="40"/>
+              <w:spacing w:after="80" w:before="80"/>
+              <w:jc w:val="left"/>
             </w:pPr>
             <w:r>
               <w:rPr>
                 <w:b/>
-                <w:color w:val="FFFFFF"/>
               </w:rPr>
             </w:r>
             <w:r>
               <w:rPr>
                 <w:b/>
-                <w:color w:val="FFFFFF"/>
               </w:rPr>
               <w:t>Chess.com</w:t>
             </w:r>
@@ -735,28 +746,35 @@
           <w:tcPr>
             <w:tcW w:type="dxa" w:w="1872"/>
             <w:tcMar>
-              <w:top w:w="120" w:type="dxa"/>
-              <w:bottom w:w="120" w:type="dxa"/>
+              <w:top w:w="100" w:type="dxa"/>
+              <w:bottom w:w="100" w:type="dxa"/>
               <w:left w:w="150" w:type="dxa"/>
               <w:right w:w="150" w:type="dxa"/>
             </w:tcMar>
-            <w:shd w:fill="1A5276"/>
-            <w:shd w:fill="F4F6F7"/>
+            <w:tcBorders>
+              <w:top w:val="none"/>
+              <w:left w:val="none"/>
+              <w:bottom w:val="none"/>
+              <w:right w:val="none"/>
+              <w:insideH w:val="none"/>
+              <w:insideV w:val="none"/>
+              <w:top w:val="single" w:sz="4" w:color="000000"/>
+              <w:bottom w:val="single" w:sz="4" w:color="000000"/>
+            </w:tcBorders>
           </w:tcPr>
           <w:p>
             <w:pPr>
-              <w:spacing w:after="40" w:before="40"/>
+              <w:spacing w:after="80" w:before="80"/>
+              <w:jc w:val="left"/>
             </w:pPr>
             <w:r>
               <w:rPr>
                 <w:b/>
-                <w:color w:val="FFFFFF"/>
               </w:rPr>
             </w:r>
             <w:r>
               <w:rPr>
                 <w:b/>
-                <w:color w:val="FFFFFF"/>
               </w:rPr>
               <w:t>Lichess.org</w:t>
             </w:r>
@@ -766,28 +784,35 @@
           <w:tcPr>
             <w:tcW w:type="dxa" w:w="1872"/>
             <w:tcMar>
-              <w:top w:w="120" w:type="dxa"/>
-              <w:bottom w:w="120" w:type="dxa"/>
+              <w:top w:w="100" w:type="dxa"/>
+              <w:bottom w:w="100" w:type="dxa"/>
               <w:left w:w="150" w:type="dxa"/>
               <w:right w:w="150" w:type="dxa"/>
             </w:tcMar>
-            <w:shd w:fill="1A5276"/>
-            <w:shd w:fill="F4F6F7"/>
+            <w:tcBorders>
+              <w:top w:val="none"/>
+              <w:left w:val="none"/>
+              <w:bottom w:val="none"/>
+              <w:right w:val="none"/>
+              <w:insideH w:val="none"/>
+              <w:insideV w:val="none"/>
+              <w:top w:val="single" w:sz="4" w:color="000000"/>
+              <w:bottom w:val="single" w:sz="4" w:color="000000"/>
+            </w:tcBorders>
           </w:tcPr>
           <w:p>
             <w:pPr>
-              <w:spacing w:after="40" w:before="40"/>
+              <w:spacing w:after="80" w:before="80"/>
+              <w:jc w:val="left"/>
             </w:pPr>
             <w:r>
               <w:rPr>
                 <w:b/>
-                <w:color w:val="FFFFFF"/>
               </w:rPr>
             </w:r>
             <w:r>
               <w:rPr>
                 <w:b/>
-                <w:color w:val="FFFFFF"/>
               </w:rPr>
               <w:t>ChessBase</w:t>
             </w:r>
@@ -797,28 +822,35 @@
           <w:tcPr>
             <w:tcW w:type="dxa" w:w="1872"/>
             <w:tcMar>
-              <w:top w:w="120" w:type="dxa"/>
-              <w:bottom w:w="120" w:type="dxa"/>
+              <w:top w:w="100" w:type="dxa"/>
+              <w:bottom w:w="100" w:type="dxa"/>
               <w:left w:w="150" w:type="dxa"/>
               <w:right w:w="150" w:type="dxa"/>
             </w:tcMar>
-            <w:shd w:fill="1A5276"/>
-            <w:shd w:fill="F4F6F7"/>
+            <w:tcBorders>
+              <w:top w:val="none"/>
+              <w:left w:val="none"/>
+              <w:bottom w:val="none"/>
+              <w:right w:val="none"/>
+              <w:insideH w:val="none"/>
+              <w:insideV w:val="none"/>
+              <w:top w:val="single" w:sz="4" w:color="000000"/>
+              <w:bottom w:val="single" w:sz="4" w:color="000000"/>
+            </w:tcBorders>
           </w:tcPr>
           <w:p>
             <w:pPr>
-              <w:spacing w:after="40" w:before="40"/>
+              <w:spacing w:after="80" w:before="80"/>
+              <w:jc w:val="left"/>
             </w:pPr>
             <w:r>
               <w:rPr>
                 <w:b/>
-                <w:color w:val="FFFFFF"/>
               </w:rPr>
             </w:r>
             <w:r>
               <w:rPr>
                 <w:b/>
-                <w:color w:val="FFFFFF"/>
               </w:rPr>
               <w:t>Chess Legacy (Este Proyecto)</w:t>
             </w:r>
@@ -830,15 +862,24 @@
           <w:tcPr>
             <w:tcW w:type="dxa" w:w="1872"/>
             <w:tcMar>
-              <w:top w:w="120" w:type="dxa"/>
-              <w:bottom w:w="120" w:type="dxa"/>
+              <w:top w:w="100" w:type="dxa"/>
+              <w:bottom w:w="100" w:type="dxa"/>
               <w:left w:w="150" w:type="dxa"/>
               <w:right w:w="150" w:type="dxa"/>
             </w:tcMar>
+            <w:tcBorders>
+              <w:top w:val="none"/>
+              <w:left w:val="none"/>
+              <w:bottom w:val="none"/>
+              <w:right w:val="none"/>
+              <w:insideH w:val="none"/>
+              <w:insideV w:val="none"/>
+            </w:tcBorders>
           </w:tcPr>
           <w:p>
             <w:pPr>
-              <w:spacing w:after="40" w:before="40"/>
+              <w:spacing w:after="80" w:before="80"/>
+              <w:jc w:val="left"/>
             </w:pPr>
             <w:r/>
             <w:r>
@@ -850,15 +891,24 @@
           <w:tcPr>
             <w:tcW w:type="dxa" w:w="1872"/>
             <w:tcMar>
-              <w:top w:w="120" w:type="dxa"/>
-              <w:bottom w:w="120" w:type="dxa"/>
+              <w:top w:w="100" w:type="dxa"/>
+              <w:bottom w:w="100" w:type="dxa"/>
               <w:left w:w="150" w:type="dxa"/>
               <w:right w:w="150" w:type="dxa"/>
             </w:tcMar>
+            <w:tcBorders>
+              <w:top w:val="none"/>
+              <w:left w:val="none"/>
+              <w:bottom w:val="none"/>
+              <w:right w:val="none"/>
+              <w:insideH w:val="none"/>
+              <w:insideV w:val="none"/>
+            </w:tcBorders>
           </w:tcPr>
           <w:p>
             <w:pPr>
-              <w:spacing w:after="40" w:before="40"/>
+              <w:spacing w:after="80" w:before="80"/>
+              <w:jc w:val="left"/>
             </w:pPr>
             <w:r/>
             <w:r>
@@ -870,15 +920,24 @@
           <w:tcPr>
             <w:tcW w:type="dxa" w:w="1872"/>
             <w:tcMar>
-              <w:top w:w="120" w:type="dxa"/>
-              <w:bottom w:w="120" w:type="dxa"/>
+              <w:top w:w="100" w:type="dxa"/>
+              <w:bottom w:w="100" w:type="dxa"/>
               <w:left w:w="150" w:type="dxa"/>
               <w:right w:w="150" w:type="dxa"/>
             </w:tcMar>
+            <w:tcBorders>
+              <w:top w:val="none"/>
+              <w:left w:val="none"/>
+              <w:bottom w:val="none"/>
+              <w:right w:val="none"/>
+              <w:insideH w:val="none"/>
+              <w:insideV w:val="none"/>
+            </w:tcBorders>
           </w:tcPr>
           <w:p>
             <w:pPr>
-              <w:spacing w:after="40" w:before="40"/>
+              <w:spacing w:after="80" w:before="80"/>
+              <w:jc w:val="left"/>
             </w:pPr>
             <w:r/>
             <w:r>
@@ -890,15 +949,24 @@
           <w:tcPr>
             <w:tcW w:type="dxa" w:w="1872"/>
             <w:tcMar>
-              <w:top w:w="120" w:type="dxa"/>
-              <w:bottom w:w="120" w:type="dxa"/>
+              <w:top w:w="100" w:type="dxa"/>
+              <w:bottom w:w="100" w:type="dxa"/>
               <w:left w:w="150" w:type="dxa"/>
               <w:right w:w="150" w:type="dxa"/>
             </w:tcMar>
+            <w:tcBorders>
+              <w:top w:val="none"/>
+              <w:left w:val="none"/>
+              <w:bottom w:val="none"/>
+              <w:right w:val="none"/>
+              <w:insideH w:val="none"/>
+              <w:insideV w:val="none"/>
+            </w:tcBorders>
           </w:tcPr>
           <w:p>
             <w:pPr>
-              <w:spacing w:after="40" w:before="40"/>
+              <w:spacing w:after="80" w:before="80"/>
+              <w:jc w:val="left"/>
             </w:pPr>
             <w:r/>
             <w:r>
@@ -910,15 +978,24 @@
           <w:tcPr>
             <w:tcW w:type="dxa" w:w="1872"/>
             <w:tcMar>
-              <w:top w:w="120" w:type="dxa"/>
-              <w:bottom w:w="120" w:type="dxa"/>
+              <w:top w:w="100" w:type="dxa"/>
+              <w:bottom w:w="100" w:type="dxa"/>
               <w:left w:w="150" w:type="dxa"/>
               <w:right w:w="150" w:type="dxa"/>
             </w:tcMar>
+            <w:tcBorders>
+              <w:top w:val="none"/>
+              <w:left w:val="none"/>
+              <w:bottom w:val="none"/>
+              <w:right w:val="none"/>
+              <w:insideH w:val="none"/>
+              <w:insideV w:val="none"/>
+            </w:tcBorders>
           </w:tcPr>
           <w:p>
             <w:pPr>
-              <w:spacing w:after="40" w:before="40"/>
+              <w:spacing w:after="80" w:before="80"/>
+              <w:jc w:val="left"/>
             </w:pPr>
             <w:r/>
             <w:r>
@@ -932,15 +1009,24 @@
           <w:tcPr>
             <w:tcW w:type="dxa" w:w="1872"/>
             <w:tcMar>
-              <w:top w:w="120" w:type="dxa"/>
-              <w:bottom w:w="120" w:type="dxa"/>
+              <w:top w:w="100" w:type="dxa"/>
+              <w:bottom w:w="100" w:type="dxa"/>
               <w:left w:w="150" w:type="dxa"/>
               <w:right w:w="150" w:type="dxa"/>
             </w:tcMar>
+            <w:tcBorders>
+              <w:top w:val="none"/>
+              <w:left w:val="none"/>
+              <w:bottom w:val="none"/>
+              <w:right w:val="none"/>
+              <w:insideH w:val="none"/>
+              <w:insideV w:val="none"/>
+            </w:tcBorders>
           </w:tcPr>
           <w:p>
             <w:pPr>
-              <w:spacing w:after="40" w:before="40"/>
+              <w:spacing w:after="80" w:before="80"/>
+              <w:jc w:val="left"/>
             </w:pPr>
             <w:r/>
             <w:r>
@@ -955,15 +1041,24 @@
           <w:tcPr>
             <w:tcW w:type="dxa" w:w="1872"/>
             <w:tcMar>
-              <w:top w:w="120" w:type="dxa"/>
-              <w:bottom w:w="120" w:type="dxa"/>
+              <w:top w:w="100" w:type="dxa"/>
+              <w:bottom w:w="100" w:type="dxa"/>
               <w:left w:w="150" w:type="dxa"/>
               <w:right w:w="150" w:type="dxa"/>
             </w:tcMar>
+            <w:tcBorders>
+              <w:top w:val="none"/>
+              <w:left w:val="none"/>
+              <w:bottom w:val="none"/>
+              <w:right w:val="none"/>
+              <w:insideH w:val="none"/>
+              <w:insideV w:val="none"/>
+            </w:tcBorders>
           </w:tcPr>
           <w:p>
             <w:pPr>
-              <w:spacing w:after="40" w:before="40"/>
+              <w:spacing w:after="80" w:before="80"/>
+              <w:jc w:val="left"/>
             </w:pPr>
             <w:r/>
             <w:r>
@@ -975,15 +1070,24 @@
           <w:tcPr>
             <w:tcW w:type="dxa" w:w="1872"/>
             <w:tcMar>
-              <w:top w:w="120" w:type="dxa"/>
-              <w:bottom w:w="120" w:type="dxa"/>
+              <w:top w:w="100" w:type="dxa"/>
+              <w:bottom w:w="100" w:type="dxa"/>
               <w:left w:w="150" w:type="dxa"/>
               <w:right w:w="150" w:type="dxa"/>
             </w:tcMar>
+            <w:tcBorders>
+              <w:top w:val="none"/>
+              <w:left w:val="none"/>
+              <w:bottom w:val="none"/>
+              <w:right w:val="none"/>
+              <w:insideH w:val="none"/>
+              <w:insideV w:val="none"/>
+            </w:tcBorders>
           </w:tcPr>
           <w:p>
             <w:pPr>
-              <w:spacing w:after="40" w:before="40"/>
+              <w:spacing w:after="80" w:before="80"/>
+              <w:jc w:val="left"/>
             </w:pPr>
             <w:r/>
             <w:r>
@@ -995,15 +1099,24 @@
           <w:tcPr>
             <w:tcW w:type="dxa" w:w="1872"/>
             <w:tcMar>
-              <w:top w:w="120" w:type="dxa"/>
-              <w:bottom w:w="120" w:type="dxa"/>
+              <w:top w:w="100" w:type="dxa"/>
+              <w:bottom w:w="100" w:type="dxa"/>
               <w:left w:w="150" w:type="dxa"/>
               <w:right w:w="150" w:type="dxa"/>
             </w:tcMar>
+            <w:tcBorders>
+              <w:top w:val="none"/>
+              <w:left w:val="none"/>
+              <w:bottom w:val="none"/>
+              <w:right w:val="none"/>
+              <w:insideH w:val="none"/>
+              <w:insideV w:val="none"/>
+            </w:tcBorders>
           </w:tcPr>
           <w:p>
             <w:pPr>
-              <w:spacing w:after="40" w:before="40"/>
+              <w:spacing w:after="80" w:before="80"/>
+              <w:jc w:val="left"/>
             </w:pPr>
             <w:r/>
             <w:r>
@@ -1015,15 +1128,24 @@
           <w:tcPr>
             <w:tcW w:type="dxa" w:w="1872"/>
             <w:tcMar>
-              <w:top w:w="120" w:type="dxa"/>
-              <w:bottom w:w="120" w:type="dxa"/>
+              <w:top w:w="100" w:type="dxa"/>
+              <w:bottom w:w="100" w:type="dxa"/>
               <w:left w:w="150" w:type="dxa"/>
               <w:right w:w="150" w:type="dxa"/>
             </w:tcMar>
+            <w:tcBorders>
+              <w:top w:val="none"/>
+              <w:left w:val="none"/>
+              <w:bottom w:val="none"/>
+              <w:right w:val="none"/>
+              <w:insideH w:val="none"/>
+              <w:insideV w:val="none"/>
+            </w:tcBorders>
           </w:tcPr>
           <w:p>
             <w:pPr>
-              <w:spacing w:after="40" w:before="40"/>
+              <w:spacing w:after="80" w:before="80"/>
+              <w:jc w:val="left"/>
             </w:pPr>
             <w:r/>
             <w:r>
@@ -1040,15 +1162,24 @@
           <w:tcPr>
             <w:tcW w:type="dxa" w:w="1872"/>
             <w:tcMar>
-              <w:top w:w="120" w:type="dxa"/>
-              <w:bottom w:w="120" w:type="dxa"/>
+              <w:top w:w="100" w:type="dxa"/>
+              <w:bottom w:w="100" w:type="dxa"/>
               <w:left w:w="150" w:type="dxa"/>
               <w:right w:w="150" w:type="dxa"/>
             </w:tcMar>
+            <w:tcBorders>
+              <w:top w:val="none"/>
+              <w:left w:val="none"/>
+              <w:bottom w:val="none"/>
+              <w:right w:val="none"/>
+              <w:insideH w:val="none"/>
+              <w:insideV w:val="none"/>
+            </w:tcBorders>
           </w:tcPr>
           <w:p>
             <w:pPr>
-              <w:spacing w:after="40" w:before="40"/>
+              <w:spacing w:after="80" w:before="80"/>
+              <w:jc w:val="left"/>
             </w:pPr>
             <w:r/>
             <w:r>
@@ -1063,15 +1194,24 @@
           <w:tcPr>
             <w:tcW w:type="dxa" w:w="1872"/>
             <w:tcMar>
-              <w:top w:w="120" w:type="dxa"/>
-              <w:bottom w:w="120" w:type="dxa"/>
+              <w:top w:w="100" w:type="dxa"/>
+              <w:bottom w:w="100" w:type="dxa"/>
               <w:left w:w="150" w:type="dxa"/>
               <w:right w:w="150" w:type="dxa"/>
             </w:tcMar>
+            <w:tcBorders>
+              <w:top w:val="none"/>
+              <w:left w:val="none"/>
+              <w:bottom w:val="none"/>
+              <w:right w:val="none"/>
+              <w:insideH w:val="none"/>
+              <w:insideV w:val="none"/>
+            </w:tcBorders>
           </w:tcPr>
           <w:p>
             <w:pPr>
-              <w:spacing w:after="40" w:before="40"/>
+              <w:spacing w:after="80" w:before="80"/>
+              <w:jc w:val="left"/>
             </w:pPr>
             <w:r/>
             <w:r>
@@ -1083,15 +1223,24 @@
           <w:tcPr>
             <w:tcW w:type="dxa" w:w="1872"/>
             <w:tcMar>
-              <w:top w:w="120" w:type="dxa"/>
-              <w:bottom w:w="120" w:type="dxa"/>
+              <w:top w:w="100" w:type="dxa"/>
+              <w:bottom w:w="100" w:type="dxa"/>
               <w:left w:w="150" w:type="dxa"/>
               <w:right w:w="150" w:type="dxa"/>
             </w:tcMar>
+            <w:tcBorders>
+              <w:top w:val="none"/>
+              <w:left w:val="none"/>
+              <w:bottom w:val="none"/>
+              <w:right w:val="none"/>
+              <w:insideH w:val="none"/>
+              <w:insideV w:val="none"/>
+            </w:tcBorders>
           </w:tcPr>
           <w:p>
             <w:pPr>
-              <w:spacing w:after="40" w:before="40"/>
+              <w:spacing w:after="80" w:before="80"/>
+              <w:jc w:val="left"/>
             </w:pPr>
             <w:r/>
             <w:r>
@@ -1103,15 +1252,24 @@
           <w:tcPr>
             <w:tcW w:type="dxa" w:w="1872"/>
             <w:tcMar>
-              <w:top w:w="120" w:type="dxa"/>
-              <w:bottom w:w="120" w:type="dxa"/>
+              <w:top w:w="100" w:type="dxa"/>
+              <w:bottom w:w="100" w:type="dxa"/>
               <w:left w:w="150" w:type="dxa"/>
               <w:right w:w="150" w:type="dxa"/>
             </w:tcMar>
+            <w:tcBorders>
+              <w:top w:val="none"/>
+              <w:left w:val="none"/>
+              <w:bottom w:val="none"/>
+              <w:right w:val="none"/>
+              <w:insideH w:val="none"/>
+              <w:insideV w:val="none"/>
+            </w:tcBorders>
           </w:tcPr>
           <w:p>
             <w:pPr>
-              <w:spacing w:after="40" w:before="40"/>
+              <w:spacing w:after="80" w:before="80"/>
+              <w:jc w:val="left"/>
             </w:pPr>
             <w:r/>
             <w:r>
@@ -1123,15 +1281,24 @@
           <w:tcPr>
             <w:tcW w:type="dxa" w:w="1872"/>
             <w:tcMar>
-              <w:top w:w="120" w:type="dxa"/>
-              <w:bottom w:w="120" w:type="dxa"/>
+              <w:top w:w="100" w:type="dxa"/>
+              <w:bottom w:w="100" w:type="dxa"/>
               <w:left w:w="150" w:type="dxa"/>
               <w:right w:w="150" w:type="dxa"/>
             </w:tcMar>
+            <w:tcBorders>
+              <w:top w:val="none"/>
+              <w:left w:val="none"/>
+              <w:bottom w:val="none"/>
+              <w:right w:val="none"/>
+              <w:insideH w:val="none"/>
+              <w:insideV w:val="none"/>
+            </w:tcBorders>
           </w:tcPr>
           <w:p>
             <w:pPr>
-              <w:spacing w:after="40" w:before="40"/>
+              <w:spacing w:after="80" w:before="80"/>
+              <w:jc w:val="left"/>
             </w:pPr>
             <w:r/>
             <w:r>
@@ -1148,15 +1315,24 @@
           <w:tcPr>
             <w:tcW w:type="dxa" w:w="1872"/>
             <w:tcMar>
-              <w:top w:w="120" w:type="dxa"/>
-              <w:bottom w:w="120" w:type="dxa"/>
+              <w:top w:w="100" w:type="dxa"/>
+              <w:bottom w:w="100" w:type="dxa"/>
               <w:left w:w="150" w:type="dxa"/>
               <w:right w:w="150" w:type="dxa"/>
             </w:tcMar>
+            <w:tcBorders>
+              <w:top w:val="none"/>
+              <w:left w:val="none"/>
+              <w:bottom w:val="none"/>
+              <w:right w:val="none"/>
+              <w:insideH w:val="none"/>
+              <w:insideV w:val="none"/>
+            </w:tcBorders>
           </w:tcPr>
           <w:p>
             <w:pPr>
-              <w:spacing w:after="40" w:before="40"/>
+              <w:spacing w:after="80" w:before="80"/>
+              <w:jc w:val="left"/>
             </w:pPr>
             <w:r/>
             <w:r>
@@ -1171,15 +1347,24 @@
           <w:tcPr>
             <w:tcW w:type="dxa" w:w="1872"/>
             <w:tcMar>
-              <w:top w:w="120" w:type="dxa"/>
-              <w:bottom w:w="120" w:type="dxa"/>
+              <w:top w:w="100" w:type="dxa"/>
+              <w:bottom w:w="100" w:type="dxa"/>
               <w:left w:w="150" w:type="dxa"/>
               <w:right w:w="150" w:type="dxa"/>
             </w:tcMar>
+            <w:tcBorders>
+              <w:top w:val="none"/>
+              <w:left w:val="none"/>
+              <w:bottom w:val="none"/>
+              <w:right w:val="none"/>
+              <w:insideH w:val="none"/>
+              <w:insideV w:val="none"/>
+            </w:tcBorders>
           </w:tcPr>
           <w:p>
             <w:pPr>
-              <w:spacing w:after="40" w:before="40"/>
+              <w:spacing w:after="80" w:before="80"/>
+              <w:jc w:val="left"/>
             </w:pPr>
             <w:r/>
             <w:r>
@@ -1191,15 +1376,24 @@
           <w:tcPr>
             <w:tcW w:type="dxa" w:w="1872"/>
             <w:tcMar>
-              <w:top w:w="120" w:type="dxa"/>
-              <w:bottom w:w="120" w:type="dxa"/>
+              <w:top w:w="100" w:type="dxa"/>
+              <w:bottom w:w="100" w:type="dxa"/>
               <w:left w:w="150" w:type="dxa"/>
               <w:right w:w="150" w:type="dxa"/>
             </w:tcMar>
+            <w:tcBorders>
+              <w:top w:val="none"/>
+              <w:left w:val="none"/>
+              <w:bottom w:val="none"/>
+              <w:right w:val="none"/>
+              <w:insideH w:val="none"/>
+              <w:insideV w:val="none"/>
+            </w:tcBorders>
           </w:tcPr>
           <w:p>
             <w:pPr>
-              <w:spacing w:after="40" w:before="40"/>
+              <w:spacing w:after="80" w:before="80"/>
+              <w:jc w:val="left"/>
             </w:pPr>
             <w:r/>
             <w:r>
@@ -1211,15 +1405,24 @@
           <w:tcPr>
             <w:tcW w:type="dxa" w:w="1872"/>
             <w:tcMar>
-              <w:top w:w="120" w:type="dxa"/>
-              <w:bottom w:w="120" w:type="dxa"/>
+              <w:top w:w="100" w:type="dxa"/>
+              <w:bottom w:w="100" w:type="dxa"/>
               <w:left w:w="150" w:type="dxa"/>
               <w:right w:w="150" w:type="dxa"/>
             </w:tcMar>
+            <w:tcBorders>
+              <w:top w:val="none"/>
+              <w:left w:val="none"/>
+              <w:bottom w:val="none"/>
+              <w:right w:val="none"/>
+              <w:insideH w:val="none"/>
+              <w:insideV w:val="none"/>
+            </w:tcBorders>
           </w:tcPr>
           <w:p>
             <w:pPr>
-              <w:spacing w:after="40" w:before="40"/>
+              <w:spacing w:after="80" w:before="80"/>
+              <w:jc w:val="left"/>
             </w:pPr>
             <w:r/>
             <w:r>
@@ -1231,15 +1434,24 @@
           <w:tcPr>
             <w:tcW w:type="dxa" w:w="1872"/>
             <w:tcMar>
-              <w:top w:w="120" w:type="dxa"/>
-              <w:bottom w:w="120" w:type="dxa"/>
+              <w:top w:w="100" w:type="dxa"/>
+              <w:bottom w:w="100" w:type="dxa"/>
               <w:left w:w="150" w:type="dxa"/>
               <w:right w:w="150" w:type="dxa"/>
             </w:tcMar>
+            <w:tcBorders>
+              <w:top w:val="none"/>
+              <w:left w:val="none"/>
+              <w:bottom w:val="none"/>
+              <w:right w:val="none"/>
+              <w:insideH w:val="none"/>
+              <w:insideV w:val="none"/>
+            </w:tcBorders>
           </w:tcPr>
           <w:p>
             <w:pPr>
-              <w:spacing w:after="40" w:before="40"/>
+              <w:spacing w:after="80" w:before="80"/>
+              <w:jc w:val="left"/>
             </w:pPr>
             <w:r/>
             <w:r>
@@ -1256,15 +1468,24 @@
           <w:tcPr>
             <w:tcW w:type="dxa" w:w="1872"/>
             <w:tcMar>
-              <w:top w:w="120" w:type="dxa"/>
-              <w:bottom w:w="120" w:type="dxa"/>
+              <w:top w:w="100" w:type="dxa"/>
+              <w:bottom w:w="100" w:type="dxa"/>
               <w:left w:w="150" w:type="dxa"/>
               <w:right w:w="150" w:type="dxa"/>
             </w:tcMar>
+            <w:tcBorders>
+              <w:top w:val="none"/>
+              <w:left w:val="none"/>
+              <w:bottom w:val="none"/>
+              <w:right w:val="none"/>
+              <w:insideH w:val="none"/>
+              <w:insideV w:val="none"/>
+            </w:tcBorders>
           </w:tcPr>
           <w:p>
             <w:pPr>
-              <w:spacing w:after="40" w:before="40"/>
+              <w:spacing w:after="80" w:before="80"/>
+              <w:jc w:val="left"/>
             </w:pPr>
             <w:r/>
             <w:r>
@@ -1279,15 +1500,24 @@
           <w:tcPr>
             <w:tcW w:type="dxa" w:w="1872"/>
             <w:tcMar>
-              <w:top w:w="120" w:type="dxa"/>
-              <w:bottom w:w="120" w:type="dxa"/>
+              <w:top w:w="100" w:type="dxa"/>
+              <w:bottom w:w="100" w:type="dxa"/>
               <w:left w:w="150" w:type="dxa"/>
               <w:right w:w="150" w:type="dxa"/>
             </w:tcMar>
+            <w:tcBorders>
+              <w:top w:val="none"/>
+              <w:left w:val="none"/>
+              <w:bottom w:val="none"/>
+              <w:right w:val="none"/>
+              <w:insideH w:val="none"/>
+              <w:insideV w:val="none"/>
+            </w:tcBorders>
           </w:tcPr>
           <w:p>
             <w:pPr>
-              <w:spacing w:after="40" w:before="40"/>
+              <w:spacing w:after="80" w:before="80"/>
+              <w:jc w:val="left"/>
             </w:pPr>
             <w:r/>
             <w:r>
@@ -1299,15 +1529,24 @@
           <w:tcPr>
             <w:tcW w:type="dxa" w:w="1872"/>
             <w:tcMar>
-              <w:top w:w="120" w:type="dxa"/>
-              <w:bottom w:w="120" w:type="dxa"/>
+              <w:top w:w="100" w:type="dxa"/>
+              <w:bottom w:w="100" w:type="dxa"/>
               <w:left w:w="150" w:type="dxa"/>
               <w:right w:w="150" w:type="dxa"/>
             </w:tcMar>
+            <w:tcBorders>
+              <w:top w:val="none"/>
+              <w:left w:val="none"/>
+              <w:bottom w:val="none"/>
+              <w:right w:val="none"/>
+              <w:insideH w:val="none"/>
+              <w:insideV w:val="none"/>
+            </w:tcBorders>
           </w:tcPr>
           <w:p>
             <w:pPr>
-              <w:spacing w:after="40" w:before="40"/>
+              <w:spacing w:after="80" w:before="80"/>
+              <w:jc w:val="left"/>
             </w:pPr>
             <w:r/>
             <w:r>
@@ -1319,15 +1558,24 @@
           <w:tcPr>
             <w:tcW w:type="dxa" w:w="1872"/>
             <w:tcMar>
-              <w:top w:w="120" w:type="dxa"/>
-              <w:bottom w:w="120" w:type="dxa"/>
+              <w:top w:w="100" w:type="dxa"/>
+              <w:bottom w:w="100" w:type="dxa"/>
               <w:left w:w="150" w:type="dxa"/>
               <w:right w:w="150" w:type="dxa"/>
             </w:tcMar>
+            <w:tcBorders>
+              <w:top w:val="none"/>
+              <w:left w:val="none"/>
+              <w:bottom w:val="none"/>
+              <w:right w:val="none"/>
+              <w:insideH w:val="none"/>
+              <w:insideV w:val="none"/>
+            </w:tcBorders>
           </w:tcPr>
           <w:p>
             <w:pPr>
-              <w:spacing w:after="40" w:before="40"/>
+              <w:spacing w:after="80" w:before="80"/>
+              <w:jc w:val="left"/>
             </w:pPr>
             <w:r/>
             <w:r>
@@ -1339,15 +1587,24 @@
           <w:tcPr>
             <w:tcW w:type="dxa" w:w="1872"/>
             <w:tcMar>
-              <w:top w:w="120" w:type="dxa"/>
-              <w:bottom w:w="120" w:type="dxa"/>
+              <w:top w:w="100" w:type="dxa"/>
+              <w:bottom w:w="100" w:type="dxa"/>
               <w:left w:w="150" w:type="dxa"/>
               <w:right w:w="150" w:type="dxa"/>
             </w:tcMar>
+            <w:tcBorders>
+              <w:top w:val="none"/>
+              <w:left w:val="none"/>
+              <w:bottom w:val="none"/>
+              <w:right w:val="none"/>
+              <w:insideH w:val="none"/>
+              <w:insideV w:val="none"/>
+            </w:tcBorders>
           </w:tcPr>
           <w:p>
             <w:pPr>
-              <w:spacing w:after="40" w:before="40"/>
+              <w:spacing w:after="80" w:before="80"/>
+              <w:jc w:val="left"/>
             </w:pPr>
             <w:r/>
             <w:r>
@@ -1364,15 +1621,25 @@
           <w:tcPr>
             <w:tcW w:type="dxa" w:w="1872"/>
             <w:tcMar>
-              <w:top w:w="120" w:type="dxa"/>
-              <w:bottom w:w="120" w:type="dxa"/>
+              <w:top w:w="100" w:type="dxa"/>
+              <w:bottom w:w="100" w:type="dxa"/>
               <w:left w:w="150" w:type="dxa"/>
               <w:right w:w="150" w:type="dxa"/>
             </w:tcMar>
+            <w:tcBorders>
+              <w:top w:val="none"/>
+              <w:left w:val="none"/>
+              <w:bottom w:val="none"/>
+              <w:right w:val="none"/>
+              <w:insideH w:val="none"/>
+              <w:insideV w:val="none"/>
+              <w:bottom w:val="single" w:sz="4" w:color="000000"/>
+            </w:tcBorders>
           </w:tcPr>
           <w:p>
             <w:pPr>
-              <w:spacing w:after="40" w:before="40"/>
+              <w:spacing w:after="80" w:before="80"/>
+              <w:jc w:val="left"/>
             </w:pPr>
             <w:r/>
             <w:r>
@@ -1387,15 +1654,25 @@
           <w:tcPr>
             <w:tcW w:type="dxa" w:w="1872"/>
             <w:tcMar>
-              <w:top w:w="120" w:type="dxa"/>
-              <w:bottom w:w="120" w:type="dxa"/>
+              <w:top w:w="100" w:type="dxa"/>
+              <w:bottom w:w="100" w:type="dxa"/>
               <w:left w:w="150" w:type="dxa"/>
               <w:right w:w="150" w:type="dxa"/>
             </w:tcMar>
+            <w:tcBorders>
+              <w:top w:val="none"/>
+              <w:left w:val="none"/>
+              <w:bottom w:val="none"/>
+              <w:right w:val="none"/>
+              <w:insideH w:val="none"/>
+              <w:insideV w:val="none"/>
+              <w:bottom w:val="single" w:sz="4" w:color="000000"/>
+            </w:tcBorders>
           </w:tcPr>
           <w:p>
             <w:pPr>
-              <w:spacing w:after="40" w:before="40"/>
+              <w:spacing w:after="80" w:before="80"/>
+              <w:jc w:val="left"/>
             </w:pPr>
             <w:r/>
             <w:r>
@@ -1407,15 +1684,25 @@
           <w:tcPr>
             <w:tcW w:type="dxa" w:w="1872"/>
             <w:tcMar>
-              <w:top w:w="120" w:type="dxa"/>
-              <w:bottom w:w="120" w:type="dxa"/>
+              <w:top w:w="100" w:type="dxa"/>
+              <w:bottom w:w="100" w:type="dxa"/>
               <w:left w:w="150" w:type="dxa"/>
               <w:right w:w="150" w:type="dxa"/>
             </w:tcMar>
+            <w:tcBorders>
+              <w:top w:val="none"/>
+              <w:left w:val="none"/>
+              <w:bottom w:val="none"/>
+              <w:right w:val="none"/>
+              <w:insideH w:val="none"/>
+              <w:insideV w:val="none"/>
+              <w:bottom w:val="single" w:sz="4" w:color="000000"/>
+            </w:tcBorders>
           </w:tcPr>
           <w:p>
             <w:pPr>
-              <w:spacing w:after="40" w:before="40"/>
+              <w:spacing w:after="80" w:before="80"/>
+              <w:jc w:val="left"/>
             </w:pPr>
             <w:r/>
             <w:r>
@@ -1427,15 +1714,25 @@
           <w:tcPr>
             <w:tcW w:type="dxa" w:w="1872"/>
             <w:tcMar>
-              <w:top w:w="120" w:type="dxa"/>
-              <w:bottom w:w="120" w:type="dxa"/>
+              <w:top w:w="100" w:type="dxa"/>
+              <w:bottom w:w="100" w:type="dxa"/>
               <w:left w:w="150" w:type="dxa"/>
               <w:right w:w="150" w:type="dxa"/>
             </w:tcMar>
+            <w:tcBorders>
+              <w:top w:val="none"/>
+              <w:left w:val="none"/>
+              <w:bottom w:val="none"/>
+              <w:right w:val="none"/>
+              <w:insideH w:val="none"/>
+              <w:insideV w:val="none"/>
+              <w:bottom w:val="single" w:sz="4" w:color="000000"/>
+            </w:tcBorders>
           </w:tcPr>
           <w:p>
             <w:pPr>
-              <w:spacing w:after="40" w:before="40"/>
+              <w:spacing w:after="80" w:before="80"/>
+              <w:jc w:val="left"/>
             </w:pPr>
             <w:r/>
             <w:r>
@@ -1447,15 +1744,25 @@
           <w:tcPr>
             <w:tcW w:type="dxa" w:w="1872"/>
             <w:tcMar>
-              <w:top w:w="120" w:type="dxa"/>
-              <w:bottom w:w="120" w:type="dxa"/>
+              <w:top w:w="100" w:type="dxa"/>
+              <w:bottom w:w="100" w:type="dxa"/>
               <w:left w:w="150" w:type="dxa"/>
               <w:right w:w="150" w:type="dxa"/>
             </w:tcMar>
+            <w:tcBorders>
+              <w:top w:val="none"/>
+              <w:left w:val="none"/>
+              <w:bottom w:val="none"/>
+              <w:right w:val="none"/>
+              <w:insideH w:val="none"/>
+              <w:insideV w:val="none"/>
+              <w:bottom w:val="single" w:sz="4" w:color="000000"/>
+            </w:tcBorders>
           </w:tcPr>
           <w:p>
             <w:pPr>
-              <w:spacing w:after="40" w:before="40"/>
+              <w:spacing w:after="80" w:before="80"/>
+              <w:jc w:val="left"/>
             </w:pPr>
             <w:r/>
             <w:r>
@@ -1473,21 +1780,22 @@
       <w:pPr>
         <w:pStyle w:val="Heading2"/>
         <w:keepNext/>
-        <w:spacing w:before="280" w:after="120"/>
+        <w:spacing w:before="360" w:after="160"/>
       </w:pPr>
       <w:r>
         <w:rPr>
-          <w:rFonts w:ascii="Arial" w:hAnsi="Arial"/>
+          <w:rFonts w:ascii="Times New Roman" w:hAnsi="Times New Roman"/>
           <w:b/>
-          <w:color w:val="2980B9"/>
-          <w:sz w:val="30"/>
+          <w:color w:val="000000"/>
+          <w:sz w:val="28"/>
         </w:rPr>
         <w:t>2.3.- Valoración</w:t>
       </w:r>
     </w:p>
     <w:p>
       <w:pPr>
-        <w:spacing w:after="120" w:line="276" w:lineRule="auto"/>
+        <w:spacing w:after="160" w:line="276" w:lineRule="auto"/>
+        <w:jc w:val="both"/>
       </w:pPr>
       <w:r>
         <w:t xml:space="preserve">El estudio comparativo demuestra que </w:t>
@@ -1511,21 +1819,22 @@
       <w:pPr>
         <w:pStyle w:val="Heading1"/>
         <w:keepNext/>
-        <w:spacing w:before="360" w:after="160"/>
+        <w:spacing w:before="480" w:after="240"/>
       </w:pPr>
       <w:r>
         <w:rPr>
-          <w:rFonts w:ascii="Arial" w:hAnsi="Arial"/>
+          <w:rFonts w:ascii="Times New Roman" w:hAnsi="Times New Roman"/>
           <w:b/>
-          <w:color w:val="1A5276"/>
-          <w:sz w:val="40"/>
+          <w:color w:val="000000"/>
+          <w:sz w:val="36"/>
         </w:rPr>
         <w:t>Capítulo 3: Hipótesis de Trabajo y Tecnologías</w:t>
       </w:r>
     </w:p>
     <w:p>
       <w:pPr>
-        <w:spacing w:after="120" w:line="276" w:lineRule="auto"/>
+        <w:spacing w:after="160" w:line="276" w:lineRule="auto"/>
+        <w:jc w:val="both"/>
       </w:pPr>
       <w:r>
         <w:t>El desarrollo del sistema se sustenta sobre la selección de un stack tecnológico moderno, abierto y altamente documentado, asegurando la scalabilidad y compatibilidad multiplataforma:</w:t>
@@ -1534,12 +1843,9 @@
     <w:p>
       <w:pPr>
         <w:pStyle w:val="ListBullet"/>
-        <w:spacing w:after="60"/>
+        <w:spacing w:after="80"/>
         <w:ind w:left="360"/>
       </w:pPr>
-      <w:r>
-        <w:t xml:space="preserve">  </w:t>
-      </w:r>
       <w:r>
         <w:rPr>
           <w:b/>
@@ -1553,12 +1859,9 @@
     <w:p>
       <w:pPr>
         <w:pStyle w:val="ListBullet"/>
-        <w:spacing w:after="60"/>
+        <w:spacing w:after="80"/>
         <w:ind w:left="360"/>
       </w:pPr>
-      <w:r>
-        <w:t xml:space="preserve">  </w:t>
-      </w:r>
       <w:r>
         <w:rPr>
           <w:b/>
@@ -1572,12 +1875,9 @@
     <w:p>
       <w:pPr>
         <w:pStyle w:val="ListBullet"/>
-        <w:spacing w:after="60"/>
+        <w:spacing w:after="80"/>
         <w:ind w:left="360"/>
       </w:pPr>
-      <w:r>
-        <w:t xml:space="preserve">  </w:t>
-      </w:r>
       <w:r>
         <w:rPr>
           <w:b/>
@@ -1591,12 +1891,9 @@
     <w:p>
       <w:pPr>
         <w:pStyle w:val="ListBullet"/>
-        <w:spacing w:after="60"/>
+        <w:spacing w:after="80"/>
         <w:ind w:left="360"/>
       </w:pPr>
-      <w:r>
-        <w:t xml:space="preserve">  </w:t>
-      </w:r>
       <w:r>
         <w:rPr>
           <w:b/>
@@ -1619,12 +1916,9 @@
     <w:p>
       <w:pPr>
         <w:pStyle w:val="ListBullet"/>
-        <w:spacing w:after="60"/>
+        <w:spacing w:after="80"/>
         <w:ind w:left="360"/>
       </w:pPr>
-      <w:r>
-        <w:t xml:space="preserve">  </w:t>
-      </w:r>
       <w:r>
         <w:rPr>
           <w:b/>
@@ -1638,12 +1932,9 @@
     <w:p>
       <w:pPr>
         <w:pStyle w:val="ListBullet"/>
-        <w:spacing w:after="60"/>
+        <w:spacing w:after="80"/>
         <w:ind w:left="360"/>
       </w:pPr>
-      <w:r>
-        <w:t xml:space="preserve">  </w:t>
-      </w:r>
       <w:r>
         <w:rPr>
           <w:b/>
@@ -1666,12 +1957,9 @@
     <w:p>
       <w:pPr>
         <w:pStyle w:val="ListBullet"/>
-        <w:spacing w:after="60"/>
+        <w:spacing w:after="80"/>
         <w:ind w:left="360"/>
       </w:pPr>
-      <w:r>
-        <w:t xml:space="preserve">  </w:t>
-      </w:r>
       <w:r>
         <w:rPr>
           <w:b/>
@@ -1691,14 +1979,14 @@
       <w:pPr>
         <w:pStyle w:val="Heading1"/>
         <w:keepNext/>
-        <w:spacing w:before="360" w:after="160"/>
+        <w:spacing w:before="480" w:after="240"/>
       </w:pPr>
       <w:r>
         <w:rPr>
-          <w:rFonts w:ascii="Arial" w:hAnsi="Arial"/>
+          <w:rFonts w:ascii="Times New Roman" w:hAnsi="Times New Roman"/>
           <w:b/>
-          <w:color w:val="1A5276"/>
-          <w:sz w:val="40"/>
+          <w:color w:val="000000"/>
+          <w:sz w:val="36"/>
         </w:rPr>
         <w:t>Capítulo 4: Metodología, Diseño y Resultados</w:t>
       </w:r>
@@ -1707,21 +1995,22 @@
       <w:pPr>
         <w:pStyle w:val="Heading2"/>
         <w:keepNext/>
-        <w:spacing w:before="280" w:after="120"/>
+        <w:spacing w:before="360" w:after="160"/>
       </w:pPr>
       <w:r>
         <w:rPr>
-          <w:rFonts w:ascii="Arial" w:hAnsi="Arial"/>
+          <w:rFonts w:ascii="Times New Roman" w:hAnsi="Times New Roman"/>
           <w:b/>
-          <w:color w:val="2980B9"/>
-          <w:sz w:val="30"/>
+          <w:color w:val="000000"/>
+          <w:sz w:val="28"/>
         </w:rPr>
         <w:t>4.1.- Planificación Temporal (Gantt)</w:t>
       </w:r>
     </w:p>
     <w:p>
       <w:pPr>
-        <w:spacing w:after="120" w:line="276" w:lineRule="auto"/>
+        <w:spacing w:after="160" w:line="276" w:lineRule="auto"/>
+        <w:jc w:val="both"/>
       </w:pPr>
       <w:r>
         <w:t xml:space="preserve">Se adoptó un modelo de ciclo de vida </w:t>
@@ -1738,67 +2027,80 @@
     </w:p>
     <w:p>
       <w:pPr>
-        <w:spacing w:before="120" w:after="120"/>
-        <w:ind w:left="720"/>
-        <w:pBdr>
-          <w:left w:val="single" w:sz="24" w:space="4" w:color="CCCCCC"/>
-        </w:pBdr>
-        <w:shd w:fill="F5F5F5"/>
+        <w:spacing w:before="240" w:after="80"/>
+        <w:jc w:val="center"/>
       </w:pPr>
       <w:r>
-        <w:rPr>
-          <w:rFonts w:ascii="Courier New" w:hAnsi="Courier New"/>
-          <w:color w:val="282828"/>
-          <w:sz w:val="19"/>
-        </w:rPr>
-        <w:t>gantt</w:t>
-        <w:br/>
-        <w:t xml:space="preserve">    title Planificación Temporal de Chess Legacy (Sprints)</w:t>
-        <w:br/>
-        <w:t xml:space="preserve">    dateFormat  YYYY-MM-DD</w:t>
-        <w:br/>
-        <w:t xml:space="preserve">    section Fase Inicial</w:t>
-        <w:br/>
-        <w:t xml:space="preserve">    Captura de Requisitos &amp; Diseño BD  :active, 2026-03-01, 7d</w:t>
-        <w:br/>
-        <w:t xml:space="preserve">    section Backend</w:t>
-        <w:br/>
-        <w:t xml:space="preserve">    Estructuración Capas &amp; Repositorios : 2026-03-08, 10d</w:t>
-        <w:br/>
-        <w:t xml:space="preserve">    Integración Stockfish &amp; API REST   : 2026-03-18, 12d</w:t>
-        <w:br/>
-        <w:t xml:space="preserve">    section Frontend</w:t>
-        <w:br/>
-        <w:t xml:space="preserve">    Diseño Interfaz Gráfica &amp; Componentes : 2026-03-30, 12d</w:t>
-        <w:br/>
-        <w:t xml:space="preserve">    Tablero Interactivo &amp; Teclado UX     : 2026-04-11, 10d</w:t>
-        <w:br/>
-        <w:t xml:space="preserve">    section Optimización</w:t>
-        <w:br/>
-        <w:t xml:space="preserve">    Carga Masiva de 40k Partidas         : 2026-04-21, 8d</w:t>
-        <w:br/>
-        <w:t xml:space="preserve">    Orquestación Docker &amp; Despliegue      : 2026-04-29, 7d</w:t>
+        <w:drawing>
+          <wp:inline xmlns:a="http://schemas.openxmlformats.org/drawingml/2006/main" xmlns:pic="http://schemas.openxmlformats.org/drawingml/2006/picture">
+            <wp:extent cx="5486400" cy="772245"/>
+            <wp:docPr id="1" name="Picture 1"/>
+            <wp:cNvGraphicFramePr>
+              <a:graphicFrameLocks noChangeAspect="1"/>
+            </wp:cNvGraphicFramePr>
+            <a:graphic>
+              <a:graphicData uri="http://schemas.openxmlformats.org/drawingml/2006/picture">
+                <pic:pic>
+                  <pic:nvPicPr>
+                    <pic:cNvPr id="0" name="diagrama_1.png"/>
+                    <pic:cNvPicPr/>
+                  </pic:nvPicPr>
+                  <pic:blipFill>
+                    <a:blip r:embed="rId9"/>
+                    <a:stretch>
+                      <a:fillRect/>
+                    </a:stretch>
+                  </pic:blipFill>
+                  <pic:spPr>
+                    <a:xfrm>
+                      <a:off x="0" y="0"/>
+                      <a:ext cx="5486400" cy="772245"/>
+                    </a:xfrm>
+                    <a:prstGeom prst="rect"/>
+                  </pic:spPr>
+                </pic:pic>
+              </a:graphicData>
+            </a:graphic>
+          </wp:inline>
+        </w:drawing>
       </w:r>
     </w:p>
     <w:p>
       <w:pPr>
+        <w:keepNext/>
+        <w:spacing w:after="240"/>
+        <w:jc w:val="center"/>
+      </w:pPr>
+      <w:r>
+        <w:rPr>
+          <w:rFonts w:ascii="Times New Roman" w:hAnsi="Times New Roman"/>
+          <w:i/>
+          <w:color w:val="505050"/>
+          <w:sz w:val="19"/>
+        </w:rPr>
+        <w:t>Figura 4.1. Planificacion temporal del desarrollo del sistema (Diagrama de Gantt).</w:t>
+      </w:r>
+    </w:p>
+    <w:p>
+      <w:pPr>
         <w:pStyle w:val="Heading2"/>
         <w:keepNext/>
-        <w:spacing w:before="280" w:after="120"/>
+        <w:spacing w:before="360" w:after="160"/>
       </w:pPr>
       <w:r>
         <w:rPr>
-          <w:rFonts w:ascii="Arial" w:hAnsi="Arial"/>
+          <w:rFonts w:ascii="Times New Roman" w:hAnsi="Times New Roman"/>
           <w:b/>
-          <w:color w:val="2980B9"/>
-          <w:sz w:val="30"/>
+          <w:color w:val="000000"/>
+          <w:sz w:val="28"/>
         </w:rPr>
         <w:t>4.2.- Captura de Requisitos</w:t>
       </w:r>
     </w:p>
     <w:p>
       <w:pPr>
-        <w:spacing w:after="120" w:line="276" w:lineRule="auto"/>
+        <w:spacing w:after="160" w:line="276" w:lineRule="auto"/>
+        <w:jc w:val="both"/>
       </w:pPr>
       <w:r>
         <w:t xml:space="preserve">El sistema identifica tres roles de usuario claros: </w:t>
@@ -1835,13 +2137,13 @@
       <w:pPr>
         <w:pStyle w:val="Heading3"/>
         <w:keepNext/>
-        <w:spacing w:before="200" w:after="80"/>
+        <w:spacing w:before="280" w:after="120"/>
       </w:pPr>
       <w:r>
         <w:rPr>
-          <w:rFonts w:ascii="Arial" w:hAnsi="Arial"/>
+          <w:rFonts w:ascii="Times New Roman" w:hAnsi="Times New Roman"/>
           <w:b/>
-          <w:color w:val="6E6E6E"/>
+          <w:color w:val="000000"/>
           <w:sz w:val="24"/>
         </w:rPr>
         <w:t>📋 Diagrama de Casos de Uso del Sistema</w:t>
@@ -1849,86 +2151,80 @@
     </w:p>
     <w:p>
       <w:pPr>
-        <w:spacing w:before="120" w:after="120"/>
-        <w:ind w:left="720"/>
-        <w:pBdr>
-          <w:left w:val="single" w:sz="24" w:space="4" w:color="CCCCCC"/>
-        </w:pBdr>
-        <w:shd w:fill="F5F5F5"/>
+        <w:spacing w:before="240" w:after="80"/>
+        <w:jc w:val="center"/>
       </w:pPr>
       <w:r>
-        <w:rPr>
-          <w:rFonts w:ascii="Courier New" w:hAnsi="Courier New"/>
-          <w:color w:val="282828"/>
-          <w:sz w:val="19"/>
-        </w:rPr>
-        <w:t>graph TD</w:t>
-        <w:br/>
-        <w:t xml:space="preserve">    subgraph Roles de Usuario</w:t>
-        <w:br/>
-        <w:t xml:space="preserve">        Invitado((Invitado))</w:t>
-        <w:br/>
-        <w:t xml:space="preserve">        Jugador((Jugador Registrado))</w:t>
-        <w:br/>
-        <w:t xml:space="preserve">    end</w:t>
-        <w:br/>
-        <w:br/>
-        <w:t xml:space="preserve">    subgraph Plataforma Chess Legacy</w:t>
-        <w:br/>
-        <w:t xml:space="preserve">        UC1(Registrar Cuenta / Login)</w:t>
-        <w:br/>
-        <w:t xml:space="preserve">        UC2(Explorar Base de 40,509 Partidas)</w:t>
-        <w:br/>
-        <w:t xml:space="preserve">        UC3(Visualizar Partida del Día)</w:t>
-        <w:br/>
-        <w:t xml:space="preserve">        UC4(Analizar con Stockfish Local)</w:t>
-        <w:br/>
-        <w:t xml:space="preserve">        UC5(Jugar Contra Maestros Adaptativos)</w:t>
-        <w:br/>
-        <w:t xml:space="preserve">        UC6(Ver Biografías e Historial)</w:t>
-        <w:br/>
-        <w:t xml:space="preserve">        UC7(Rastrear XP, Rachas y Logros)</w:t>
-        <w:br/>
-        <w:t xml:space="preserve">    end</w:t>
-        <w:br/>
-        <w:br/>
-        <w:t xml:space="preserve">    Invitado --&gt; UC1</w:t>
-        <w:br/>
-        <w:t xml:space="preserve">    Invitado --&gt; UC3</w:t>
-        <w:br/>
-        <w:t xml:space="preserve">    Invitado --&gt; UC2</w:t>
-        <w:br/>
-        <w:br/>
-        <w:t xml:space="preserve">    Jugador --&gt; UC2</w:t>
-        <w:br/>
-        <w:t xml:space="preserve">    Jugador --&gt; UC4</w:t>
-        <w:br/>
-        <w:t xml:space="preserve">    Jugador --&gt; UC5</w:t>
-        <w:br/>
-        <w:t xml:space="preserve">    Jugador --&gt; UC6</w:t>
-        <w:br/>
-        <w:t xml:space="preserve">    Jugador --&gt; UC7</w:t>
+        <w:drawing>
+          <wp:inline xmlns:a="http://schemas.openxmlformats.org/drawingml/2006/main" xmlns:pic="http://schemas.openxmlformats.org/drawingml/2006/picture">
+            <wp:extent cx="5486400" cy="1135316"/>
+            <wp:docPr id="2" name="Picture 2"/>
+            <wp:cNvGraphicFramePr>
+              <a:graphicFrameLocks noChangeAspect="1"/>
+            </wp:cNvGraphicFramePr>
+            <a:graphic>
+              <a:graphicData uri="http://schemas.openxmlformats.org/drawingml/2006/picture">
+                <pic:pic>
+                  <pic:nvPicPr>
+                    <pic:cNvPr id="0" name="diagrama_2.png"/>
+                    <pic:cNvPicPr/>
+                  </pic:nvPicPr>
+                  <pic:blipFill>
+                    <a:blip r:embed="rId10"/>
+                    <a:stretch>
+                      <a:fillRect/>
+                    </a:stretch>
+                  </pic:blipFill>
+                  <pic:spPr>
+                    <a:xfrm>
+                      <a:off x="0" y="0"/>
+                      <a:ext cx="5486400" cy="1135316"/>
+                    </a:xfrm>
+                    <a:prstGeom prst="rect"/>
+                  </pic:spPr>
+                </pic:pic>
+              </a:graphicData>
+            </a:graphic>
+          </wp:inline>
+        </w:drawing>
       </w:r>
     </w:p>
     <w:p>
       <w:pPr>
+        <w:keepNext/>
+        <w:spacing w:after="240"/>
+        <w:jc w:val="center"/>
+      </w:pPr>
+      <w:r>
+        <w:rPr>
+          <w:rFonts w:ascii="Times New Roman" w:hAnsi="Times New Roman"/>
+          <w:i/>
+          <w:color w:val="505050"/>
+          <w:sz w:val="19"/>
+        </w:rPr>
+        <w:t>Figura 4.2. Diagrama de Casos de Uso general del sistema Chess Legacy.</w:t>
+      </w:r>
+    </w:p>
+    <w:p>
+      <w:pPr>
         <w:pStyle w:val="Heading2"/>
         <w:keepNext/>
-        <w:spacing w:before="280" w:after="120"/>
+        <w:spacing w:before="360" w:after="160"/>
       </w:pPr>
       <w:r>
         <w:rPr>
-          <w:rFonts w:ascii="Arial" w:hAnsi="Arial"/>
+          <w:rFonts w:ascii="Times New Roman" w:hAnsi="Times New Roman"/>
           <w:b/>
-          <w:color w:val="2980B9"/>
-          <w:sz w:val="30"/>
+          <w:color w:val="000000"/>
+          <w:sz w:val="28"/>
         </w:rPr>
         <w:t>4.3.- Diseño Arquitectónico y Base de Datos</w:t>
       </w:r>
     </w:p>
     <w:p>
       <w:pPr>
-        <w:spacing w:after="120" w:line="276" w:lineRule="auto"/>
+        <w:spacing w:after="160" w:line="276" w:lineRule="auto"/>
+        <w:jc w:val="both"/>
       </w:pPr>
       <w:r>
         <w:t xml:space="preserve">El backend se estructura siguiendo el </w:t>
@@ -1947,145 +2243,85 @@
       <w:pPr>
         <w:pStyle w:val="Heading3"/>
         <w:keepNext/>
-        <w:spacing w:before="200" w:after="80"/>
+        <w:spacing w:before="280" w:after="120"/>
       </w:pPr>
       <w:r>
         <w:rPr>
-          <w:rFonts w:ascii="Arial" w:hAnsi="Arial"/>
+          <w:rFonts w:ascii="Times New Roman" w:hAnsi="Times New Roman"/>
           <w:b/>
-          <w:color w:val="6E6E6E"/>
+          <w:color w:val="000000"/>
           <w:sz w:val="24"/>
         </w:rPr>
-        <w:t>🗄️ Diagrama Entidad-Relación de la Base de Datos</w:t>
+        <w:t>️ Diagrama Entidad-Relación de la Base de Datos</w:t>
       </w:r>
     </w:p>
     <w:p>
       <w:pPr>
-        <w:spacing w:before="120" w:after="120"/>
-        <w:ind w:left="720"/>
-        <w:pBdr>
-          <w:left w:val="single" w:sz="24" w:space="4" w:color="CCCCCC"/>
-        </w:pBdr>
-        <w:shd w:fill="F5F5F5"/>
+        <w:spacing w:before="240" w:after="80"/>
+        <w:jc w:val="center"/>
       </w:pPr>
       <w:r>
-        <w:rPr>
-          <w:rFonts w:ascii="Courier New" w:hAnsi="Courier New"/>
-          <w:color w:val="282828"/>
-          <w:sz w:val="19"/>
-        </w:rPr>
-        <w:t>erDiagram</w:t>
-        <w:br/>
-        <w:t xml:space="preserve">    JUGADORES ||--o{ PARTIDAS : "disputa"</w:t>
-        <w:br/>
-        <w:t xml:space="preserve">    JUGADORES {</w:t>
-        <w:br/>
-        <w:t xml:space="preserve">        int Id PK</w:t>
-        <w:br/>
-        <w:t xml:space="preserve">        string Nombre</w:t>
-        <w:br/>
-        <w:t xml:space="preserve">        int AnioNacimiento</w:t>
-        <w:br/>
-        <w:t xml:space="preserve">        string Pais</w:t>
-        <w:br/>
-        <w:t xml:space="preserve">        float PesoSacrificio</w:t>
-        <w:br/>
-        <w:t xml:space="preserve">        float PesoAtaqueRey</w:t>
-        <w:br/>
-        <w:t xml:space="preserve">        float PesoSimplificacion</w:t>
-        <w:br/>
-        <w:t xml:space="preserve">        float PesoFinales</w:t>
-        <w:br/>
-        <w:t xml:space="preserve">        float PesoControlCentro</w:t>
-        <w:br/>
-        <w:t xml:space="preserve">    }</w:t>
-        <w:br/>
-        <w:t xml:space="preserve">    PARTIDAS ||--o{ POSICIONES : "contiene"</w:t>
-        <w:br/>
-        <w:t xml:space="preserve">    PARTIDAS {</w:t>
-        <w:br/>
-        <w:t xml:space="preserve">        int Id PK</w:t>
-        <w:br/>
-        <w:t xml:space="preserve">        int JugadorId FK</w:t>
-        <w:br/>
-        <w:t xml:space="preserve">        string Oponente</w:t>
-        <w:br/>
-        <w:t xml:space="preserve">        int Anio</w:t>
-        <w:br/>
-        <w:t xml:space="preserve">        string Evento</w:t>
-        <w:br/>
-        <w:t xml:space="preserve">        string CodigoECO</w:t>
-        <w:br/>
-        <w:t xml:space="preserve">        string AperturaNombre</w:t>
-        <w:br/>
-        <w:t xml:space="preserve">        string VarianteNombre</w:t>
-        <w:br/>
-        <w:t xml:space="preserve">        string PGN</w:t>
-        <w:br/>
-        <w:t xml:space="preserve">        string ColorJugador</w:t>
-        <w:br/>
-        <w:t xml:space="preserve">        string Resultado</w:t>
-        <w:br/>
-        <w:t xml:space="preserve">    }</w:t>
-        <w:br/>
-        <w:t xml:space="preserve">    POSICIONES {</w:t>
-        <w:br/>
-        <w:t xml:space="preserve">        int Id PK</w:t>
-        <w:br/>
-        <w:t xml:space="preserve">        int PartidaId FK</w:t>
-        <w:br/>
-        <w:t xml:space="preserve">        string FEN</w:t>
-        <w:br/>
-        <w:t xml:space="preserve">        string MovimientoHistorico</w:t>
-        <w:br/>
-        <w:t xml:space="preserve">        string TipoPosicion</w:t>
-        <w:br/>
-        <w:t xml:space="preserve">    }</w:t>
-        <w:br/>
-        <w:t xml:space="preserve">    USUARIOS ||--o{ LOGROS : "obtiene"</w:t>
-        <w:br/>
-        <w:t xml:space="preserve">    USUARIOS {</w:t>
-        <w:br/>
-        <w:t xml:space="preserve">        int Id PK</w:t>
-        <w:br/>
-        <w:t xml:space="preserve">        string Username</w:t>
-        <w:br/>
-        <w:t xml:space="preserve">        string PasswordHash</w:t>
-        <w:br/>
-        <w:t xml:space="preserve">        int XP</w:t>
-        <w:br/>
-        <w:t xml:space="preserve">        int RachaDias</w:t>
-        <w:br/>
-        <w:t xml:space="preserve">        string UltimaActividad</w:t>
-        <w:br/>
-        <w:t xml:space="preserve">    }</w:t>
-        <w:br/>
-        <w:t xml:space="preserve">    LOGROS {</w:t>
-        <w:br/>
-        <w:t xml:space="preserve">        int Id PK</w:t>
-        <w:br/>
-        <w:t xml:space="preserve">        int UsuarioId FK</w:t>
-        <w:br/>
-        <w:t xml:space="preserve">        string Codigo</w:t>
-        <w:br/>
-        <w:t xml:space="preserve">        string Titulo</w:t>
-        <w:br/>
-        <w:t xml:space="preserve">        string FechaLogro</w:t>
-        <w:br/>
-        <w:t xml:space="preserve">    }</w:t>
+        <w:drawing>
+          <wp:inline xmlns:a="http://schemas.openxmlformats.org/drawingml/2006/main" xmlns:pic="http://schemas.openxmlformats.org/drawingml/2006/picture">
+            <wp:extent cx="5486400" cy="11467143"/>
+            <wp:docPr id="3" name="Picture 3"/>
+            <wp:cNvGraphicFramePr>
+              <a:graphicFrameLocks noChangeAspect="1"/>
+            </wp:cNvGraphicFramePr>
+            <a:graphic>
+              <a:graphicData uri="http://schemas.openxmlformats.org/drawingml/2006/picture">
+                <pic:pic>
+                  <pic:nvPicPr>
+                    <pic:cNvPr id="0" name="diagrama_3.png"/>
+                    <pic:cNvPicPr/>
+                  </pic:nvPicPr>
+                  <pic:blipFill>
+                    <a:blip r:embed="rId11"/>
+                    <a:stretch>
+                      <a:fillRect/>
+                    </a:stretch>
+                  </pic:blipFill>
+                  <pic:spPr>
+                    <a:xfrm>
+                      <a:off x="0" y="0"/>
+                      <a:ext cx="5486400" cy="11467143"/>
+                    </a:xfrm>
+                    <a:prstGeom prst="rect"/>
+                  </pic:spPr>
+                </pic:pic>
+              </a:graphicData>
+            </a:graphic>
+          </wp:inline>
+        </w:drawing>
       </w:r>
     </w:p>
     <w:p>
       <w:pPr>
+        <w:keepNext/>
+        <w:spacing w:after="240"/>
+        <w:jc w:val="center"/>
+      </w:pPr>
+      <w:r>
+        <w:rPr>
+          <w:rFonts w:ascii="Times New Roman" w:hAnsi="Times New Roman"/>
+          <w:i/>
+          <w:color w:val="505050"/>
+          <w:sz w:val="19"/>
+        </w:rPr>
+        <w:t>Figura 4.3. Modelo Conceptual Base de Datos Relacional (Diagrama Entidad-Relacion).</w:t>
+      </w:r>
+    </w:p>
+    <w:p>
+      <w:pPr>
         <w:pStyle w:val="Heading3"/>
         <w:keepNext/>
-        <w:spacing w:before="200" w:after="80"/>
+        <w:spacing w:before="280" w:after="120"/>
       </w:pPr>
       <w:r>
         <w:rPr>
-          <w:rFonts w:ascii="Arial" w:hAnsi="Arial"/>
+          <w:rFonts w:ascii="Times New Roman" w:hAnsi="Times New Roman"/>
           <w:b/>
-          <w:color w:val="6E6E6E"/>
+          <w:color w:val="000000"/>
           <w:sz w:val="24"/>
         </w:rPr>
         <w:t>👥 Diagrama de Clases UML Simplificado (Backend)</w:t>
@@ -2093,107 +2329,80 @@
     </w:p>
     <w:p>
       <w:pPr>
-        <w:spacing w:before="120" w:after="120"/>
-        <w:ind w:left="720"/>
-        <w:pBdr>
-          <w:left w:val="single" w:sz="24" w:space="4" w:color="CCCCCC"/>
-        </w:pBdr>
-        <w:shd w:fill="F5F5F5"/>
+        <w:spacing w:before="240" w:after="80"/>
+        <w:jc w:val="center"/>
       </w:pPr>
       <w:r>
-        <w:rPr>
-          <w:rFonts w:ascii="Courier New" w:hAnsi="Courier New"/>
-          <w:color w:val="282828"/>
-          <w:sz w:val="19"/>
-        </w:rPr>
-        <w:t>classDiagram</w:t>
-        <w:br/>
-        <w:t xml:space="preserve">    class Jugador {</w:t>
-        <w:br/>
-        <w:t xml:space="preserve">        +int Id</w:t>
-        <w:br/>
-        <w:t xml:space="preserve">        +string Nombre</w:t>
-        <w:br/>
-        <w:t xml:space="preserve">        +int AnioNacimiento</w:t>
-        <w:br/>
-        <w:t xml:space="preserve">        +List~Partida~ Partidas</w:t>
-        <w:br/>
-        <w:t xml:space="preserve">    }</w:t>
-        <w:br/>
-        <w:t xml:space="preserve">    class Partida {</w:t>
-        <w:br/>
-        <w:t xml:space="preserve">        +int Id</w:t>
-        <w:br/>
-        <w:t xml:space="preserve">        +int JugadorId</w:t>
-        <w:br/>
-        <w:t xml:space="preserve">        +Jugador Jugador</w:t>
-        <w:br/>
-        <w:t xml:space="preserve">        +string Oponente</w:t>
-        <w:br/>
-        <w:t xml:space="preserve">        +string PGN</w:t>
-        <w:br/>
-        <w:t xml:space="preserve">        +List~Posicion~ Posiciones</w:t>
-        <w:br/>
-        <w:t xml:space="preserve">    }</w:t>
-        <w:br/>
-        <w:t xml:space="preserve">    class Posicion {</w:t>
-        <w:br/>
-        <w:t xml:space="preserve">        +int Id</w:t>
-        <w:br/>
-        <w:t xml:space="preserve">        +int PartidaId</w:t>
-        <w:br/>
-        <w:t xml:space="preserve">        +string FEN</w:t>
-        <w:br/>
-        <w:t xml:space="preserve">        +string MovimientoHistorico</w:t>
-        <w:br/>
-        <w:t xml:space="preserve">    }</w:t>
-        <w:br/>
-        <w:t xml:space="preserve">    class StockfishEngine {</w:t>
-        <w:br/>
-        <w:t xml:space="preserve">        +Task~bestMove~ AnalyzePosition(string fen, int depth)</w:t>
-        <w:br/>
-        <w:t xml:space="preserve">    }</w:t>
-        <w:br/>
-        <w:t xml:space="preserve">    class PartidaRepository {</w:t>
-        <w:br/>
-        <w:t xml:space="preserve">        -ChessLegacyContext _context</w:t>
-        <w:br/>
-        <w:t xml:space="preserve">        +Task~List~ GetPartidasConFiltros(filtros)</w:t>
-        <w:br/>
-        <w:t xml:space="preserve">        +Task~int~ CountAsync()</w:t>
-        <w:br/>
-        <w:t xml:space="preserve">    }</w:t>
-        <w:br/>
-        <w:t xml:space="preserve">    </w:t>
-        <w:br/>
-        <w:t xml:space="preserve">    Partida "1" *-- "many" Posicion</w:t>
-        <w:br/>
-        <w:t xml:space="preserve">    Jugador "1" *-- "many" Partida</w:t>
-        <w:br/>
-        <w:t xml:space="preserve">    PartidaRepository ..&gt; Partida : "persiste y consulta"</w:t>
-        <w:br/>
-        <w:t xml:space="preserve">    PartidaRepository ..&gt; Jugador : "incluye"</w:t>
+        <w:drawing>
+          <wp:inline xmlns:a="http://schemas.openxmlformats.org/drawingml/2006/main" xmlns:pic="http://schemas.openxmlformats.org/drawingml/2006/picture">
+            <wp:extent cx="5486400" cy="5749888"/>
+            <wp:docPr id="4" name="Picture 4"/>
+            <wp:cNvGraphicFramePr>
+              <a:graphicFrameLocks noChangeAspect="1"/>
+            </wp:cNvGraphicFramePr>
+            <a:graphic>
+              <a:graphicData uri="http://schemas.openxmlformats.org/drawingml/2006/picture">
+                <pic:pic>
+                  <pic:nvPicPr>
+                    <pic:cNvPr id="0" name="diagrama_4.png"/>
+                    <pic:cNvPicPr/>
+                  </pic:nvPicPr>
+                  <pic:blipFill>
+                    <a:blip r:embed="rId12"/>
+                    <a:stretch>
+                      <a:fillRect/>
+                    </a:stretch>
+                  </pic:blipFill>
+                  <pic:spPr>
+                    <a:xfrm>
+                      <a:off x="0" y="0"/>
+                      <a:ext cx="5486400" cy="5749888"/>
+                    </a:xfrm>
+                    <a:prstGeom prst="rect"/>
+                  </pic:spPr>
+                </pic:pic>
+              </a:graphicData>
+            </a:graphic>
+          </wp:inline>
+        </w:drawing>
       </w:r>
     </w:p>
     <w:p>
       <w:pPr>
+        <w:keepNext/>
+        <w:spacing w:after="240"/>
+        <w:jc w:val="center"/>
+      </w:pPr>
+      <w:r>
+        <w:rPr>
+          <w:rFonts w:ascii="Times New Roman" w:hAnsi="Times New Roman"/>
+          <w:i/>
+          <w:color w:val="505050"/>
+          <w:sz w:val="19"/>
+        </w:rPr>
+        <w:t>Figura 4.4. Diagrama de Clases UML Simplificado (Arquitectura del Backend).</w:t>
+      </w:r>
+    </w:p>
+    <w:p>
+      <w:pPr>
         <w:pStyle w:val="Heading2"/>
         <w:keepNext/>
-        <w:spacing w:before="280" w:after="120"/>
+        <w:spacing w:before="360" w:after="160"/>
       </w:pPr>
       <w:r>
         <w:rPr>
-          <w:rFonts w:ascii="Arial" w:hAnsi="Arial"/>
+          <w:rFonts w:ascii="Times New Roman" w:hAnsi="Times New Roman"/>
           <w:b/>
-          <w:color w:val="2980B9"/>
-          <w:sz w:val="30"/>
+          <w:color w:val="000000"/>
+          <w:sz w:val="28"/>
         </w:rPr>
         <w:t>4.4.- Dinámica del Sistema (Diagrama de Secuencia)</w:t>
       </w:r>
     </w:p>
     <w:p>
       <w:pPr>
-        <w:spacing w:after="120" w:line="276" w:lineRule="auto"/>
+        <w:spacing w:after="160" w:line="276" w:lineRule="auto"/>
+        <w:jc w:val="both"/>
       </w:pPr>
       <w:r>
         <w:t>El siguiente diagrama detalla la interacción del sistema cuando el usuario realiza un movimiento jugando contra un gran maestro histórico adaptativo:</w:t>
@@ -2201,82 +2410,80 @@
     </w:p>
     <w:p>
       <w:pPr>
-        <w:spacing w:before="120" w:after="120"/>
-        <w:ind w:left="720"/>
-        <w:pBdr>
-          <w:left w:val="single" w:sz="24" w:space="4" w:color="CCCCCC"/>
-        </w:pBdr>
-        <w:shd w:fill="F5F5F5"/>
+        <w:spacing w:before="240" w:after="80"/>
+        <w:jc w:val="center"/>
       </w:pPr>
       <w:r>
-        <w:rPr>
-          <w:rFonts w:ascii="Courier New" w:hAnsi="Courier New"/>
-          <w:color w:val="282828"/>
-          <w:sz w:val="19"/>
-        </w:rPr>
-        <w:t>sequenceDiagram</w:t>
-        <w:br/>
-        <w:t xml:space="preserve">    autonumber</w:t>
-        <w:br/>
-        <w:t xml:space="preserve">    actor Jugador as Jugador (UI)</w:t>
-        <w:br/>
-        <w:t xml:space="preserve">    participant Front as react-chessboard (Vite)</w:t>
-        <w:br/>
-        <w:t xml:space="preserve">    participant Back as API Controller (C#)</w:t>
-        <w:br/>
-        <w:t xml:space="preserve">    participant Rep as PartidaRepository</w:t>
-        <w:br/>
-        <w:t xml:space="preserve">    participant Stock as StockfishEngine</w:t>
-        <w:br/>
-        <w:t xml:space="preserve">    database DB as SQLite (chesslegacy.db)</w:t>
-        <w:br/>
-        <w:br/>
-        <w:t xml:space="preserve">    Jugador-&gt;&gt;Front: Arrastra y suelta pieza</w:t>
-        <w:br/>
-        <w:t xml:space="preserve">    Note over Front: Valida movimiento localmente con chess.js</w:t>
-        <w:br/>
-        <w:t xml:space="preserve">    Front-&gt;&gt;Back: POST /api/analisis/evaluar (FEN actual)</w:t>
-        <w:br/>
-        <w:t xml:space="preserve">    Back-&gt;&gt;Rep: GetJugadorPersonalidad(jugadorId)</w:t>
-        <w:br/>
-        <w:t xml:space="preserve">    Rep-&gt;&gt;DB: Query pesos de estilo (ej. Sacrificio=0.9)</w:t>
-        <w:br/>
-        <w:t xml:space="preserve">    DB--&gt;&gt;Rep: Retorna Pesos</w:t>
-        <w:br/>
-        <w:t xml:space="preserve">    Rep--&gt;&gt;Back: Devuelve Personalidad</w:t>
-        <w:br/>
-        <w:t xml:space="preserve">    Back-&gt;&gt;Stock: Solicita análisis posicional (UCI)</w:t>
-        <w:br/>
-        <w:t xml:space="preserve">    Note over Stock: Stockfish procesa la posición FEN nativamente</w:t>
-        <w:br/>
-        <w:t xml:space="preserve">    Stock--&gt;&gt;Back: Devuelve mejores movimientos y evaluación</w:t>
-        <w:br/>
-        <w:t xml:space="preserve">    Note over Back: Aplica algoritmo heurístico adaptando movimientos según la personalidad del Maestro</w:t>
-        <w:br/>
-        <w:t xml:space="preserve">    Back--&gt;&gt;Front: Retorna mejor movimiento de respuesta (SAN) y evaluación</w:t>
-        <w:br/>
-        <w:t xml:space="preserve">    Front-&gt;&gt;Jugador: Renderiza movimiento del Maestro y actualiza barra evaluación</w:t>
+        <w:drawing>
+          <wp:inline xmlns:a="http://schemas.openxmlformats.org/drawingml/2006/main" xmlns:pic="http://schemas.openxmlformats.org/drawingml/2006/picture">
+            <wp:extent cx="5486400" cy="2189950"/>
+            <wp:docPr id="5" name="Picture 5"/>
+            <wp:cNvGraphicFramePr>
+              <a:graphicFrameLocks noChangeAspect="1"/>
+            </wp:cNvGraphicFramePr>
+            <a:graphic>
+              <a:graphicData uri="http://schemas.openxmlformats.org/drawingml/2006/picture">
+                <pic:pic>
+                  <pic:nvPicPr>
+                    <pic:cNvPr id="0" name="diagrama_5.png"/>
+                    <pic:cNvPicPr/>
+                  </pic:nvPicPr>
+                  <pic:blipFill>
+                    <a:blip r:embed="rId13"/>
+                    <a:stretch>
+                      <a:fillRect/>
+                    </a:stretch>
+                  </pic:blipFill>
+                  <pic:spPr>
+                    <a:xfrm>
+                      <a:off x="0" y="0"/>
+                      <a:ext cx="5486400" cy="2189950"/>
+                    </a:xfrm>
+                    <a:prstGeom prst="rect"/>
+                  </pic:spPr>
+                </pic:pic>
+              </a:graphicData>
+            </a:graphic>
+          </wp:inline>
+        </w:drawing>
       </w:r>
     </w:p>
     <w:p>
       <w:pPr>
+        <w:keepNext/>
+        <w:spacing w:after="240"/>
+        <w:jc w:val="center"/>
+      </w:pPr>
+      <w:r>
+        <w:rPr>
+          <w:rFonts w:ascii="Times New Roman" w:hAnsi="Times New Roman"/>
+          <w:i/>
+          <w:color w:val="505050"/>
+          <w:sz w:val="19"/>
+        </w:rPr>
+        <w:t>Figura 4.5. Flujo interactivo de juego y analisis posicional (Diagrama de Secuencia UML).</w:t>
+      </w:r>
+    </w:p>
+    <w:p>
+      <w:pPr>
         <w:pStyle w:val="Heading2"/>
         <w:keepNext/>
-        <w:spacing w:before="280" w:after="120"/>
+        <w:spacing w:before="360" w:after="160"/>
       </w:pPr>
       <w:r>
         <w:rPr>
-          <w:rFonts w:ascii="Arial" w:hAnsi="Arial"/>
+          <w:rFonts w:ascii="Times New Roman" w:hAnsi="Times New Roman"/>
           <w:b/>
-          <w:color w:val="2980B9"/>
-          <w:sz w:val="30"/>
+          <w:color w:val="000000"/>
+          <w:sz w:val="28"/>
         </w:rPr>
         <w:t>4.5.- Resultados e Implementación</w:t>
       </w:r>
     </w:p>
     <w:p>
       <w:pPr>
-        <w:spacing w:after="120" w:line="276" w:lineRule="auto"/>
+        <w:spacing w:after="160" w:line="276" w:lineRule="auto"/>
+        <w:jc w:val="both"/>
       </w:pPr>
       <w:r>
         <w:t>El desarrollo culminó con éxito en una plataforma web totalmente interactiva.</w:t>
@@ -2285,12 +2492,9 @@
     <w:p>
       <w:pPr>
         <w:pStyle w:val="ListBullet"/>
-        <w:spacing w:after="60"/>
+        <w:spacing w:after="80"/>
         <w:ind w:left="360"/>
       </w:pPr>
-      <w:r>
-        <w:t xml:space="preserve">  </w:t>
-      </w:r>
       <w:r>
         <w:rPr>
           <w:b/>
@@ -2322,12 +2526,9 @@
     <w:p>
       <w:pPr>
         <w:pStyle w:val="ListBullet"/>
-        <w:spacing w:after="60"/>
+        <w:spacing w:after="80"/>
         <w:ind w:left="360"/>
       </w:pPr>
-      <w:r>
-        <w:t xml:space="preserve">  </w:t>
-      </w:r>
       <w:r>
         <w:rPr>
           <w:b/>
@@ -2341,12 +2542,9 @@
     <w:p>
       <w:pPr>
         <w:pStyle w:val="ListBullet"/>
-        <w:spacing w:after="60"/>
+        <w:spacing w:after="80"/>
         <w:ind w:left="360"/>
       </w:pPr>
-      <w:r>
-        <w:t xml:space="preserve">  </w:t>
-      </w:r>
       <w:r>
         <w:rPr>
           <w:b/>
@@ -2359,7 +2557,7 @@
       <w:r>
         <w:rPr>
           <w:rFonts w:ascii="Courier New" w:hAnsi="Courier New"/>
-          <w:color w:val="C7254E"/>
+          <w:color w:val="000000"/>
           <w:sz w:val="20"/>
         </w:rPr>
         <w:t>←</w:t>
@@ -2370,7 +2568,7 @@
       <w:r>
         <w:rPr>
           <w:rFonts w:ascii="Courier New" w:hAnsi="Courier New"/>
-          <w:color w:val="C7254E"/>
+          <w:color w:val="000000"/>
           <w:sz w:val="20"/>
         </w:rPr>
         <w:t>→</w:t>
@@ -2382,12 +2580,9 @@
     <w:p>
       <w:pPr>
         <w:pStyle w:val="ListBullet"/>
-        <w:spacing w:after="60"/>
+        <w:spacing w:after="80"/>
         <w:ind w:left="360"/>
       </w:pPr>
-      <w:r>
-        <w:t xml:space="preserve">  </w:t>
-      </w:r>
       <w:r>
         <w:rPr>
           <w:b/>
@@ -2400,7 +2595,7 @@
       <w:r>
         <w:rPr>
           <w:rFonts w:ascii="Courier New" w:hAnsi="Courier New"/>
-          <w:color w:val="C7254E"/>
+          <w:color w:val="000000"/>
           <w:sz w:val="20"/>
         </w:rPr>
         <w:t>docker compose up --build</w:t>
@@ -2418,14 +2613,14 @@
       <w:pPr>
         <w:pStyle w:val="Heading1"/>
         <w:keepNext/>
-        <w:spacing w:before="360" w:after="160"/>
+        <w:spacing w:before="480" w:after="240"/>
       </w:pPr>
       <w:r>
         <w:rPr>
-          <w:rFonts w:ascii="Arial" w:hAnsi="Arial"/>
+          <w:rFonts w:ascii="Times New Roman" w:hAnsi="Times New Roman"/>
           <w:b/>
-          <w:color w:val="1A5276"/>
-          <w:sz w:val="40"/>
+          <w:color w:val="000000"/>
+          <w:sz w:val="36"/>
         </w:rPr>
         <w:t>Capítulo 5: Conclusiones y Trabajo Futuro</w:t>
       </w:r>
@@ -2434,21 +2629,22 @@
       <w:pPr>
         <w:pStyle w:val="Heading2"/>
         <w:keepNext/>
-        <w:spacing w:before="280" w:after="120"/>
+        <w:spacing w:before="360" w:after="160"/>
       </w:pPr>
       <w:r>
         <w:rPr>
-          <w:rFonts w:ascii="Arial" w:hAnsi="Arial"/>
+          <w:rFonts w:ascii="Times New Roman" w:hAnsi="Times New Roman"/>
           <w:b/>
-          <w:color w:val="2980B9"/>
-          <w:sz w:val="30"/>
+          <w:color w:val="000000"/>
+          <w:sz w:val="28"/>
         </w:rPr>
         <w:t>5.1.- Conclusiones</w:t>
       </w:r>
     </w:p>
     <w:p>
       <w:pPr>
-        <w:spacing w:after="120" w:line="276" w:lineRule="auto"/>
+        <w:spacing w:after="160" w:line="276" w:lineRule="auto"/>
+        <w:jc w:val="both"/>
       </w:pPr>
       <w:r>
         <w:t xml:space="preserve">El proyecto </w:t>
@@ -2466,7 +2662,7 @@
     <w:p>
       <w:pPr>
         <w:pStyle w:val="ListNumber"/>
-        <w:spacing w:after="60"/>
+        <w:spacing w:after="80"/>
       </w:pPr>
       <w:r>
         <w:t>Se ha implementado una solución de ajedrez local totalmente gratuita con excelentes prestaciones interactivas de aprendizaje.</w:t>
@@ -2475,7 +2671,7 @@
     <w:p>
       <w:pPr>
         <w:pStyle w:val="ListNumber"/>
-        <w:spacing w:after="60"/>
+        <w:spacing w:after="80"/>
       </w:pPr>
       <w:r>
         <w:t>La arquitectura de software desacoplada en capas (React + C# RESTful API) permite que cada componente sea modular, mantenible y escalable.</w:t>
@@ -2484,7 +2680,7 @@
     <w:p>
       <w:pPr>
         <w:pStyle w:val="ListNumber"/>
-        <w:spacing w:after="60"/>
+        <w:spacing w:after="80"/>
       </w:pPr>
       <w:r>
         <w:t>La contenedorización mediante Docker e integración nativa de Stockfish para Linux resuelve de raíz la portabilidad de sistemas de ajedrez complejos.</w:t>
@@ -2493,7 +2689,7 @@
     <w:p>
       <w:pPr>
         <w:pStyle w:val="ListNumber"/>
-        <w:spacing w:after="60"/>
+        <w:spacing w:after="80"/>
       </w:pPr>
       <w:r>
         <w:t>La base de datos relacional ligera SQLite de ~24 MB almacena de manera robusta y rápida más de 40,000 partidas y la ludificación de XP de los estudiantes.</w:t>
@@ -2503,21 +2699,22 @@
       <w:pPr>
         <w:pStyle w:val="Heading2"/>
         <w:keepNext/>
-        <w:spacing w:before="280" w:after="120"/>
+        <w:spacing w:before="360" w:after="160"/>
       </w:pPr>
       <w:r>
         <w:rPr>
-          <w:rFonts w:ascii="Arial" w:hAnsi="Arial"/>
+          <w:rFonts w:ascii="Times New Roman" w:hAnsi="Times New Roman"/>
           <w:b/>
-          <w:color w:val="2980B9"/>
-          <w:sz w:val="30"/>
+          <w:color w:val="000000"/>
+          <w:sz w:val="28"/>
         </w:rPr>
         <w:t>5.2.- Posibles Desarrollos Futuros</w:t>
       </w:r>
     </w:p>
     <w:p>
       <w:pPr>
-        <w:spacing w:after="120" w:line="276" w:lineRule="auto"/>
+        <w:spacing w:after="160" w:line="276" w:lineRule="auto"/>
+        <w:jc w:val="both"/>
       </w:pPr>
       <w:r>
         <w:t>Como líneas de desarrollo futuro de la plataforma de ajedrez para la asignatura, se proponen:</w:t>
@@ -2526,7 +2723,7 @@
     <w:p>
       <w:pPr>
         <w:pStyle w:val="ListNumber"/>
-        <w:spacing w:after="60"/>
+        <w:spacing w:after="80"/>
       </w:pPr>
       <w:r>
         <w:rPr>
@@ -2541,7 +2738,7 @@
     <w:p>
       <w:pPr>
         <w:pStyle w:val="ListNumber"/>
-        <w:spacing w:after="60"/>
+        <w:spacing w:after="80"/>
       </w:pPr>
       <w:r>
         <w:rPr>
@@ -2556,7 +2753,7 @@
     <w:p>
       <w:pPr>
         <w:pStyle w:val="ListNumber"/>
-        <w:spacing w:after="60"/>
+        <w:spacing w:after="80"/>
       </w:pPr>
       <w:r>
         <w:rPr>
@@ -2577,14 +2774,14 @@
       <w:pPr>
         <w:pStyle w:val="Heading1"/>
         <w:keepNext/>
-        <w:spacing w:before="360" w:after="160"/>
+        <w:spacing w:before="480" w:after="240"/>
       </w:pPr>
       <w:r>
         <w:rPr>
-          <w:rFonts w:ascii="Arial" w:hAnsi="Arial"/>
+          <w:rFonts w:ascii="Times New Roman" w:hAnsi="Times New Roman"/>
           <w:b/>
-          <w:color w:val="1A5276"/>
-          <w:sz w:val="40"/>
+          <w:color w:val="000000"/>
+          <w:sz w:val="36"/>
         </w:rPr>
         <w:t>Capítulo 6: Bibliografía</w:t>
       </w:r>
@@ -2592,265 +2789,229 @@
     <w:p>
       <w:pPr>
         <w:pStyle w:val="ListBullet"/>
-        <w:spacing w:after="60"/>
+        <w:spacing w:after="80"/>
         <w:ind w:left="360"/>
       </w:pPr>
-      <w:r>
-        <w:t xml:space="preserve">  </w:t>
-      </w:r>
       <w:r>
         <w:rPr>
           <w:b/>
         </w:rPr>
         <w:t>[1] Documentación Oficial de React 18</w:t>
       </w:r>
+    </w:p>
+    <w:p>
+      <w:pPr>
+        <w:pStyle w:val="ListBullet"/>
+        <w:spacing w:after="80"/>
+        <w:ind w:left="1080"/>
+      </w:pPr>
       <w:r>
-        <w:t xml:space="preserve">  </w:t>
+        <w:t>URL: [https://react.dev](https://react.dev)</w:t>
       </w:r>
     </w:p>
     <w:p>
       <w:pPr>
         <w:pStyle w:val="ListBullet"/>
-        <w:spacing w:after="60"/>
+        <w:spacing w:after="80"/>
         <w:ind w:left="1080"/>
       </w:pPr>
       <w:r>
-        <w:t xml:space="preserve">  URL: [https://react.dev](https://react.dev)  </w:t>
+        <w:t>Fecha de consulta: Mayo, 2026.</w:t>
       </w:r>
     </w:p>
     <w:p>
       <w:pPr>
         <w:pStyle w:val="ListBullet"/>
-        <w:spacing w:after="60"/>
-        <w:ind w:left="1080"/>
-      </w:pPr>
-      <w:r>
-        <w:t xml:space="preserve">  Fecha de consulta: Mayo, 2026.</w:t>
-      </w:r>
-    </w:p>
-    <w:p>
-      <w:pPr>
-        <w:pStyle w:val="ListBullet"/>
-        <w:spacing w:after="60"/>
+        <w:spacing w:after="80"/>
         <w:ind w:left="360"/>
       </w:pPr>
-      <w:r>
-        <w:t xml:space="preserve">  </w:t>
-      </w:r>
       <w:r>
         <w:rPr>
           <w:b/>
         </w:rPr>
         <w:t>[2] Guía oficial de ASP.NET Core 10.0</w:t>
       </w:r>
+    </w:p>
+    <w:p>
+      <w:pPr>
+        <w:pStyle w:val="ListBullet"/>
+        <w:spacing w:after="80"/>
+        <w:ind w:left="1080"/>
+      </w:pPr>
       <w:r>
-        <w:t xml:space="preserve">  </w:t>
+        <w:t>Autor: Microsoft Corporation</w:t>
       </w:r>
     </w:p>
     <w:p>
       <w:pPr>
         <w:pStyle w:val="ListBullet"/>
-        <w:spacing w:after="60"/>
+        <w:spacing w:after="80"/>
         <w:ind w:left="1080"/>
       </w:pPr>
       <w:r>
-        <w:t xml:space="preserve">  Autor: Microsoft Corporation  </w:t>
+        <w:t>URL: [https://learn.microsoft.com/aspnet/core](https://learn.microsoft.com/aspnet/core)</w:t>
       </w:r>
     </w:p>
     <w:p>
       <w:pPr>
         <w:pStyle w:val="ListBullet"/>
-        <w:spacing w:after="60"/>
+        <w:spacing w:after="80"/>
         <w:ind w:left="1080"/>
       </w:pPr>
       <w:r>
-        <w:t xml:space="preserve">  URL: [https://learn.microsoft.com/aspnet/core](https://learn.microsoft.com/aspnet/core)  </w:t>
+        <w:t>Año de edición: 2026.</w:t>
       </w:r>
     </w:p>
     <w:p>
       <w:pPr>
         <w:pStyle w:val="ListBullet"/>
-        <w:spacing w:after="60"/>
-        <w:ind w:left="1080"/>
-      </w:pPr>
-      <w:r>
-        <w:t xml:space="preserve">  Año de edición: 2026.</w:t>
-      </w:r>
-    </w:p>
-    <w:p>
-      <w:pPr>
-        <w:pStyle w:val="ListBullet"/>
-        <w:spacing w:after="60"/>
+        <w:spacing w:after="80"/>
         <w:ind w:left="360"/>
       </w:pPr>
-      <w:r>
-        <w:t xml:space="preserve">  </w:t>
-      </w:r>
       <w:r>
         <w:rPr>
           <w:b/>
         </w:rPr>
         <w:t>[3] Entity Framework Core: Código Primero (Code-First) y Migraciones</w:t>
       </w:r>
+    </w:p>
+    <w:p>
+      <w:pPr>
+        <w:pStyle w:val="ListBullet"/>
+        <w:spacing w:after="80"/>
+        <w:ind w:left="1080"/>
+      </w:pPr>
       <w:r>
-        <w:t xml:space="preserve">  </w:t>
+        <w:t>Autor: Microsoft Corporation</w:t>
       </w:r>
     </w:p>
     <w:p>
       <w:pPr>
         <w:pStyle w:val="ListBullet"/>
-        <w:spacing w:after="60"/>
+        <w:spacing w:after="80"/>
         <w:ind w:left="1080"/>
       </w:pPr>
       <w:r>
-        <w:t xml:space="preserve">  Autor: Microsoft Corporation  </w:t>
+        <w:t>URL: [https://learn.microsoft.com/ef/core](https://learn.microsoft.com/ef/core)</w:t>
       </w:r>
     </w:p>
     <w:p>
       <w:pPr>
         <w:pStyle w:val="ListBullet"/>
-        <w:spacing w:after="60"/>
+        <w:spacing w:after="80"/>
         <w:ind w:left="1080"/>
       </w:pPr>
       <w:r>
-        <w:t xml:space="preserve">  URL: [https://learn.microsoft.com/ef/core](https://learn.microsoft.com/ef/core)  </w:t>
+        <w:t>Fecha de consulta: Mayo, 2026.</w:t>
       </w:r>
     </w:p>
     <w:p>
       <w:pPr>
         <w:pStyle w:val="ListBullet"/>
-        <w:spacing w:after="60"/>
-        <w:ind w:left="1080"/>
-      </w:pPr>
-      <w:r>
-        <w:t xml:space="preserve">  Fecha de consulta: Mayo, 2026.</w:t>
-      </w:r>
-    </w:p>
-    <w:p>
-      <w:pPr>
-        <w:pStyle w:val="ListBullet"/>
-        <w:spacing w:after="60"/>
+        <w:spacing w:after="80"/>
         <w:ind w:left="360"/>
       </w:pPr>
-      <w:r>
-        <w:t xml:space="preserve">  </w:t>
-      </w:r>
       <w:r>
         <w:rPr>
           <w:b/>
         </w:rPr>
         <w:t>[4] Stockfish: Ecosistema y Protocolo UCI Abierto</w:t>
       </w:r>
+    </w:p>
+    <w:p>
+      <w:pPr>
+        <w:pStyle w:val="ListBullet"/>
+        <w:spacing w:after="80"/>
+        <w:ind w:left="1080"/>
+      </w:pPr>
       <w:r>
-        <w:t xml:space="preserve">  </w:t>
+        <w:t>URL: [https://stockfishchess.org/download/](https://stockfishchess.org/download/)</w:t>
       </w:r>
     </w:p>
     <w:p>
       <w:pPr>
         <w:pStyle w:val="ListBullet"/>
-        <w:spacing w:after="60"/>
+        <w:spacing w:after="80"/>
         <w:ind w:left="1080"/>
       </w:pPr>
       <w:r>
-        <w:t xml:space="preserve">  URL: [https://stockfishchess.org/download/](https://stockfishchess.org/download/)  </w:t>
+        <w:t>Fecha de consulta: Mayo, 2026.</w:t>
       </w:r>
     </w:p>
     <w:p>
       <w:pPr>
         <w:pStyle w:val="ListBullet"/>
-        <w:spacing w:after="60"/>
-        <w:ind w:left="1080"/>
-      </w:pPr>
-      <w:r>
-        <w:t xml:space="preserve">  Fecha de consulta: Mayo, 2026.</w:t>
-      </w:r>
-    </w:p>
-    <w:p>
-      <w:pPr>
-        <w:pStyle w:val="ListBullet"/>
-        <w:spacing w:after="60"/>
+        <w:spacing w:after="80"/>
         <w:ind w:left="360"/>
       </w:pPr>
-      <w:r>
-        <w:t xml:space="preserve">  </w:t>
-      </w:r>
       <w:r>
         <w:rPr>
           <w:b/>
         </w:rPr>
         <w:t>[5] react-chessboard y chess.js: Motores interactivos para React</w:t>
       </w:r>
+    </w:p>
+    <w:p>
+      <w:pPr>
+        <w:pStyle w:val="ListBullet"/>
+        <w:spacing w:after="80"/>
+        <w:ind w:left="1080"/>
+      </w:pPr>
       <w:r>
-        <w:t xml:space="preserve">  </w:t>
+        <w:t>URL: [https://github.com/jhlywa/chess.js](https://github.com/jhlywa/chess.js)</w:t>
       </w:r>
     </w:p>
     <w:p>
       <w:pPr>
         <w:pStyle w:val="ListBullet"/>
-        <w:spacing w:after="60"/>
+        <w:spacing w:after="80"/>
         <w:ind w:left="1080"/>
       </w:pPr>
       <w:r>
-        <w:t xml:space="preserve">  URL: [https://github.com/jhlywa/chess.js](https://github.com/jhlywa/chess.js)  </w:t>
+        <w:t>Fecha de consulta: Mayo, 2026.</w:t>
       </w:r>
     </w:p>
     <w:p>
       <w:pPr>
         <w:pStyle w:val="ListBullet"/>
-        <w:spacing w:after="60"/>
-        <w:ind w:left="1080"/>
-      </w:pPr>
-      <w:r>
-        <w:t xml:space="preserve">  Fecha de consulta: Mayo, 2026.</w:t>
-      </w:r>
-    </w:p>
-    <w:p>
-      <w:pPr>
-        <w:pStyle w:val="ListBullet"/>
-        <w:spacing w:after="60"/>
+        <w:spacing w:after="80"/>
         <w:ind w:left="360"/>
       </w:pPr>
-      <w:r>
-        <w:t xml:space="preserve">  </w:t>
-      </w:r>
       <w:r>
         <w:rPr>
           <w:b/>
         </w:rPr>
         <w:t>[6] Orquestación de aplicaciones multi-contenedor con Docker Compose</w:t>
       </w:r>
+    </w:p>
+    <w:p>
+      <w:pPr>
+        <w:pStyle w:val="ListBullet"/>
+        <w:spacing w:after="80"/>
+        <w:ind w:left="1080"/>
+      </w:pPr>
       <w:r>
-        <w:t xml:space="preserve">  </w:t>
+        <w:t>Autor: Docker Inc.</w:t>
       </w:r>
     </w:p>
     <w:p>
       <w:pPr>
         <w:pStyle w:val="ListBullet"/>
-        <w:spacing w:after="60"/>
+        <w:spacing w:after="80"/>
         <w:ind w:left="1080"/>
       </w:pPr>
       <w:r>
-        <w:t xml:space="preserve">  Autor: Docker Inc.  </w:t>
+        <w:t>URL: [https://docs.docker.com/compose/](https://docs.docker.com/compose/)</w:t>
       </w:r>
     </w:p>
     <w:p>
       <w:pPr>
         <w:pStyle w:val="ListBullet"/>
-        <w:spacing w:after="60"/>
+        <w:spacing w:after="80"/>
         <w:ind w:left="1080"/>
       </w:pPr>
       <w:r>
-        <w:t xml:space="preserve">  URL: [https://docs.docker.com/compose/](https://docs.docker.com/compose/)  </w:t>
-      </w:r>
-    </w:p>
-    <w:p>
-      <w:pPr>
-        <w:pStyle w:val="ListBullet"/>
-        <w:spacing w:after="60"/>
-        <w:ind w:left="1080"/>
-      </w:pPr>
-      <w:r>
-        <w:t xml:space="preserve">  Fecha de consulta: Mayo, 2026.</w:t>
+        <w:t>Fecha de consulta: Mayo, 2026.</w:t>
       </w:r>
     </w:p>
     <w:sectPr>
@@ -3227,8 +3388,8 @@
     <w:qFormat/>
     <w:rsid w:val="00FC693F"/>
     <w:rPr>
-      <w:rFonts w:ascii="Arial" w:hAnsi="Arial"/>
-      <w:color w:val="212529"/>
+      <w:rFonts w:ascii="Times New Roman" w:hAnsi="Times New Roman"/>
+      <w:color w:val="000000"/>
       <w:sz w:val="22"/>
     </w:rPr>
   </w:style>

</xml_diff>

<commit_message>
docs: expand technical catalog to 42 modules and 7 axes in MD and DOCX
</commit_message>
<xml_diff>
--- a/T5 - Proyecto-20260527/DOCUMENTACION_COMPLETA.docx
+++ b/T5 - Proyecto-20260527/DOCUMENTACION_COMPLETA.docx
@@ -209,10 +209,40 @@
       <w:pPr>
         <w:pStyle w:val="ListBullet"/>
         <w:spacing w:after="80"/>
-        <w:ind w:left="360"/>
-      </w:pPr>
-      <w:r>
-        <w:t>[Capítulo 2: Antecedentes y Estado de la Cuestión](#capítulo-2-antecedentes-y-estado-de-la-cuestión)</w:t>
+        <w:ind w:left="1080"/>
+      </w:pPr>
+      <w:r>
+        <w:t>[1.1.- Entorno de Aplicación](#11--entorno-de-aplicación)</w:t>
+      </w:r>
+    </w:p>
+    <w:p>
+      <w:pPr>
+        <w:pStyle w:val="ListBullet"/>
+        <w:spacing w:after="80"/>
+        <w:ind w:left="1080"/>
+      </w:pPr>
+      <w:r>
+        <w:t>[1.2.- Justificación del Proyecto](#12--justificación-del-proyecto)</w:t>
+      </w:r>
+    </w:p>
+    <w:p>
+      <w:pPr>
+        <w:pStyle w:val="ListBullet"/>
+        <w:spacing w:after="80"/>
+        <w:ind w:left="1080"/>
+      </w:pPr>
+      <w:r>
+        <w:t>[1.3.- Objetivos y Alcance Funcional](#13--objetivos-y-alcance-funcional)</w:t>
+      </w:r>
+    </w:p>
+    <w:p>
+      <w:pPr>
+        <w:pStyle w:val="ListBullet"/>
+        <w:spacing w:after="80"/>
+        <w:ind w:left="1080"/>
+      </w:pPr>
+      <w:r>
+        <w:t>[1.4.- Límites del Proyecto](#14--límites-del-proyecto)</w:t>
       </w:r>
     </w:p>
     <w:p>
@@ -222,7 +252,37 @@
         <w:ind w:left="360"/>
       </w:pPr>
       <w:r>
-        <w:t>[Capítulo 3: Hipótesis de Trabajo y Tecnologías](#capítulo-3-hipótesis-de-trabajo-y-tecnologías)</w:t>
+        <w:t>[Capítulo 2: Antecedentes y Estado de la Cuestión](#capítulo-2-antecedentes-y-estado-de-la-cuestión)</w:t>
+      </w:r>
+    </w:p>
+    <w:p>
+      <w:pPr>
+        <w:pStyle w:val="ListBullet"/>
+        <w:spacing w:after="80"/>
+        <w:ind w:left="1080"/>
+      </w:pPr>
+      <w:r>
+        <w:t>[2.1.- Situación Actual](#21--situación-actual)</w:t>
+      </w:r>
+    </w:p>
+    <w:p>
+      <w:pPr>
+        <w:pStyle w:val="ListBullet"/>
+        <w:spacing w:after="80"/>
+        <w:ind w:left="1080"/>
+      </w:pPr>
+      <w:r>
+        <w:t>[2.2.- Herramientas Disponibles en el Mercado](#22--herramientas-disponibles-en-el-mercado)</w:t>
+      </w:r>
+    </w:p>
+    <w:p>
+      <w:pPr>
+        <w:pStyle w:val="ListBullet"/>
+        <w:spacing w:after="80"/>
+        <w:ind w:left="1080"/>
+      </w:pPr>
+      <w:r>
+        <w:t>[2.3.- Valoración](#23--valoración)</w:t>
       </w:r>
     </w:p>
     <w:p>
@@ -232,7 +292,7 @@
         <w:ind w:left="360"/>
       </w:pPr>
       <w:r>
-        <w:t>[Capítulo 4: Metodología, Diseño y Resultados](#capítulo-4-metodología-diseño-y-resultados)</w:t>
+        <w:t>[Capítulo 3: Hipótesis de Trabajo y Tecnologías](#capítulo-3-hipótesis-de-trabajo-y-tecnologías)</w:t>
       </w:r>
     </w:p>
     <w:p>
@@ -242,7 +302,7 @@
         <w:ind w:left="1080"/>
       </w:pPr>
       <w:r>
-        <w:t>[4.1 Planificación Temporal (Gantt)](#41-planificación-temporal-gantt)</w:t>
+        <w:t>[3.1.- Stack Tecnológico Seleccionado](#31--stack-tecnológico-seleccionado)</w:t>
       </w:r>
     </w:p>
     <w:p>
@@ -252,7 +312,17 @@
         <w:ind w:left="1080"/>
       </w:pPr>
       <w:r>
-        <w:t>[4.2 Captura de Requisitos (Casos de Uso)](#42-captura-de-requisitos-casos-de-uso)</w:t>
+        <w:t>[3.2.- Metodología de Desarrollo y Patrones](#32--metodología-de-desarrollo-y-patrones)</w:t>
+      </w:r>
+    </w:p>
+    <w:p>
+      <w:pPr>
+        <w:pStyle w:val="ListBullet"/>
+        <w:spacing w:after="80"/>
+        <w:ind w:left="360"/>
+      </w:pPr>
+      <w:r>
+        <w:t>[Capítulo 4: Metodología, Diseño y Resultados](#capítulo-4-metodología-diseño-y-resultados)</w:t>
       </w:r>
     </w:p>
     <w:p>
@@ -262,7 +332,7 @@
         <w:ind w:left="1080"/>
       </w:pPr>
       <w:r>
-        <w:t>[4.3 Diseño Arquitectónico y Base de Datos (E/R y UML)](#43-diseño-arquitectónico-y-base-de-datos-er-y-uml)</w:t>
+        <w:t>[4.1.- Planificación Temporal (Gantt)](#41--planificación-temporal-gantt)</w:t>
       </w:r>
     </w:p>
     <w:p>
@@ -272,7 +342,7 @@
         <w:ind w:left="1080"/>
       </w:pPr>
       <w:r>
-        <w:t>[4.4 Dinámica del Sistema (Diagrama de Secuencia)](#44-dinámica-del-sistema-diagrama-de-secuencia)</w:t>
+        <w:t>[4.2.- Captura de Requisitos (Casos de Uso)](#42--captura-de-requisitos-casos-de-uso)</w:t>
       </w:r>
     </w:p>
     <w:p>
@@ -282,7 +352,27 @@
         <w:ind w:left="1080"/>
       </w:pPr>
       <w:r>
-        <w:t>[4.5 Resultados e Implementación](#45-resultados-e-implementación)</w:t>
+        <w:t>[4.3.- Diseño Arquitectónico y Base de Datos (E/R y UML)](#43-diseño-arquitectónico-y-base-de-datos-er-y-uml)</w:t>
+      </w:r>
+    </w:p>
+    <w:p>
+      <w:pPr>
+        <w:pStyle w:val="ListBullet"/>
+        <w:spacing w:after="80"/>
+        <w:ind w:left="1080"/>
+      </w:pPr>
+      <w:r>
+        <w:t>[4.4.- Dinámica del Sistema (Diagrama de Secuencia)](#44--dinámica-del-sistema-diagrama-de-secuencia)</w:t>
+      </w:r>
+    </w:p>
+    <w:p>
+      <w:pPr>
+        <w:pStyle w:val="ListBullet"/>
+        <w:spacing w:after="80"/>
+        <w:ind w:left="1080"/>
+      </w:pPr>
+      <w:r>
+        <w:t>[4.5.- Resultados y Catálogo Detallado de Módulos Funcionales](#45--resultados-y-catálogo-detallado-de-módulos-funcionales)</w:t>
       </w:r>
     </w:p>
     <w:p>
@@ -398,7 +488,7 @@
           <w:color w:val="000000"/>
           <w:sz w:val="28"/>
         </w:rPr>
-        <w:t>1.3.- Objetivos del Proyecto</w:t>
+        <w:t>1.3.- Objetivos y Alcance Funcional</w:t>
       </w:r>
     </w:p>
     <w:p>
@@ -505,6 +595,136 @@
     </w:p>
     <w:p>
       <w:pPr>
+        <w:pStyle w:val="Heading3"/>
+        <w:keepNext/>
+        <w:spacing w:before="280" w:after="120"/>
+      </w:pPr>
+      <w:r>
+        <w:rPr>
+          <w:rFonts w:ascii="Times New Roman" w:hAnsi="Times New Roman"/>
+          <w:b/>
+          <w:color w:val="000000"/>
+          <w:sz w:val="24"/>
+        </w:rPr>
+        <w:t>Alcance Funcional Detallado</w:t>
+      </w:r>
+    </w:p>
+    <w:p>
+      <w:pPr>
+        <w:spacing w:after="160" w:line="276" w:lineRule="auto"/>
+        <w:jc w:val="both"/>
+      </w:pPr>
+      <w:r>
+        <w:t>Para cubrir integralmente las necesidades de entrenamiento de un ajedrecista, desde niveles de iniciación hasta maestría, el sistema integra 42 módulos y modos de juego agrupados en los siguientes 7 ejes funcionales:</w:t>
+      </w:r>
+    </w:p>
+    <w:p>
+      <w:pPr>
+        <w:pStyle w:val="ListNumber"/>
+        <w:spacing w:after="80"/>
+      </w:pPr>
+      <w:r>
+        <w:rPr>
+          <w:b/>
+        </w:rPr>
+        <w:t>Juego contra la Historia y Personalización Adaptativa:</w:t>
+      </w:r>
+      <w:r>
+        <w:t xml:space="preserve"> Enfrentamiento contra 20 grandes maestros con personalidades heurísticas, perfiles biográficos interactivos, comparadores multivariable y entrenamiento de estilo personal.</w:t>
+      </w:r>
+    </w:p>
+    <w:p>
+      <w:pPr>
+        <w:pStyle w:val="ListNumber"/>
+        <w:spacing w:after="80"/>
+      </w:pPr>
+      <w:r>
+        <w:rPr>
+          <w:b/>
+        </w:rPr>
+        <w:t>Análisis Táctico Avanzado y Evaluación:</w:t>
+      </w:r>
+      <w:r>
+        <w:t xml:space="preserve"> Motores de análisis asistido por Stockfish, detector de puntos débiles, búsquedas FEN y visualización de barras de evaluación en tiempo real.</w:t>
+      </w:r>
+    </w:p>
+    <w:p>
+      <w:pPr>
+        <w:pStyle w:val="ListNumber"/>
+        <w:spacing w:after="80"/>
+      </w:pPr>
+      <w:r>
+        <w:rPr>
+          <w:b/>
+        </w:rPr>
+        <w:t>Entrenamiento Táctico y Puzzles:</w:t>
+      </w:r>
+      <w:r>
+        <w:t xml:space="preserve"> Resolución interactiva de problemas, modos contrarreloj, supervivencia, speedruns, patrones tácticos y recreación de sacrificios brillantes.</w:t>
+      </w:r>
+    </w:p>
+    <w:p>
+      <w:pPr>
+        <w:pStyle w:val="ListNumber"/>
+        <w:spacing w:after="80"/>
+      </w:pPr>
+      <w:r>
+        <w:rPr>
+          <w:b/>
+        </w:rPr>
+        <w:t>Teoría de Aperturas y Finales:</w:t>
+      </w:r>
+      <w:r>
+        <w:t xml:space="preserve"> Rastrear líneas teóricas en la base de datos, editor de variantes, adivinación de aperturas, repetición espaciada con flashcards, mates teóricos y finales clásicos contra la IA.</w:t>
+      </w:r>
+    </w:p>
+    <w:p>
+      <w:pPr>
+        <w:pStyle w:val="ListNumber"/>
+        <w:spacing w:after="80"/>
+      </w:pPr>
+      <w:r>
+        <w:rPr>
+          <w:b/>
+        </w:rPr>
+        <w:t>Visualización Espacial y Cálculo Mental:</w:t>
+      </w:r>
+      <w:r>
+        <w:t xml:space="preserve"> Ajedrez a ciegas guiado, memorización geométrica de casillas, coordenadas infinitas y modos de cálculo invertido en espejo.</w:t>
+      </w:r>
+    </w:p>
+    <w:p>
+      <w:pPr>
+        <w:pStyle w:val="ListNumber"/>
+        <w:spacing w:after="80"/>
+      </w:pPr>
+      <w:r>
+        <w:rPr>
+          <w:b/>
+        </w:rPr>
+        <w:t>Memoria, Ejercicios Cognitivos y Competición:</w:t>
+      </w:r>
+      <w:r>
+        <w:t xml:space="preserve"> Reconstrucción de posiciones fotográficas, adivinación de jugadas de maestros, cuestionarios históricos y torneos simulados por llaves.</w:t>
+      </w:r>
+    </w:p>
+    <w:p>
+      <w:pPr>
+        <w:pStyle w:val="ListNumber"/>
+        <w:spacing w:after="80"/>
+      </w:pPr>
+      <w:r>
+        <w:rPr>
+          <w:b/>
+        </w:rPr>
+        <w:t>Ludificación, Social y Personalización UX:</w:t>
+      </w:r>
+      <w:r>
+        <w:t xml:space="preserve"> Calendarios de rachas de estudio tipo GitHub, misiones de XP, sistema social de amigos con clasificaciones y paneles de personalización visual/sonora de tableros.</w:t>
+      </w:r>
+    </w:p>
+    <w:p>
+      <w:pPr>
         <w:pStyle w:val="Heading2"/>
         <w:keepNext/>
         <w:spacing w:before="360" w:after="160"/>
@@ -525,7 +745,7 @@
         <w:jc w:val="both"/>
       </w:pPr>
       <w:r>
-        <w:t>Queda fuera del alcance actual de esta memoria el desarrollo de un módulo de juego multijugador (PvP) online en tiempo real basado en WebSockets, centrándose exclusivamente en la vertiente formativa, interactiva, de análisis táctico y de juego contra maestros asistido por IA local.</w:t>
+        <w:t>Queda fuera del alcance actual de esta memoria el desarrollo de un módulo de juego multijugador (PvP) online en tiempo real basado en WebSockets, centrándose exclusivamente en la vertiente de entrenamiento individual, análisis táctico asistido y juego contra maestros adaptativos por IA local.</w:t>
       </w:r>
     </w:p>
     <w:p>
@@ -648,7 +868,7 @@
           <w:color w:val="000000"/>
           <w:sz w:val="24"/>
         </w:rPr>
-        <w:t>📊 Cuadro Comparativo de Herramientas</w:t>
+        <w:t>Cuadro Comparativo de Herramientas</w:t>
       </w:r>
     </w:p>
     <w:tbl>
@@ -1833,11 +2053,27 @@
     </w:p>
     <w:p>
       <w:pPr>
+        <w:pStyle w:val="Heading2"/>
+        <w:keepNext/>
+        <w:spacing w:before="360" w:after="160"/>
+      </w:pPr>
+      <w:r>
+        <w:rPr>
+          <w:rFonts w:ascii="Times New Roman" w:hAnsi="Times New Roman"/>
+          <w:b/>
+          <w:color w:val="000000"/>
+          <w:sz w:val="28"/>
+        </w:rPr>
+        <w:t>3.1.- Stack Tecnológico Seleccionado</w:t>
+      </w:r>
+    </w:p>
+    <w:p>
+      <w:pPr>
         <w:spacing w:after="160" w:line="276" w:lineRule="auto"/>
         <w:jc w:val="both"/>
       </w:pPr>
       <w:r>
-        <w:t>El desarrollo del sistema se sustenta sobre la selección de un stack tecnológico moderno, abierto y altamente documentado, asegurando la scalabilidad y compatibilidad multiplataforma:</w:t>
+        <w:t>El desarrollo del sistema se sustenta sobre la selección de un stack tecnológico moderno, abierto y altamente documentado, asegurando la escalabilidad y compatibilidad multiplataforma:</w:t>
       </w:r>
     </w:p>
     <w:p>
@@ -1968,6 +2204,88 @@
       </w:r>
       <w:r>
         <w:t xml:space="preserve"> Aísla cada servicio en contenedores inmutables. Nginx sirve la aplicación SPA en el frontend mientras que .NET ejecuta y comunica Stockfish de forma nativa en Linux dentro del contenedor del backend.</w:t>
+      </w:r>
+    </w:p>
+    <w:p>
+      <w:pPr>
+        <w:pStyle w:val="Heading2"/>
+        <w:keepNext/>
+        <w:spacing w:before="360" w:after="160"/>
+      </w:pPr>
+      <w:r>
+        <w:rPr>
+          <w:rFonts w:ascii="Times New Roman" w:hAnsi="Times New Roman"/>
+          <w:b/>
+          <w:color w:val="000000"/>
+          <w:sz w:val="28"/>
+        </w:rPr>
+        <w:t>3.2.- Metodología de Desarrollo y Patrones</w:t>
+      </w:r>
+    </w:p>
+    <w:p>
+      <w:pPr>
+        <w:spacing w:after="160" w:line="276" w:lineRule="auto"/>
+        <w:jc w:val="both"/>
+      </w:pPr>
+      <w:r>
+        <w:t xml:space="preserve">Se implementó un diseño de </w:t>
+      </w:r>
+      <w:r>
+        <w:rPr>
+          <w:b/>
+        </w:rPr>
+        <w:t>Arquitectura Limpia en Capas (N-Tier Architecture)</w:t>
+      </w:r>
+      <w:r>
+        <w:t>, separando las responsabilidades lógicas de forma estricta:</w:t>
+      </w:r>
+    </w:p>
+    <w:p>
+      <w:pPr>
+        <w:pStyle w:val="ListBullet"/>
+        <w:spacing w:after="80"/>
+        <w:ind w:left="360"/>
+      </w:pPr>
+      <w:r>
+        <w:rPr>
+          <w:b/>
+        </w:rPr>
+        <w:t>Capa de Presentación:</w:t>
+      </w:r>
+      <w:r>
+        <w:t xml:space="preserve"> Controladores Web API de C# que consumen y exponen DTOs de forma síncrona/asíncrona.</w:t>
+      </w:r>
+    </w:p>
+    <w:p>
+      <w:pPr>
+        <w:pStyle w:val="ListBullet"/>
+        <w:spacing w:after="80"/>
+        <w:ind w:left="360"/>
+      </w:pPr>
+      <w:r>
+        <w:rPr>
+          <w:b/>
+        </w:rPr>
+        <w:t>Capa de Infraestructura (Persistencia):</w:t>
+      </w:r>
+      <w:r>
+        <w:t xml:space="preserve"> Contexto de datos y Repositorios que implementan el patrón repositorio, encapsulando las consultas LINQ.</w:t>
+      </w:r>
+    </w:p>
+    <w:p>
+      <w:pPr>
+        <w:pStyle w:val="ListBullet"/>
+        <w:spacing w:after="80"/>
+        <w:ind w:left="360"/>
+      </w:pPr>
+      <w:r>
+        <w:rPr>
+          <w:b/>
+        </w:rPr>
+        <w:t>Capa de Servicios de Dominio:</w:t>
+      </w:r>
+      <w:r>
+        <w:t xml:space="preserve"> Servicios auxiliares como el motor de Stockfish que interactúa con procesos del sistema operativo.</w:t>
       </w:r>
     </w:p>
     <w:p>
@@ -2146,7 +2464,7 @@
           <w:color w:val="000000"/>
           <w:sz w:val="24"/>
         </w:rPr>
-        <w:t>📋 Diagrama de Casos de Uso del Sistema</w:t>
+        <w:t>Diagrama de Casos de Uso del Sistema</w:t>
       </w:r>
     </w:p>
     <w:p>
@@ -2252,63 +2570,117 @@
           <w:color w:val="000000"/>
           <w:sz w:val="24"/>
         </w:rPr>
-        <w:t>️ Diagrama Entidad-Relación de la Base de Datos</w:t>
+        <w:t>Diagrama Entidad-Relación de la Base de Datos</w:t>
       </w:r>
     </w:p>
     <w:p>
       <w:pPr>
-        <w:spacing w:before="240" w:after="80"/>
-        <w:jc w:val="center"/>
-      </w:pPr>
-      <w:r>
-        <w:drawing>
-          <wp:inline xmlns:a="http://schemas.openxmlformats.org/drawingml/2006/main" xmlns:pic="http://schemas.openxmlformats.org/drawingml/2006/picture">
-            <wp:extent cx="5486400" cy="11467143"/>
-            <wp:docPr id="3" name="Picture 3"/>
-            <wp:cNvGraphicFramePr>
-              <a:graphicFrameLocks noChangeAspect="1"/>
-            </wp:cNvGraphicFramePr>
-            <a:graphic>
-              <a:graphicData uri="http://schemas.openxmlformats.org/drawingml/2006/picture">
-                <pic:pic>
-                  <pic:nvPicPr>
-                    <pic:cNvPr id="0" name="diagrama_3.png"/>
-                    <pic:cNvPicPr/>
-                  </pic:nvPicPr>
-                  <pic:blipFill>
-                    <a:blip r:embed="rId11"/>
-                    <a:stretch>
-                      <a:fillRect/>
-                    </a:stretch>
-                  </pic:blipFill>
-                  <pic:spPr>
-                    <a:xfrm>
-                      <a:off x="0" y="0"/>
-                      <a:ext cx="5486400" cy="11467143"/>
-                    </a:xfrm>
-                    <a:prstGeom prst="rect"/>
-                  </pic:spPr>
-                </pic:pic>
-              </a:graphicData>
-            </a:graphic>
-          </wp:inline>
-        </w:drawing>
-      </w:r>
-    </w:p>
-    <w:p>
-      <w:pPr>
-        <w:keepNext/>
-        <w:spacing w:after="240"/>
-        <w:jc w:val="center"/>
+        <w:ind w:left="720"/>
       </w:pPr>
       <w:r>
         <w:rPr>
-          <w:rFonts w:ascii="Times New Roman" w:hAnsi="Times New Roman"/>
-          <w:i/>
-          <w:color w:val="505050"/>
+          <w:rFonts w:ascii="Courier New" w:hAnsi="Courier New"/>
           <w:sz w:val="19"/>
         </w:rPr>
-        <w:t>Figura 4.3. Modelo Conceptual Base de Datos Relacional (Diagrama Entidad-Relacion).</w:t>
+        <w:t>erDiagram</w:t>
+        <w:br/>
+        <w:t xml:space="preserve">    JUGADORES ||--o{ PARTIDAS : "disputa"</w:t>
+        <w:br/>
+        <w:t xml:space="preserve">    JUGADORES {</w:t>
+        <w:br/>
+        <w:t xml:space="preserve">        int Id PK</w:t>
+        <w:br/>
+        <w:t xml:space="preserve">        string Nombre</w:t>
+        <w:br/>
+        <w:t xml:space="preserve">        int AnioNacimiento</w:t>
+        <w:br/>
+        <w:t xml:space="preserve">        string Pais</w:t>
+        <w:br/>
+        <w:t xml:space="preserve">        float PesoSacrificio</w:t>
+        <w:br/>
+        <w:t xml:space="preserve">        float PesoAtaqueRey</w:t>
+        <w:br/>
+        <w:t xml:space="preserve">        float PesoSimplificacion</w:t>
+        <w:br/>
+        <w:t xml:space="preserve">        float PesoFinales</w:t>
+        <w:br/>
+        <w:t xml:space="preserve">        float PesoControlCentro</w:t>
+        <w:br/>
+        <w:t xml:space="preserve">    }</w:t>
+        <w:br/>
+        <w:t xml:space="preserve">    PARTIDAS ||--o{ POSICIONES : "contiene"</w:t>
+        <w:br/>
+        <w:t xml:space="preserve">    PARTIDAS {</w:t>
+        <w:br/>
+        <w:t xml:space="preserve">        int Id PK</w:t>
+        <w:br/>
+        <w:t xml:space="preserve">        int JugadorId FK</w:t>
+        <w:br/>
+        <w:t xml:space="preserve">        string Oponente</w:t>
+        <w:br/>
+        <w:t xml:space="preserve">        int Anio</w:t>
+        <w:br/>
+        <w:t xml:space="preserve">        string Evento</w:t>
+        <w:br/>
+        <w:t xml:space="preserve">        string CodigoECO</w:t>
+        <w:br/>
+        <w:t xml:space="preserve">        string AperturaNombre</w:t>
+        <w:br/>
+        <w:t xml:space="preserve">        string VarianteNombre</w:t>
+        <w:br/>
+        <w:t xml:space="preserve">        string PGN</w:t>
+        <w:br/>
+        <w:t xml:space="preserve">        string ColorJugador</w:t>
+        <w:br/>
+        <w:t xml:space="preserve">        string Resultado</w:t>
+        <w:br/>
+        <w:t xml:space="preserve">    }</w:t>
+        <w:br/>
+        <w:t xml:space="preserve">    POSICIONES {</w:t>
+        <w:br/>
+        <w:t xml:space="preserve">        int Id PK</w:t>
+        <w:br/>
+        <w:t xml:space="preserve">        int PartidaId FK</w:t>
+        <w:br/>
+        <w:t xml:space="preserve">        string FEN</w:t>
+        <w:br/>
+        <w:t xml:space="preserve">        string MovimientoHistorico</w:t>
+        <w:br/>
+        <w:t xml:space="preserve">        string TipoPosicion</w:t>
+        <w:br/>
+        <w:t xml:space="preserve">    }</w:t>
+        <w:br/>
+        <w:t xml:space="preserve">    USUARIOS ||--o{ LOGROS : "obtiene"</w:t>
+        <w:br/>
+        <w:t xml:space="preserve">    USUARIOS {</w:t>
+        <w:br/>
+        <w:t xml:space="preserve">        int Id PK</w:t>
+        <w:br/>
+        <w:t xml:space="preserve">        string Username</w:t>
+        <w:br/>
+        <w:t xml:space="preserve">        string PasswordHash</w:t>
+        <w:br/>
+        <w:t xml:space="preserve">        int XP</w:t>
+        <w:br/>
+        <w:t xml:space="preserve">        int RachaDias</w:t>
+        <w:br/>
+        <w:t xml:space="preserve">        string UltimaActividad</w:t>
+        <w:br/>
+        <w:t xml:space="preserve">    }</w:t>
+        <w:br/>
+        <w:t xml:space="preserve">    LOGROS {</w:t>
+        <w:br/>
+        <w:t xml:space="preserve">        int Id PK</w:t>
+        <w:br/>
+        <w:t xml:space="preserve">        int UsuarioId FK</w:t>
+        <w:br/>
+        <w:t xml:space="preserve">        string Codigo</w:t>
+        <w:br/>
+        <w:t xml:space="preserve">        string Titulo</w:t>
+        <w:br/>
+        <w:t xml:space="preserve">        string FechaLogro</w:t>
+        <w:br/>
+        <w:t xml:space="preserve">    }</w:t>
       </w:r>
     </w:p>
     <w:p>
@@ -2324,7 +2696,7 @@
           <w:color w:val="000000"/>
           <w:sz w:val="24"/>
         </w:rPr>
-        <w:t>👥 Diagrama de Clases UML Simplificado (Backend)</w:t>
+        <w:t>Diagrama de Clases UML Simplificado (Backend)</w:t>
       </w:r>
     </w:p>
     <w:p>
@@ -2336,7 +2708,7 @@
         <w:drawing>
           <wp:inline xmlns:a="http://schemas.openxmlformats.org/drawingml/2006/main" xmlns:pic="http://schemas.openxmlformats.org/drawingml/2006/picture">
             <wp:extent cx="5486400" cy="5749888"/>
-            <wp:docPr id="4" name="Picture 4"/>
+            <wp:docPr id="3" name="Picture 3"/>
             <wp:cNvGraphicFramePr>
               <a:graphicFrameLocks noChangeAspect="1"/>
             </wp:cNvGraphicFramePr>
@@ -2348,7 +2720,7 @@
                     <pic:cNvPicPr/>
                   </pic:nvPicPr>
                   <pic:blipFill>
-                    <a:blip r:embed="rId12"/>
+                    <a:blip r:embed="rId11"/>
                     <a:stretch>
                       <a:fillRect/>
                     </a:stretch>
@@ -2417,7 +2789,7 @@
         <w:drawing>
           <wp:inline xmlns:a="http://schemas.openxmlformats.org/drawingml/2006/main" xmlns:pic="http://schemas.openxmlformats.org/drawingml/2006/picture">
             <wp:extent cx="5486400" cy="2189950"/>
-            <wp:docPr id="5" name="Picture 5"/>
+            <wp:docPr id="4" name="Picture 4"/>
             <wp:cNvGraphicFramePr>
               <a:graphicFrameLocks noChangeAspect="1"/>
             </wp:cNvGraphicFramePr>
@@ -2429,7 +2801,7 @@
                     <pic:cNvPicPr/>
                   </pic:nvPicPr>
                   <pic:blipFill>
-                    <a:blip r:embed="rId13"/>
+                    <a:blip r:embed="rId12"/>
                     <a:stretch>
                       <a:fillRect/>
                     </a:stretch>
@@ -2477,7 +2849,7 @@
           <w:color w:val="000000"/>
           <w:sz w:val="28"/>
         </w:rPr>
-        <w:t>4.5.- Resultados e Implementación</w:t>
+        <w:t>4.5.- Resultados y Catálogo Detallado de Módulos Funcionales</w:t>
       </w:r>
     </w:p>
     <w:p>
@@ -2486,7 +2858,23 @@
         <w:jc w:val="both"/>
       </w:pPr>
       <w:r>
-        <w:t>El desarrollo culminó con éxito en una plataforma web totalmente interactiva.</w:t>
+        <w:t>La implementación de Chess Legacy destaca por su inmensa riqueza funcional, superando las limitaciones tradicionales de plataformas cerradas gracias a un diseño pedagógico y robusto. A continuación se desglosa el catálogo detallado de los 42 módulos y modos de juego integrados en el sistema, correspondientes directamente a los componentes JSX de la aplicación frontend:</w:t>
+      </w:r>
+    </w:p>
+    <w:p>
+      <w:pPr>
+        <w:pStyle w:val="Heading3"/>
+        <w:keepNext/>
+        <w:spacing w:before="280" w:after="120"/>
+      </w:pPr>
+      <w:r>
+        <w:rPr>
+          <w:rFonts w:ascii="Times New Roman" w:hAnsi="Times New Roman"/>
+          <w:b/>
+          <w:color w:val="000000"/>
+          <w:sz w:val="24"/>
+        </w:rPr>
+        <w:t>Eje 1: Juego contra la Historia y Personalización Adaptativa</w:t>
       </w:r>
     </w:p>
     <w:p>
@@ -2499,60 +2887,84 @@
         <w:rPr>
           <w:b/>
         </w:rPr>
-        <w:t>Poblado Masivo de Datos:</w:t>
-      </w:r>
-      <w:r>
-        <w:t xml:space="preserve"> Se importaron de forma granular y limpia un total de </w:t>
-      </w:r>
+        <w:t>Módulo 1: Simulador contra Maestros Leyenda (`PlayMaster.jsx`)</w:t>
+      </w:r>
+    </w:p>
+    <w:p>
+      <w:pPr>
+        <w:pStyle w:val="ListBullet"/>
+        <w:spacing w:after="80"/>
+        <w:ind w:left="1080"/>
+      </w:pPr>
+      <w:r>
+        <w:rPr>
+          <w:i/>
+        </w:rPr>
+        <w:t>Objetivo Pedagógico:</w:t>
+      </w:r>
+      <w:r>
+        <w:t xml:space="preserve"> Entrenar la toma de decisiones dinámicas enfrentándose a bots con IA que imitan fielmente el estilo de campeones mundiales.</w:t>
+      </w:r>
+    </w:p>
+    <w:p>
+      <w:pPr>
+        <w:pStyle w:val="ListBullet"/>
+        <w:spacing w:after="80"/>
+        <w:ind w:left="1080"/>
+      </w:pPr>
+      <w:r>
+        <w:rPr>
+          <w:i/>
+        </w:rPr>
+        <w:t>Mecánica:</w:t>
+      </w:r>
+      <w:r>
+        <w:t xml:space="preserve"> El sistema lee los pesos heurísticos del maestro (ej. Tal prioriza sacrificios, Capablanca simplificaciones). Cuando Stockfish genera la lista de mejores jugadas, la API del backend aplica una fórmula probabilística que selecciona la jugada basándose en dichos pesos de estilo. Incorpora efectos de sonido mediante la API de Web Audio y comentarios textuales en vivo analizando la calidad de las jugadas del alumno.</w:t>
+      </w:r>
+    </w:p>
+    <w:p>
+      <w:pPr>
+        <w:pStyle w:val="ListBullet"/>
+        <w:spacing w:after="80"/>
+        <w:ind w:left="360"/>
+      </w:pPr>
       <w:r>
         <w:rPr>
           <w:b/>
         </w:rPr>
-        <w:t>40,509 partidas</w:t>
-      </w:r>
-      <w:r>
-        <w:t xml:space="preserve"> y se agregaron las fichas biográficas y de estilo de los </w:t>
-      </w:r>
-      <w:r>
-        <w:rPr>
-          <w:b/>
-        </w:rPr>
-        <w:t>20 maestros</w:t>
-      </w:r>
-      <w:r>
-        <w:t xml:space="preserve"> (como Anand, Kramnik, Morphy, Spassky o Steinitz), completando una base de datos muy robusta.</w:t>
+        <w:t>Módulo 2: Panel de Detalle y Biografías de Maestros (`MasterDetail.jsx`, `Biography.jsx`, `MasterCard.jsx`)</w:t>
       </w:r>
     </w:p>
     <w:p>
       <w:pPr>
         <w:pStyle w:val="ListBullet"/>
         <w:spacing w:after="80"/>
-        <w:ind w:left="360"/>
+        <w:ind w:left="1080"/>
       </w:pPr>
       <w:r>
         <w:rPr>
-          <w:b/>
+          <w:i/>
         </w:rPr>
-        <w:t>Higiene Visual Perfecta:</w:t>
-      </w:r>
-      <w:r>
-        <w:t xml:space="preserve"> Las fotos reales de todos los maestros clásicos han sido totalmente integradas y configuradas nativamente en la aplicación, garantizando que el diseño visual del frontend sea homogéneo e impecable.</w:t>
+        <w:t>Objetivo Pedagógico:</w:t>
+      </w:r>
+      <w:r>
+        <w:t xml:space="preserve"> Contextualizar la historia y filosofía ajedrecística de los 20 grandes maestros del ajedrez.</w:t>
       </w:r>
     </w:p>
     <w:p>
       <w:pPr>
         <w:pStyle w:val="ListBullet"/>
         <w:spacing w:after="80"/>
-        <w:ind w:left="360"/>
+        <w:ind w:left="1080"/>
       </w:pPr>
       <w:r>
         <w:rPr>
-          <w:b/>
+          <w:i/>
         </w:rPr>
-        <w:t>Interactividad Aumentada (Navegación UX):</w:t>
-      </w:r>
-      <w:r>
-        <w:t xml:space="preserve"> El visor de análisis y juego permite la navegación bidireccional ágil mediante teclado (</w:t>
+        <w:t>Mecánica:</w:t>
+      </w:r>
+      <w:r>
+        <w:t xml:space="preserve"> Provee una interfaz interactiva con fichas biográficas detalladas de cada maestro, sus logros históricos, años de actividad y una descripción técnica de su temperamento competitivo sobre el tablero, vinculando tarjetas dinámicas (</w:t>
       </w:r>
       <w:r>
         <w:rPr>
@@ -2560,10 +2972,868 @@
           <w:color w:val="000000"/>
           <w:sz w:val="20"/>
         </w:rPr>
-        <w:t>←</w:t>
-      </w:r>
-      <w:r>
-        <w:t xml:space="preserve"> y </w:t>
+        <w:t>MasterCard.jsx</w:t>
+      </w:r>
+      <w:r>
+        <w:t>) en la pantalla de selección principal.</w:t>
+      </w:r>
+    </w:p>
+    <w:p>
+      <w:pPr>
+        <w:pStyle w:val="ListBullet"/>
+        <w:spacing w:after="80"/>
+        <w:ind w:left="360"/>
+      </w:pPr>
+      <w:r>
+        <w:rPr>
+          <w:b/>
+        </w:rPr>
+        <w:t>Módulo 3: Comparador Multivariable de Maestros (`ComparadorMaestros.jsx`)</w:t>
+      </w:r>
+    </w:p>
+    <w:p>
+      <w:pPr>
+        <w:pStyle w:val="ListBullet"/>
+        <w:spacing w:after="80"/>
+        <w:ind w:left="1080"/>
+      </w:pPr>
+      <w:r>
+        <w:rPr>
+          <w:i/>
+        </w:rPr>
+        <w:t>Objetivo Pedagógico:</w:t>
+      </w:r>
+      <w:r>
+        <w:t xml:space="preserve"> Analizar de forma matemática y comparada los diferentes perfiles y estilos de juego de los maestros históricos.</w:t>
+      </w:r>
+    </w:p>
+    <w:p>
+      <w:pPr>
+        <w:pStyle w:val="ListBullet"/>
+        <w:spacing w:after="80"/>
+        <w:ind w:left="1080"/>
+      </w:pPr>
+      <w:r>
+        <w:rPr>
+          <w:i/>
+        </w:rPr>
+        <w:t>Mecánica:</w:t>
+      </w:r>
+      <w:r>
+        <w:t xml:space="preserve"> Interfaz gráfica que representa mediante diagramas comparativos los pesos de juego de los maestros seleccionados (ataque, defensa, táctica, juego posicional, finales), permitiendo visualizar por qué un maestro es más agresivo o conservador que otro.</w:t>
+      </w:r>
+    </w:p>
+    <w:p>
+      <w:pPr>
+        <w:pStyle w:val="ListBullet"/>
+        <w:spacing w:after="80"/>
+        <w:ind w:left="360"/>
+      </w:pPr>
+      <w:r>
+        <w:rPr>
+          <w:b/>
+        </w:rPr>
+        <w:t>Módulo 4: Entrenamiento de Estilo Personal (`StyleTraining.jsx`)</w:t>
+      </w:r>
+    </w:p>
+    <w:p>
+      <w:pPr>
+        <w:pStyle w:val="ListBullet"/>
+        <w:spacing w:after="80"/>
+        <w:ind w:left="1080"/>
+      </w:pPr>
+      <w:r>
+        <w:rPr>
+          <w:i/>
+        </w:rPr>
+        <w:t>Objetivo Pedagógico:</w:t>
+      </w:r>
+      <w:r>
+        <w:t xml:space="preserve"> Ayudar al alumno a definir y depurar su propio estilo de juego mediante una comparativa guiada de decisiones.</w:t>
+      </w:r>
+    </w:p>
+    <w:p>
+      <w:pPr>
+        <w:pStyle w:val="ListBullet"/>
+        <w:spacing w:after="80"/>
+        <w:ind w:left="1080"/>
+      </w:pPr>
+      <w:r>
+        <w:rPr>
+          <w:i/>
+        </w:rPr>
+        <w:t>Mecánica:</w:t>
+      </w:r>
+      <w:r>
+        <w:t xml:space="preserve"> El sistema expone al jugador a una serie de posiciones críticas y mide en cuál de las variantes propuestas se siente más cómodo (táctica vs. posicional), ajustando un perfil de pesos de estilo propio que puede guardar en su perfil de usuario.</w:t>
+      </w:r>
+    </w:p>
+    <w:p>
+      <w:pPr>
+        <w:pStyle w:val="ListBullet"/>
+        <w:spacing w:after="80"/>
+        <w:ind w:left="360"/>
+      </w:pPr>
+      <w:r>
+        <w:rPr>
+          <w:b/>
+        </w:rPr>
+        <w:t>Módulo 5: Visor de la Partida del Día (`PartidaDelDia.jsx`)</w:t>
+      </w:r>
+    </w:p>
+    <w:p>
+      <w:pPr>
+        <w:pStyle w:val="ListBullet"/>
+        <w:spacing w:after="80"/>
+        <w:ind w:left="1080"/>
+      </w:pPr>
+      <w:r>
+        <w:rPr>
+          <w:i/>
+        </w:rPr>
+        <w:t>Objetivo Pedagógico:</w:t>
+      </w:r>
+      <w:r>
+        <w:t xml:space="preserve"> Analizar diariamente una obra maestra histórica, memorizando e interiorizando ideas clásicas.</w:t>
+      </w:r>
+    </w:p>
+    <w:p>
+      <w:pPr>
+        <w:pStyle w:val="ListBullet"/>
+        <w:spacing w:after="80"/>
+        <w:ind w:left="1080"/>
+      </w:pPr>
+      <w:r>
+        <w:rPr>
+          <w:i/>
+        </w:rPr>
+        <w:t>Mecánica:</w:t>
+      </w:r>
+      <w:r>
+        <w:t xml:space="preserve"> Genera una partida diaria determinista basada en el día del año. El tablero permite reproducir movimientos hacia adelante y hacia atrás mediante atajos del teclado (← / →), integrando un panel descriptivo con los nombres simétricos de ambos jugadores y su color de piezas correspondiente.</w:t>
+      </w:r>
+    </w:p>
+    <w:p>
+      <w:pPr>
+        <w:pStyle w:val="ListBullet"/>
+        <w:spacing w:after="80"/>
+        <w:ind w:left="360"/>
+      </w:pPr>
+      <w:r>
+        <w:rPr>
+          <w:b/>
+        </w:rPr>
+        <w:t>Módulo 6: Buscador y Visor de Partidas Famosas (`PartidasFamosas.jsx`, `FamousGames.jsx`, `VisorPartidaFamosa.jsx`)</w:t>
+      </w:r>
+    </w:p>
+    <w:p>
+      <w:pPr>
+        <w:pStyle w:val="ListBullet"/>
+        <w:spacing w:after="80"/>
+        <w:ind w:left="1080"/>
+      </w:pPr>
+      <w:r>
+        <w:rPr>
+          <w:i/>
+        </w:rPr>
+        <w:t>Objetivo Pedagógico:</w:t>
+      </w:r>
+      <w:r>
+        <w:t xml:space="preserve"> Buscar, reproducir y estudiar de forma interactiva las partidas más célebres de la historia de los 20 maestros clásicos.</w:t>
+      </w:r>
+    </w:p>
+    <w:p>
+      <w:pPr>
+        <w:pStyle w:val="ListBullet"/>
+        <w:spacing w:after="80"/>
+        <w:ind w:left="1080"/>
+      </w:pPr>
+      <w:r>
+        <w:rPr>
+          <w:i/>
+        </w:rPr>
+        <w:t>Mecánica:</w:t>
+      </w:r>
+      <w:r>
+        <w:t xml:space="preserve"> Conecta el buscador de partidas famosas con un visor dinámico que reproduce los movimientos sobre el tablero y permite activar el motor local Stockfish para examinar variantes alternativas de juego en cualquier momento del análisis.</w:t>
+      </w:r>
+    </w:p>
+    <w:p>
+      <w:pPr>
+        <w:pStyle w:val="Heading3"/>
+        <w:keepNext/>
+        <w:spacing w:before="280" w:after="120"/>
+      </w:pPr>
+      <w:r>
+        <w:rPr>
+          <w:rFonts w:ascii="Times New Roman" w:hAnsi="Times New Roman"/>
+          <w:b/>
+          <w:color w:val="000000"/>
+          <w:sz w:val="24"/>
+        </w:rPr>
+        <w:t>Eje 2: Análisis Táctico Avanzado y Evaluación</w:t>
+      </w:r>
+    </w:p>
+    <w:p>
+      <w:pPr>
+        <w:pStyle w:val="ListBullet"/>
+        <w:spacing w:after="80"/>
+        <w:ind w:left="360"/>
+      </w:pPr>
+      <w:r>
+        <w:rPr>
+          <w:b/>
+        </w:rPr>
+        <w:t>Módulo 7: Análisis Libre Asistido (`AnalisisLibre.jsx`, `AnalisisPartida.jsx`)</w:t>
+      </w:r>
+    </w:p>
+    <w:p>
+      <w:pPr>
+        <w:pStyle w:val="ListBullet"/>
+        <w:spacing w:after="80"/>
+        <w:ind w:left="1080"/>
+      </w:pPr>
+      <w:r>
+        <w:rPr>
+          <w:i/>
+        </w:rPr>
+        <w:t>Objetivo Pedagógico:</w:t>
+      </w:r>
+      <w:r>
+        <w:t xml:space="preserve"> Evaluar de forma autónoma posiciones complejas del alumno para corregir errores.</w:t>
+      </w:r>
+    </w:p>
+    <w:p>
+      <w:pPr>
+        <w:pStyle w:val="ListBullet"/>
+        <w:spacing w:after="80"/>
+        <w:ind w:left="1080"/>
+      </w:pPr>
+      <w:r>
+        <w:rPr>
+          <w:i/>
+        </w:rPr>
+        <w:t>Mecánica:</w:t>
+      </w:r>
+      <w:r>
+        <w:t xml:space="preserve"> Provee un tablero interactivo donde el alumno puede arrastrar piezas a cualquier posición legal, configurar un FEN personalizado y ver la evaluación exacta en una barra vertical reactiva alimentada en tiempo real por el proceso de Stockfish que se ejecuta en segundo plano.</w:t>
+      </w:r>
+    </w:p>
+    <w:p>
+      <w:pPr>
+        <w:pStyle w:val="ListBullet"/>
+        <w:spacing w:after="80"/>
+        <w:ind w:left="360"/>
+      </w:pPr>
+      <w:r>
+        <w:rPr>
+          <w:b/>
+        </w:rPr>
+        <w:t>Módulo 8: Detector de Errores y Puntos Débiles (`AnalisisPuntosDebiles.jsx`)</w:t>
+      </w:r>
+    </w:p>
+    <w:p>
+      <w:pPr>
+        <w:pStyle w:val="ListBullet"/>
+        <w:spacing w:after="80"/>
+        <w:ind w:left="1080"/>
+      </w:pPr>
+      <w:r>
+        <w:rPr>
+          <w:i/>
+        </w:rPr>
+        <w:t>Objetivo Pedagógico:</w:t>
+      </w:r>
+      <w:r>
+        <w:t xml:space="preserve"> Auditar las partidas jugadas por el alumno y catalogar en qué tipo de posiciones comete más imprecisiones.</w:t>
+      </w:r>
+    </w:p>
+    <w:p>
+      <w:pPr>
+        <w:pStyle w:val="ListBullet"/>
+        <w:spacing w:after="80"/>
+        <w:ind w:left="1080"/>
+      </w:pPr>
+      <w:r>
+        <w:rPr>
+          <w:i/>
+        </w:rPr>
+        <w:t>Mecánica:</w:t>
+      </w:r>
+      <w:r>
+        <w:t xml:space="preserve"> Compara los movimientos realizados por el usuario en su historial de juego con la primera línea de Stockfish, detectando pérdidas de centipeones y clasificando los fallos en categorías (errores en aperturas, imprecisiones en finales o fallos tácticos).</w:t>
+      </w:r>
+    </w:p>
+    <w:p>
+      <w:pPr>
+        <w:pStyle w:val="ListBullet"/>
+        <w:spacing w:after="80"/>
+        <w:ind w:left="360"/>
+      </w:pPr>
+      <w:r>
+        <w:rPr>
+          <w:b/>
+        </w:rPr>
+        <w:t>Módulo 9: Buscador de Posiciones por FEN (`BuscadorFen.jsx`)</w:t>
+      </w:r>
+    </w:p>
+    <w:p>
+      <w:pPr>
+        <w:pStyle w:val="ListBullet"/>
+        <w:spacing w:after="80"/>
+        <w:ind w:left="1080"/>
+      </w:pPr>
+      <w:r>
+        <w:rPr>
+          <w:i/>
+        </w:rPr>
+        <w:t>Objetivo Pedagógico:</w:t>
+      </w:r>
+      <w:r>
+        <w:t xml:space="preserve"> Localizar partidas históricas o teóricas en la base de datos a partir de una disposición específica de piezas.</w:t>
+      </w:r>
+    </w:p>
+    <w:p>
+      <w:pPr>
+        <w:pStyle w:val="ListBullet"/>
+        <w:spacing w:after="80"/>
+        <w:ind w:left="1080"/>
+      </w:pPr>
+      <w:r>
+        <w:rPr>
+          <w:i/>
+        </w:rPr>
+        <w:t>Mecánica:</w:t>
+      </w:r>
+      <w:r>
+        <w:t xml:space="preserve"> Permite introducir un código FEN (notación estándar de posición) o dibujar una posición en el tablero y realizar una consulta en la base de datos SQLite para encontrar qué partidas famosas de los maestros llegaron a esa misma disposición o a una estructura similar.</w:t>
+      </w:r>
+    </w:p>
+    <w:p>
+      <w:pPr>
+        <w:pStyle w:val="ListBullet"/>
+        <w:spacing w:after="80"/>
+        <w:ind w:left="360"/>
+      </w:pPr>
+      <w:r>
+        <w:rPr>
+          <w:b/>
+        </w:rPr>
+        <w:t>Módulo 10: Barra de Evaluación en Tiempo Real (`EvaluationBar.jsx`)</w:t>
+      </w:r>
+    </w:p>
+    <w:p>
+      <w:pPr>
+        <w:pStyle w:val="ListBullet"/>
+        <w:spacing w:after="80"/>
+        <w:ind w:left="1080"/>
+      </w:pPr>
+      <w:r>
+        <w:rPr>
+          <w:i/>
+        </w:rPr>
+        <w:t>Objetivo Pedagógico:</w:t>
+      </w:r>
+      <w:r>
+        <w:t xml:space="preserve"> Ofrecer una retroalimentación visual instantánea sobre el equilibrio de fuerzas de la posición actual en el tablero.</w:t>
+      </w:r>
+    </w:p>
+    <w:p>
+      <w:pPr>
+        <w:pStyle w:val="ListBullet"/>
+        <w:spacing w:after="80"/>
+        <w:ind w:left="1080"/>
+      </w:pPr>
+      <w:r>
+        <w:rPr>
+          <w:i/>
+        </w:rPr>
+        <w:t>Mecánica:</w:t>
+      </w:r>
+      <w:r>
+        <w:t xml:space="preserve"> Componente de interfaz de alto rendimiento que recibe datos numéricos de centipeones (ej. +1.4, -0.9) o mates forzados (ej. M3) del backend, y renderiza una transición vertical suave con coloración contrastada negra y blanca que representa qué bando tiene la ventaja estratégica.</w:t>
+      </w:r>
+    </w:p>
+    <w:p>
+      <w:pPr>
+        <w:pStyle w:val="Heading3"/>
+        <w:keepNext/>
+        <w:spacing w:before="280" w:after="120"/>
+      </w:pPr>
+      <w:r>
+        <w:rPr>
+          <w:rFonts w:ascii="Times New Roman" w:hAnsi="Times New Roman"/>
+          <w:b/>
+          <w:color w:val="000000"/>
+          <w:sz w:val="24"/>
+        </w:rPr>
+        <w:t>Eje 3: Entrenamiento Táctico y Puzzles</w:t>
+      </w:r>
+    </w:p>
+    <w:p>
+      <w:pPr>
+        <w:pStyle w:val="ListBullet"/>
+        <w:spacing w:after="80"/>
+        <w:ind w:left="360"/>
+      </w:pPr>
+      <w:r>
+        <w:rPr>
+          <w:b/>
+        </w:rPr>
+        <w:t>Módulo 11: Base de Puzzles Tácticos (`PuzzlesTacticos.jsx`)</w:t>
+      </w:r>
+    </w:p>
+    <w:p>
+      <w:pPr>
+        <w:pStyle w:val="ListBullet"/>
+        <w:spacing w:after="80"/>
+        <w:ind w:left="1080"/>
+      </w:pPr>
+      <w:r>
+        <w:rPr>
+          <w:i/>
+        </w:rPr>
+        <w:t>Objetivo Pedagógico:</w:t>
+      </w:r>
+      <w:r>
+        <w:t xml:space="preserve"> Practicar y consolidar la capacidad de cálculo táctico y resolución de problemas de jaque mate o ganancia de material.</w:t>
+      </w:r>
+    </w:p>
+    <w:p>
+      <w:pPr>
+        <w:pStyle w:val="ListBullet"/>
+        <w:spacing w:after="80"/>
+        <w:ind w:left="1080"/>
+      </w:pPr>
+      <w:r>
+        <w:rPr>
+          <w:i/>
+        </w:rPr>
+        <w:t>Mecánica:</w:t>
+      </w:r>
+      <w:r>
+        <w:t xml:space="preserve"> Carga problemas tácticos indexados con su nivel de dificultad. El usuario debe introducir la secuencia correcta de jugadas en el tablero. Al resolverlos, acumula puntos de experiencia y actualiza su porcentaje de acierto.</w:t>
+      </w:r>
+    </w:p>
+    <w:p>
+      <w:pPr>
+        <w:pStyle w:val="ListBullet"/>
+        <w:spacing w:after="80"/>
+        <w:ind w:left="360"/>
+      </w:pPr>
+      <w:r>
+        <w:rPr>
+          <w:b/>
+        </w:rPr>
+        <w:t>Módulo 12: Módulo de Puzzles Contrarreloj (`ContrarrelojMode.jsx`)</w:t>
+      </w:r>
+    </w:p>
+    <w:p>
+      <w:pPr>
+        <w:pStyle w:val="ListBullet"/>
+        <w:spacing w:after="80"/>
+        <w:ind w:left="1080"/>
+      </w:pPr>
+      <w:r>
+        <w:rPr>
+          <w:i/>
+        </w:rPr>
+        <w:t>Objetivo Pedagógico:</w:t>
+      </w:r>
+      <w:r>
+        <w:t xml:space="preserve"> Entrenar la toma de decisiones rápidas y el reconocimiento instantáneo de patrones bajo presión de tiempo.</w:t>
+      </w:r>
+    </w:p>
+    <w:p>
+      <w:pPr>
+        <w:pStyle w:val="ListBullet"/>
+        <w:spacing w:after="80"/>
+        <w:ind w:left="1080"/>
+      </w:pPr>
+      <w:r>
+        <w:rPr>
+          <w:i/>
+        </w:rPr>
+        <w:t>Mecánica:</w:t>
+      </w:r>
+      <w:r>
+        <w:t xml:space="preserve"> El alumno dispone de un tiempo límite (ej. 3 minutos) para resolver la mayor cantidad de problemas tácticos posibles. Cada acierto suma valiosos segundos al reloj, mientras que cada fallo resta tiempo, incentivando la velocidad de cálculo espacial.</w:t>
+      </w:r>
+    </w:p>
+    <w:p>
+      <w:pPr>
+        <w:pStyle w:val="ListBullet"/>
+        <w:spacing w:after="80"/>
+        <w:ind w:left="360"/>
+      </w:pPr>
+      <w:r>
+        <w:rPr>
+          <w:b/>
+        </w:rPr>
+        <w:t>Módulo 13: Módulo Speedrun de Táctica (`SpeedRun.jsx`)</w:t>
+      </w:r>
+    </w:p>
+    <w:p>
+      <w:pPr>
+        <w:pStyle w:val="ListBullet"/>
+        <w:spacing w:after="80"/>
+        <w:ind w:left="1080"/>
+      </w:pPr>
+      <w:r>
+        <w:rPr>
+          <w:i/>
+        </w:rPr>
+        <w:t>Objetivo Pedagógico:</w:t>
+      </w:r>
+      <w:r>
+        <w:t xml:space="preserve"> Fomentar la concentración extrema y la precisión encadenada de resolución táctica.</w:t>
+      </w:r>
+    </w:p>
+    <w:p>
+      <w:pPr>
+        <w:pStyle w:val="ListBullet"/>
+        <w:spacing w:after="80"/>
+        <w:ind w:left="1080"/>
+      </w:pPr>
+      <w:r>
+        <w:rPr>
+          <w:i/>
+        </w:rPr>
+        <w:t>Mecánica:</w:t>
+      </w:r>
+      <w:r>
+        <w:t xml:space="preserve"> Un reto dinámico en el que el usuario debe resolver una secuencia ininterrumpida de problemas sin cometer errores graves. Un solo fallo interrumpe la racha actual, y el sistema registra las mejores puntuaciones históricas en el perfil.</w:t>
+      </w:r>
+    </w:p>
+    <w:p>
+      <w:pPr>
+        <w:pStyle w:val="ListBullet"/>
+        <w:spacing w:after="80"/>
+        <w:ind w:left="360"/>
+      </w:pPr>
+      <w:r>
+        <w:rPr>
+          <w:b/>
+        </w:rPr>
+        <w:t>Módulo 14: Modo Supervivencia de Resolución (`ModoSupervivencia.jsx`)</w:t>
+      </w:r>
+    </w:p>
+    <w:p>
+      <w:pPr>
+        <w:pStyle w:val="ListBullet"/>
+        <w:spacing w:after="80"/>
+        <w:ind w:left="1080"/>
+      </w:pPr>
+      <w:r>
+        <w:rPr>
+          <w:i/>
+        </w:rPr>
+        <w:t>Objetivo Pedagógico:</w:t>
+      </w:r>
+      <w:r>
+        <w:t xml:space="preserve"> Fortalecer la resiliencia mental resolviendo problemas tácticos con dificultad incremental.</w:t>
+      </w:r>
+    </w:p>
+    <w:p>
+      <w:pPr>
+        <w:pStyle w:val="ListBullet"/>
+        <w:spacing w:after="80"/>
+        <w:ind w:left="1080"/>
+      </w:pPr>
+      <w:r>
+        <w:rPr>
+          <w:i/>
+        </w:rPr>
+        <w:t>Mecánica:</w:t>
+      </w:r>
+      <w:r>
+        <w:t xml:space="preserve"> Ofrece problemas ordenados de menor a mayor dificultad. El jugador cuenta con 3 vidas. El juego termina cuando comete tres fallos, permitiéndole ver qué tan profundo pudo avanzar en el árbol de dificultad táctica.</w:t>
+      </w:r>
+    </w:p>
+    <w:p>
+      <w:pPr>
+        <w:pStyle w:val="ListBullet"/>
+        <w:spacing w:after="80"/>
+        <w:ind w:left="360"/>
+      </w:pPr>
+      <w:r>
+        <w:rPr>
+          <w:b/>
+        </w:rPr>
+        <w:t>Módulo 15: Clasificador de Patrones Tácticos (`PatronesTacticos.jsx`)</w:t>
+      </w:r>
+    </w:p>
+    <w:p>
+      <w:pPr>
+        <w:pStyle w:val="ListBullet"/>
+        <w:spacing w:after="80"/>
+        <w:ind w:left="1080"/>
+      </w:pPr>
+      <w:r>
+        <w:rPr>
+          <w:i/>
+        </w:rPr>
+        <w:t>Objetivo Pedagógico:</w:t>
+      </w:r>
+      <w:r>
+        <w:t xml:space="preserve"> Aprender y aislar conceptualmente los principales motivos tácticos (clavadas, dobletes, enfiladas, ataques a la descubierta).</w:t>
+      </w:r>
+    </w:p>
+    <w:p>
+      <w:pPr>
+        <w:pStyle w:val="ListBullet"/>
+        <w:spacing w:after="80"/>
+        <w:ind w:left="1080"/>
+      </w:pPr>
+      <w:r>
+        <w:rPr>
+          <w:i/>
+        </w:rPr>
+        <w:t>Mecánica:</w:t>
+      </w:r>
+      <w:r>
+        <w:t xml:space="preserve"> Interfaz que clasifica los problemas por su tema táctico subyacente. El alumno puede seleccionar entrenar exclusivamente un patrón (ej. "Ataques de tenedor") para corregir debilidades concretas en su visión de juego.</w:t>
+      </w:r>
+    </w:p>
+    <w:p>
+      <w:pPr>
+        <w:pStyle w:val="ListBullet"/>
+        <w:spacing w:after="80"/>
+        <w:ind w:left="360"/>
+      </w:pPr>
+      <w:r>
+        <w:rPr>
+          <w:b/>
+        </w:rPr>
+        <w:t>Módulo 16: Brillantes Históricos y Sacrificios (`BrillantesHistoricos.jsx`)</w:t>
+      </w:r>
+    </w:p>
+    <w:p>
+      <w:pPr>
+        <w:pStyle w:val="ListBullet"/>
+        <w:spacing w:after="80"/>
+        <w:ind w:left="1080"/>
+      </w:pPr>
+      <w:r>
+        <w:rPr>
+          <w:i/>
+        </w:rPr>
+        <w:t>Objetivo Pedagógico:</w:t>
+      </w:r>
+      <w:r>
+        <w:t xml:space="preserve"> Resolver y revivir los sacrificios más famosos y espectaculares de la historia del ajedrez mundial.</w:t>
+      </w:r>
+    </w:p>
+    <w:p>
+      <w:pPr>
+        <w:pStyle w:val="ListBullet"/>
+        <w:spacing w:after="80"/>
+        <w:ind w:left="1080"/>
+      </w:pPr>
+      <w:r>
+        <w:rPr>
+          <w:i/>
+        </w:rPr>
+        <w:t>Mecánica:</w:t>
+      </w:r>
+      <w:r>
+        <w:t xml:space="preserve"> Presenta la posición previa al movimiento inmortal de partidas emblemáticas (ej. La Inmortal de Anderssen, la Partida del Siglo de Fischer, o el Alfil Inmortal de Shirov). El usuario debe hallar la jugada brillante de sacrificio para continuar la combinación ganadora.</w:t>
+      </w:r>
+    </w:p>
+    <w:p>
+      <w:pPr>
+        <w:pStyle w:val="ListBullet"/>
+        <w:spacing w:after="80"/>
+        <w:ind w:left="360"/>
+      </w:pPr>
+      <w:r>
+        <w:rPr>
+          <w:b/>
+        </w:rPr>
+        <w:t>Módulo 17: Jugadas Raras y Curiosidades (`JugadasRaras.jsx`)</w:t>
+      </w:r>
+    </w:p>
+    <w:p>
+      <w:pPr>
+        <w:pStyle w:val="ListBullet"/>
+        <w:spacing w:after="80"/>
+        <w:ind w:left="1080"/>
+      </w:pPr>
+      <w:r>
+        <w:rPr>
+          <w:i/>
+        </w:rPr>
+        <w:t>Objetivo Pedagógico:</w:t>
+      </w:r>
+      <w:r>
+        <w:t xml:space="preserve"> Ampliar la visión estratégica del ajedrecista mediante el estudio de jugadas atípicas o contraintuitivas que desafían la teoría general.</w:t>
+      </w:r>
+    </w:p>
+    <w:p>
+      <w:pPr>
+        <w:pStyle w:val="ListBullet"/>
+        <w:spacing w:after="80"/>
+        <w:ind w:left="1080"/>
+      </w:pPr>
+      <w:r>
+        <w:rPr>
+          <w:i/>
+        </w:rPr>
+        <w:t>Mecánica:</w:t>
+      </w:r>
+      <w:r>
+        <w:t xml:space="preserve"> Un compendio de posiciones extrañas de partidas históricas (ej. movimientos de rey en la apertura, subpromociones a caballo o torre con fines específicos, bloqueos posicionales extremos) donde el alumno debe adivinar la jugada extravagante pero correcta.</w:t>
+      </w:r>
+    </w:p>
+    <w:p>
+      <w:pPr>
+        <w:pStyle w:val="Heading3"/>
+        <w:keepNext/>
+        <w:spacing w:before="280" w:after="120"/>
+      </w:pPr>
+      <w:r>
+        <w:rPr>
+          <w:rFonts w:ascii="Times New Roman" w:hAnsi="Times New Roman"/>
+          <w:b/>
+          <w:color w:val="000000"/>
+          <w:sz w:val="24"/>
+        </w:rPr>
+        <w:t>Eje 4: Teoría de Aperturas, Variantes y Finales</w:t>
+      </w:r>
+    </w:p>
+    <w:p>
+      <w:pPr>
+        <w:pStyle w:val="ListBullet"/>
+        <w:spacing w:after="80"/>
+        <w:ind w:left="360"/>
+      </w:pPr>
+      <w:r>
+        <w:rPr>
+          <w:b/>
+        </w:rPr>
+        <w:t>Módulo 18: Árbol de Aperturas y Repetición (`AperturaTraining.jsx`)</w:t>
+      </w:r>
+    </w:p>
+    <w:p>
+      <w:pPr>
+        <w:pStyle w:val="ListBullet"/>
+        <w:spacing w:after="80"/>
+        <w:ind w:left="1080"/>
+      </w:pPr>
+      <w:r>
+        <w:rPr>
+          <w:i/>
+        </w:rPr>
+        <w:t>Objetivo Pedagógico:</w:t>
+      </w:r>
+      <w:r>
+        <w:t xml:space="preserve"> Memorizar y practicar de manera guiada las líneas teóricas principales de las aperturas más célebres.</w:t>
+      </w:r>
+    </w:p>
+    <w:p>
+      <w:pPr>
+        <w:pStyle w:val="ListBullet"/>
+        <w:spacing w:after="80"/>
+        <w:ind w:left="1080"/>
+      </w:pPr>
+      <w:r>
+        <w:rPr>
+          <w:i/>
+        </w:rPr>
+        <w:t>Mecánica:</w:t>
+      </w:r>
+      <w:r>
+        <w:t xml:space="preserve"> El alumno selecciona una apertura y realiza los movimientos teóricos en el tablero interactivo. El sistema le guiará notificando si su jugada es la teórica, una alternativa viable o un error que desvía la teoría.</w:t>
+      </w:r>
+    </w:p>
+    <w:p>
+      <w:pPr>
+        <w:pStyle w:val="ListBullet"/>
+        <w:spacing w:after="80"/>
+        <w:ind w:left="360"/>
+      </w:pPr>
+      <w:r>
+        <w:rPr>
+          <w:b/>
+        </w:rPr>
+        <w:t>Módulo 19: Explorador del Árbol de Aperturas (`ExploradorAperturas.jsx`, `ArbolAperturas.css`)</w:t>
+      </w:r>
+    </w:p>
+    <w:p>
+      <w:pPr>
+        <w:pStyle w:val="ListBullet"/>
+        <w:spacing w:after="80"/>
+        <w:ind w:left="1080"/>
+      </w:pPr>
+      <w:r>
+        <w:rPr>
+          <w:i/>
+        </w:rPr>
+        <w:t>Objetivo Pedagógico:</w:t>
+      </w:r>
+      <w:r>
+        <w:t xml:space="preserve"> Investigar las estadísticas y ramificaciones teóricas de la base de datos de 40,509 partidas.</w:t>
+      </w:r>
+    </w:p>
+    <w:p>
+      <w:pPr>
+        <w:pStyle w:val="ListBullet"/>
+        <w:spacing w:after="80"/>
+        <w:ind w:left="1080"/>
+      </w:pPr>
+      <w:r>
+        <w:rPr>
+          <w:i/>
+        </w:rPr>
+        <w:t>Mecánica:</w:t>
+      </w:r>
+      <w:r>
+        <w:t xml:space="preserve"> Muestra una tabla interactiva con los movimientos posibles en la posición actual, indicando cuántas partidas en la base de datos jugaron ese movimiento, la tasa de éxito de blancas, tablas y negras, y el código ECO representativo de la línea.</w:t>
+      </w:r>
+    </w:p>
+    <w:p>
+      <w:pPr>
+        <w:pStyle w:val="ListBullet"/>
+        <w:spacing w:after="80"/>
+        <w:ind w:left="360"/>
+      </w:pPr>
+      <w:r>
+        <w:rPr>
+          <w:b/>
+        </w:rPr>
+        <w:t>Módulo 20: Editor de Repertorio y Variantes (`EditorVariantes.jsx`, `ArbolVariantes.jsx`)</w:t>
+      </w:r>
+    </w:p>
+    <w:p>
+      <w:pPr>
+        <w:pStyle w:val="ListBullet"/>
+        <w:spacing w:after="80"/>
+        <w:ind w:left="1080"/>
+      </w:pPr>
+      <w:r>
+        <w:rPr>
+          <w:i/>
+        </w:rPr>
+        <w:t>Objetivo Pedagógico:</w:t>
+      </w:r>
+      <w:r>
+        <w:t xml:space="preserve"> Crear, personalizar y mantener un repertorio de aperturas propio del estudiante.</w:t>
+      </w:r>
+    </w:p>
+    <w:p>
+      <w:pPr>
+        <w:pStyle w:val="ListBullet"/>
+        <w:spacing w:after="80"/>
+        <w:ind w:left="1080"/>
+      </w:pPr>
+      <w:r>
+        <w:rPr>
+          <w:i/>
+        </w:rPr>
+        <w:t>Mecánica:</w:t>
+      </w:r>
+      <w:r>
+        <w:t xml:space="preserve"> Permite introducir líneas personalizadas arrastrando piezas en el tablero, ramificar variantes mediante un árbol gráfico (</w:t>
       </w:r>
       <w:r>
         <w:rPr>
@@ -2571,10 +3841,10 @@
           <w:color w:val="000000"/>
           <w:sz w:val="20"/>
         </w:rPr>
-        <w:t>→</w:t>
-      </w:r>
-      <w:r>
-        <w:t>) para reproducir partidas completas sin interrupciones ni interferencia con los inputs de búsqueda de la interfaz.</w:t>
+        <w:t>ArbolVariantes.jsx</w:t>
+      </w:r>
+      <w:r>
+        <w:t>), añadir anotaciones de texto explicativas a cada movimiento, y guardar el repertorio personalizado en base de datos.</w:t>
       </w:r>
     </w:p>
     <w:p>
@@ -2587,10 +3857,762 @@
         <w:rPr>
           <w:b/>
         </w:rPr>
-        <w:t>Orquestación Universal (Docker Compose):</w:t>
-      </w:r>
-      <w:r>
-        <w:t xml:space="preserve"> Permite levantar toda la infraestructura del proyecto de forma inmutable, persistente y sin dependencias externas mediante </w:t>
+        <w:t>Módulo 21: Módulo Adivinar la Apertura (`AdivinarApertura.jsx`)</w:t>
+      </w:r>
+    </w:p>
+    <w:p>
+      <w:pPr>
+        <w:pStyle w:val="ListBullet"/>
+        <w:spacing w:after="80"/>
+        <w:ind w:left="1080"/>
+      </w:pPr>
+      <w:r>
+        <w:rPr>
+          <w:i/>
+        </w:rPr>
+        <w:t>Objetivo Pedagógico:</w:t>
+      </w:r>
+      <w:r>
+        <w:t xml:space="preserve"> Identificar e interiorizar la estructura y nombre de las aperturas basándose exclusivamente en su estado inicial.</w:t>
+      </w:r>
+    </w:p>
+    <w:p>
+      <w:pPr>
+        <w:pStyle w:val="ListBullet"/>
+        <w:spacing w:after="80"/>
+        <w:ind w:left="1080"/>
+      </w:pPr>
+      <w:r>
+        <w:rPr>
+          <w:i/>
+        </w:rPr>
+        <w:t>Mecánica:</w:t>
+      </w:r>
+      <w:r>
+        <w:t xml:space="preserve"> Presenta un tablero auxiliar con una apertura jugada de forma aleatoria (entre 6 y 10 movimientos) y propone un cuestionario de selección múltiple. El alumno debe seleccionar el nombre y variante correctos de la apertura mostrada.</w:t>
+      </w:r>
+    </w:p>
+    <w:p>
+      <w:pPr>
+        <w:pStyle w:val="ListBullet"/>
+        <w:spacing w:after="80"/>
+        <w:ind w:left="360"/>
+      </w:pPr>
+      <w:r>
+        <w:rPr>
+          <w:b/>
+        </w:rPr>
+        <w:t>Módulo 22: Tarjetas de Variantes (`FlashcardsVariantes.jsx`)</w:t>
+      </w:r>
+    </w:p>
+    <w:p>
+      <w:pPr>
+        <w:pStyle w:val="ListBullet"/>
+        <w:spacing w:after="80"/>
+        <w:ind w:left="1080"/>
+      </w:pPr>
+      <w:r>
+        <w:rPr>
+          <w:i/>
+        </w:rPr>
+        <w:t>Objetivo Pedagógico:</w:t>
+      </w:r>
+      <w:r>
+        <w:t xml:space="preserve"> Memorizar de forma activa líneas teóricas mediante repetición espaciada.</w:t>
+      </w:r>
+    </w:p>
+    <w:p>
+      <w:pPr>
+        <w:pStyle w:val="ListBullet"/>
+        <w:spacing w:after="80"/>
+        <w:ind w:left="1080"/>
+      </w:pPr>
+      <w:r>
+        <w:rPr>
+          <w:i/>
+        </w:rPr>
+        <w:t>Mecánica:</w:t>
+      </w:r>
+      <w:r>
+        <w:t xml:space="preserve"> Presenta la posición inicial de una apertura. El alumno debe introducir los siguientes 5 movimientos de la línea teórica en notación SAN sin ver el tablero auxiliar de ayuda. El sistema puntúa y guarda la tasa de acierto en base de datos.</w:t>
+      </w:r>
+    </w:p>
+    <w:p>
+      <w:pPr>
+        <w:pStyle w:val="ListBullet"/>
+        <w:spacing w:after="80"/>
+        <w:ind w:left="360"/>
+      </w:pPr>
+      <w:r>
+        <w:rPr>
+          <w:b/>
+        </w:rPr>
+        <w:t>Módulo 23: Base de Mates Teóricos (`MatesTeóricos.jsx`)</w:t>
+      </w:r>
+    </w:p>
+    <w:p>
+      <w:pPr>
+        <w:pStyle w:val="ListBullet"/>
+        <w:spacing w:after="80"/>
+        <w:ind w:left="1080"/>
+      </w:pPr>
+      <w:r>
+        <w:rPr>
+          <w:i/>
+        </w:rPr>
+        <w:t>Objetivo Pedagógico:</w:t>
+      </w:r>
+      <w:r>
+        <w:t xml:space="preserve"> Reconocer patrones de mate clásicos de forma instantánea en partidas reales.</w:t>
+      </w:r>
+    </w:p>
+    <w:p>
+      <w:pPr>
+        <w:pStyle w:val="ListBullet"/>
+        <w:spacing w:after="80"/>
+        <w:ind w:left="1080"/>
+      </w:pPr>
+      <w:r>
+        <w:rPr>
+          <w:i/>
+        </w:rPr>
+        <w:t>Mecánica:</w:t>
+      </w:r>
+      <w:r>
+        <w:t xml:space="preserve"> Base de datos interactiva con patrones como el Mate de Anastasia, el Mate de la Coz, el Mate del Pasillo, etc. El alumno debe resolver el jaque mate en N jugadas sobre el tablero interactivo.</w:t>
+      </w:r>
+    </w:p>
+    <w:p>
+      <w:pPr>
+        <w:pStyle w:val="ListBullet"/>
+        <w:spacing w:after="80"/>
+        <w:ind w:left="360"/>
+      </w:pPr>
+      <w:r>
+        <w:rPr>
+          <w:b/>
+        </w:rPr>
+        <w:t>Módulo 24: Base de Finales Teóricos (`EndgameTrainer.jsx`, `FinalesTeóricos.jsx`)</w:t>
+      </w:r>
+    </w:p>
+    <w:p>
+      <w:pPr>
+        <w:pStyle w:val="ListBullet"/>
+        <w:spacing w:after="80"/>
+        <w:ind w:left="1080"/>
+      </w:pPr>
+      <w:r>
+        <w:rPr>
+          <w:i/>
+        </w:rPr>
+        <w:t>Objetivo Pedagógico:</w:t>
+      </w:r>
+      <w:r>
+        <w:t xml:space="preserve"> Dominar finales teóricos fundamentales (Rey y Peón, finales de torres de Rubinstein, etc.).</w:t>
+      </w:r>
+    </w:p>
+    <w:p>
+      <w:pPr>
+        <w:pStyle w:val="ListBullet"/>
+        <w:spacing w:after="80"/>
+        <w:ind w:left="1080"/>
+      </w:pPr>
+      <w:r>
+        <w:rPr>
+          <w:i/>
+        </w:rPr>
+        <w:t>Mecánica:</w:t>
+      </w:r>
+      <w:r>
+        <w:t xml:space="preserve"> Posiciona al usuario contra Stockfish en una posición de final teóricamente ganado o entablado. El alumno debe demostrar la técnica correcta (ej. regla de la oposición o maniobra de Lucena) para ganar o empatar la partida contra el motor en su máxima fuerza de juego.</w:t>
+      </w:r>
+    </w:p>
+    <w:p>
+      <w:pPr>
+        <w:pStyle w:val="Heading3"/>
+        <w:keepNext/>
+        <w:spacing w:before="280" w:after="120"/>
+      </w:pPr>
+      <w:r>
+        <w:rPr>
+          <w:rFonts w:ascii="Times New Roman" w:hAnsi="Times New Roman"/>
+          <w:b/>
+          <w:color w:val="000000"/>
+          <w:sz w:val="24"/>
+        </w:rPr>
+        <w:t>Eje 5: Visualización Espacial y Cálculo Mental</w:t>
+      </w:r>
+    </w:p>
+    <w:p>
+      <w:pPr>
+        <w:pStyle w:val="ListBullet"/>
+        <w:spacing w:after="80"/>
+        <w:ind w:left="360"/>
+      </w:pPr>
+      <w:r>
+        <w:rPr>
+          <w:b/>
+        </w:rPr>
+        <w:t>Módulo 25: Ajedrez a Ciegas y Visualización (`VisualizacionSinTablero.jsx`)</w:t>
+      </w:r>
+    </w:p>
+    <w:p>
+      <w:pPr>
+        <w:pStyle w:val="ListBullet"/>
+        <w:spacing w:after="80"/>
+        <w:ind w:left="1080"/>
+      </w:pPr>
+      <w:r>
+        <w:rPr>
+          <w:i/>
+        </w:rPr>
+        <w:t>Objetivo Pedagógico:</w:t>
+      </w:r>
+      <w:r>
+        <w:t xml:space="preserve"> Entrenar la mente para seguir el transcurso de una partida y calcular posiciones futuras sin soporte visual de un tablero físico.</w:t>
+      </w:r>
+    </w:p>
+    <w:p>
+      <w:pPr>
+        <w:pStyle w:val="ListBullet"/>
+        <w:spacing w:after="80"/>
+        <w:ind w:left="1080"/>
+      </w:pPr>
+      <w:r>
+        <w:rPr>
+          <w:i/>
+        </w:rPr>
+        <w:t>Mecánica:</w:t>
+      </w:r>
+      <w:r>
+        <w:t xml:space="preserve"> El sistema describe movimientos en notación algebraica (ej. "1. e4 e5 2. Nf3 Nc6...") y el alumno debe responder preguntas sobre la posición resultante de las piezas, la existencia de jaques o amenazas tácticas activas.</w:t>
+      </w:r>
+    </w:p>
+    <w:p>
+      <w:pPr>
+        <w:pStyle w:val="ListBullet"/>
+        <w:spacing w:after="80"/>
+        <w:ind w:left="360"/>
+      </w:pPr>
+      <w:r>
+        <w:rPr>
+          <w:b/>
+        </w:rPr>
+        <w:t>Módulo 26: Test de Aprendizaje y Color de Casillas (`AprendizajeCasillas.jsx`)</w:t>
+      </w:r>
+    </w:p>
+    <w:p>
+      <w:pPr>
+        <w:pStyle w:val="ListBullet"/>
+        <w:spacing w:after="80"/>
+        <w:ind w:left="1080"/>
+      </w:pPr>
+      <w:r>
+        <w:rPr>
+          <w:i/>
+        </w:rPr>
+        <w:t>Objetivo Pedagógico:</w:t>
+      </w:r>
+      <w:r>
+        <w:t xml:space="preserve"> Memorizar la rejilla geométrica del tablero de ajedrez para acelerar la velocidad de cálculo ciego.</w:t>
+      </w:r>
+    </w:p>
+    <w:p>
+      <w:pPr>
+        <w:pStyle w:val="ListBullet"/>
+        <w:spacing w:after="80"/>
+        <w:ind w:left="1080"/>
+      </w:pPr>
+      <w:r>
+        <w:rPr>
+          <w:i/>
+        </w:rPr>
+        <w:t>Mecánica:</w:t>
+      </w:r>
+      <w:r>
+        <w:t xml:space="preserve"> Muestra coordenadas espaciales aisladas (ej. "g6", "c3") y el alumno debe pulsar botones para identificar si dicha casilla es blanca o negra en fracciones de segundo, midiendo la precisión y el tiempo de respuesta.</w:t>
+      </w:r>
+    </w:p>
+    <w:p>
+      <w:pPr>
+        <w:pStyle w:val="ListBullet"/>
+        <w:spacing w:after="80"/>
+        <w:ind w:left="360"/>
+      </w:pPr>
+      <w:r>
+        <w:rPr>
+          <w:b/>
+        </w:rPr>
+        <w:t>Módulo 27: Tablero de Coordenadas Infinito (`InfiniteChessboard.jsx`)</w:t>
+      </w:r>
+    </w:p>
+    <w:p>
+      <w:pPr>
+        <w:pStyle w:val="ListBullet"/>
+        <w:spacing w:after="80"/>
+        <w:ind w:left="1080"/>
+      </w:pPr>
+      <w:r>
+        <w:rPr>
+          <w:i/>
+        </w:rPr>
+        <w:t>Objetivo Pedagógico:</w:t>
+      </w:r>
+      <w:r>
+        <w:t xml:space="preserve"> Desarrollar la destreza de notación algebraica sobre el tablero dinámico.</w:t>
+      </w:r>
+    </w:p>
+    <w:p>
+      <w:pPr>
+        <w:pStyle w:val="ListBullet"/>
+        <w:spacing w:after="80"/>
+        <w:ind w:left="1080"/>
+      </w:pPr>
+      <w:r>
+        <w:rPr>
+          <w:i/>
+        </w:rPr>
+        <w:t>Mecánica:</w:t>
+      </w:r>
+      <w:r>
+        <w:t xml:space="preserve"> Un tablero interactivo sin piezas donde se van encendiendo casillas de forma aleatoria y el usuario debe escribir su nombre algebraico lo más rápido posible, acumulando rachas de aciertos continuos.</w:t>
+      </w:r>
+    </w:p>
+    <w:p>
+      <w:pPr>
+        <w:pStyle w:val="ListBullet"/>
+        <w:spacing w:after="80"/>
+        <w:ind w:left="360"/>
+      </w:pPr>
+      <w:r>
+        <w:rPr>
+          <w:b/>
+        </w:rPr>
+        <w:t>Módulo 28: Modo Espejo de Cálculo Invertido (`ModoEspejo.jsx`)</w:t>
+      </w:r>
+    </w:p>
+    <w:p>
+      <w:pPr>
+        <w:pStyle w:val="ListBullet"/>
+        <w:spacing w:after="80"/>
+        <w:ind w:left="1080"/>
+      </w:pPr>
+      <w:r>
+        <w:rPr>
+          <w:i/>
+        </w:rPr>
+        <w:t>Objetivo Pedagógico:</w:t>
+      </w:r>
+      <w:r>
+        <w:t xml:space="preserve"> Forzar la flexibilidad cognitiva mental y el cálculo espacial bajo perspectivas inusuales.</w:t>
+      </w:r>
+    </w:p>
+    <w:p>
+      <w:pPr>
+        <w:pStyle w:val="ListBullet"/>
+        <w:spacing w:after="80"/>
+        <w:ind w:left="1080"/>
+      </w:pPr>
+      <w:r>
+        <w:rPr>
+          <w:i/>
+        </w:rPr>
+        <w:t>Mecánica:</w:t>
+      </w:r>
+      <w:r>
+        <w:t xml:space="preserve"> Componente que gira de forma dinámica y simétrica el tablero y las coordenadas, obligando al usuario a resolver problemas tácticos o jugar desde la perspectiva invertida del oponente, desafiando su comodidad visual usual.</w:t>
+      </w:r>
+    </w:p>
+    <w:p>
+      <w:pPr>
+        <w:pStyle w:val="ListBullet"/>
+        <w:spacing w:after="80"/>
+        <w:ind w:left="360"/>
+      </w:pPr>
+      <w:r>
+        <w:rPr>
+          <w:b/>
+        </w:rPr>
+        <w:t>Módulo 29: Cálculo de Variantes y Árbol de Variantes (`CalculoVariantes.jsx`)</w:t>
+      </w:r>
+    </w:p>
+    <w:p>
+      <w:pPr>
+        <w:pStyle w:val="ListBullet"/>
+        <w:spacing w:after="80"/>
+        <w:ind w:left="1080"/>
+      </w:pPr>
+      <w:r>
+        <w:rPr>
+          <w:i/>
+        </w:rPr>
+        <w:t>Objetivo Pedagógico:</w:t>
+      </w:r>
+      <w:r>
+        <w:t xml:space="preserve"> Mejorar la profundidad de cálculo del estudiante, obligándole a prever varias jugadas por adelantado sin realizar movimientos físicos en el tablero.</w:t>
+      </w:r>
+    </w:p>
+    <w:p>
+      <w:pPr>
+        <w:pStyle w:val="ListBullet"/>
+        <w:spacing w:after="80"/>
+        <w:ind w:left="1080"/>
+      </w:pPr>
+      <w:r>
+        <w:rPr>
+          <w:i/>
+        </w:rPr>
+        <w:t>Mecánica:</w:t>
+      </w:r>
+      <w:r>
+        <w:t xml:space="preserve"> Presenta una posición táctica. El usuario debe introducir una secuencia completa de 3 o 4 jugadas (tanto sus movimientos como las respuestas previstas del oponente) y solo cuando introduce la variante completa, el sistema ejecuta y valida la línea.</w:t>
+      </w:r>
+    </w:p>
+    <w:p>
+      <w:pPr>
+        <w:pStyle w:val="Heading3"/>
+        <w:keepNext/>
+        <w:spacing w:before="280" w:after="120"/>
+      </w:pPr>
+      <w:r>
+        <w:rPr>
+          <w:rFonts w:ascii="Times New Roman" w:hAnsi="Times New Roman"/>
+          <w:b/>
+          <w:color w:val="000000"/>
+          <w:sz w:val="24"/>
+        </w:rPr>
+        <w:t>Eje 6: Memoria, Ejercicios Cognitivos y Competición</w:t>
+      </w:r>
+    </w:p>
+    <w:p>
+      <w:pPr>
+        <w:pStyle w:val="ListBullet"/>
+        <w:spacing w:after="80"/>
+        <w:ind w:left="360"/>
+      </w:pPr>
+      <w:r>
+        <w:rPr>
+          <w:b/>
+        </w:rPr>
+        <w:t>Módulo 30: Test de Memoria de Posiciones (`MemorizacionPosiciones.jsx`)</w:t>
+      </w:r>
+    </w:p>
+    <w:p>
+      <w:pPr>
+        <w:pStyle w:val="ListBullet"/>
+        <w:spacing w:after="80"/>
+        <w:ind w:left="1080"/>
+      </w:pPr>
+      <w:r>
+        <w:rPr>
+          <w:i/>
+        </w:rPr>
+        <w:t>Objetivo Pedagógico:</w:t>
+      </w:r>
+      <w:r>
+        <w:t xml:space="preserve"> Mejorar la memoria fotográfica de estructuras y posiciones de ajedrez.</w:t>
+      </w:r>
+    </w:p>
+    <w:p>
+      <w:pPr>
+        <w:pStyle w:val="ListBullet"/>
+        <w:spacing w:after="80"/>
+        <w:ind w:left="1080"/>
+      </w:pPr>
+      <w:r>
+        <w:rPr>
+          <w:i/>
+        </w:rPr>
+        <w:t>Mecánica:</w:t>
+      </w:r>
+      <w:r>
+        <w:t xml:space="preserve"> Muestra una posición compleja de una partida real durante 5 segundos. Posteriormente, el tablero se vacía por completo y el alumno debe reconstruir exactamente la ubicación de todas las piezas desde su reserva. Puntúa basándose en la desviación de piezas correctas colocadas.</w:t>
+      </w:r>
+    </w:p>
+    <w:p>
+      <w:pPr>
+        <w:pStyle w:val="ListBullet"/>
+        <w:spacing w:after="80"/>
+        <w:ind w:left="360"/>
+      </w:pPr>
+      <w:r>
+        <w:rPr>
+          <w:b/>
+        </w:rPr>
+        <w:t>Módulo 31: Reconstrucción de Partidas Clásicas (`PartidaReconstruida.jsx`)</w:t>
+      </w:r>
+    </w:p>
+    <w:p>
+      <w:pPr>
+        <w:pStyle w:val="ListBullet"/>
+        <w:spacing w:after="80"/>
+        <w:ind w:left="1080"/>
+      </w:pPr>
+      <w:r>
+        <w:rPr>
+          <w:i/>
+        </w:rPr>
+        <w:t>Objetivo Pedagógico:</w:t>
+      </w:r>
+      <w:r>
+        <w:t xml:space="preserve"> Estudiar la lógica profunda de desarrollo de una partida clásica jugada por un maestro.</w:t>
+      </w:r>
+    </w:p>
+    <w:p>
+      <w:pPr>
+        <w:pStyle w:val="ListBullet"/>
+        <w:spacing w:after="80"/>
+        <w:ind w:left="1080"/>
+      </w:pPr>
+      <w:r>
+        <w:rPr>
+          <w:i/>
+        </w:rPr>
+        <w:t>Mecánica:</w:t>
+      </w:r>
+      <w:r>
+        <w:t xml:space="preserve"> El alumno selecciona una partida clásica y debe ir adivinando el movimiento correcto que realizó el maestro jugada tras jugada. Si falla, el sistema le penaliza la puntuación pero le indica pistas sobre los planes estratégicos de la posición.</w:t>
+      </w:r>
+    </w:p>
+    <w:p>
+      <w:pPr>
+        <w:pStyle w:val="ListBullet"/>
+        <w:spacing w:after="80"/>
+        <w:ind w:left="360"/>
+      </w:pPr>
+      <w:r>
+        <w:rPr>
+          <w:b/>
+        </w:rPr>
+        <w:t>Módulo 32: Reconocimiento de Estructuras de Peones (`ReconocimientoEstructuras.jsx`)</w:t>
+      </w:r>
+    </w:p>
+    <w:p>
+      <w:pPr>
+        <w:pStyle w:val="ListBullet"/>
+        <w:spacing w:after="80"/>
+        <w:ind w:left="1080"/>
+      </w:pPr>
+      <w:r>
+        <w:rPr>
+          <w:i/>
+        </w:rPr>
+        <w:t>Objetivo Pedagógico:</w:t>
+      </w:r>
+      <w:r>
+        <w:t xml:space="preserve"> Identificar inmediatamente la estructura de peones en el tablero para formular planes a largo plazo.</w:t>
+      </w:r>
+    </w:p>
+    <w:p>
+      <w:pPr>
+        <w:pStyle w:val="ListBullet"/>
+        <w:spacing w:after="80"/>
+        <w:ind w:left="1080"/>
+      </w:pPr>
+      <w:r>
+        <w:rPr>
+          <w:i/>
+        </w:rPr>
+        <w:t>Mecánica:</w:t>
+      </w:r>
+      <w:r>
+        <w:t xml:space="preserve"> El sistema muestra una posición de medio juego sin piezas menores ni mayores (solo peones y reyes) y el alumno debe clasificar qué tipo de estructura clásica es (ej. Estructura Carlsbad, Cadena de peones del Rey, Peón de dama aislado) y responder un cuestionario sobre los planes temáticos correctos para cada bando.</w:t>
+      </w:r>
+    </w:p>
+    <w:p>
+      <w:pPr>
+        <w:pStyle w:val="ListBullet"/>
+        <w:spacing w:after="80"/>
+        <w:ind w:left="360"/>
+      </w:pPr>
+      <w:r>
+        <w:rPr>
+          <w:b/>
+        </w:rPr>
+        <w:t>Módulo 33: Quiz y Cuestionarios sobre Maestros (`QuizMaestros.jsx`)</w:t>
+      </w:r>
+    </w:p>
+    <w:p>
+      <w:pPr>
+        <w:pStyle w:val="ListBullet"/>
+        <w:spacing w:after="80"/>
+        <w:ind w:left="1080"/>
+      </w:pPr>
+      <w:r>
+        <w:rPr>
+          <w:i/>
+        </w:rPr>
+        <w:t>Objetivo Pedagógico:</w:t>
+      </w:r>
+      <w:r>
+        <w:t xml:space="preserve"> Afianzar la cultura general e histórica del ajedrez en los alumnos.</w:t>
+      </w:r>
+    </w:p>
+    <w:p>
+      <w:pPr>
+        <w:pStyle w:val="ListBullet"/>
+        <w:spacing w:after="80"/>
+        <w:ind w:left="1080"/>
+      </w:pPr>
+      <w:r>
+        <w:rPr>
+          <w:i/>
+        </w:rPr>
+        <w:t>Mecánica:</w:t>
+      </w:r>
+      <w:r>
+        <w:t xml:space="preserve"> Un juego de trivia con preguntas de opción múltiple acerca de las anécdotas, estilos, hitos y torneos célebres de los 20 grandes maestros, otorgando experiencia a quienes demuestren mayor erudición.</w:t>
+      </w:r>
+    </w:p>
+    <w:p>
+      <w:pPr>
+        <w:pStyle w:val="ListBullet"/>
+        <w:spacing w:after="80"/>
+        <w:ind w:left="360"/>
+      </w:pPr>
+      <w:r>
+        <w:rPr>
+          <w:b/>
+        </w:rPr>
+        <w:t>Módulo 34: Modo Torneo contra la IA (`TournamentMode.jsx`)</w:t>
+      </w:r>
+    </w:p>
+    <w:p>
+      <w:pPr>
+        <w:pStyle w:val="ListBullet"/>
+        <w:spacing w:after="80"/>
+        <w:ind w:left="1080"/>
+      </w:pPr>
+      <w:r>
+        <w:rPr>
+          <w:i/>
+        </w:rPr>
+        <w:t>Objetivo Pedagógico:</w:t>
+      </w:r>
+      <w:r>
+        <w:t xml:space="preserve"> Simular la tensión competitiva de un torneo oficial enfrentándose a múltiples maestros en rondas consecutivas.</w:t>
+      </w:r>
+    </w:p>
+    <w:p>
+      <w:pPr>
+        <w:pStyle w:val="ListBullet"/>
+        <w:spacing w:after="80"/>
+        <w:ind w:left="1080"/>
+      </w:pPr>
+      <w:r>
+        <w:rPr>
+          <w:i/>
+        </w:rPr>
+        <w:t>Mecánica:</w:t>
+      </w:r>
+      <w:r>
+        <w:t xml:space="preserve"> El alumno participa en una llave de eliminación directa o sistema suizo de 3 a 5 rondas contra maestros históricos controlados por la IA con dificultad progresiva, acumulando puntos de torneo y copas virtuales en su vitrina de trofeos.</w:t>
+      </w:r>
+    </w:p>
+    <w:p>
+      <w:pPr>
+        <w:pStyle w:val="ListBullet"/>
+        <w:spacing w:after="80"/>
+        <w:ind w:left="360"/>
+      </w:pPr>
+      <w:r>
+        <w:rPr>
+          <w:b/>
+        </w:rPr>
+        <w:t>Módulo 35: Modo Votación y Decisiones (`ModoVotacion.jsx`)</w:t>
+      </w:r>
+    </w:p>
+    <w:p>
+      <w:pPr>
+        <w:pStyle w:val="ListBullet"/>
+        <w:spacing w:after="80"/>
+        <w:ind w:left="1080"/>
+      </w:pPr>
+      <w:r>
+        <w:rPr>
+          <w:i/>
+        </w:rPr>
+        <w:t>Objetivo Pedagógico:</w:t>
+      </w:r>
+      <w:r>
+        <w:t xml:space="preserve"> Analizar la psicología colectiva y valorar múltiples opiniones estratégicas en una misma posición.</w:t>
+      </w:r>
+    </w:p>
+    <w:p>
+      <w:pPr>
+        <w:pStyle w:val="ListBullet"/>
+        <w:spacing w:after="80"/>
+        <w:ind w:left="1080"/>
+      </w:pPr>
+      <w:r>
+        <w:rPr>
+          <w:i/>
+        </w:rPr>
+        <w:t>Mecánica:</w:t>
+      </w:r>
+      <w:r>
+        <w:t xml:space="preserve"> Expone posiciones críticas donde múltiples planes son viables. Permite al alumno ver qué jugaron otros usuarios del club de ajedrez, votar por su plan preferido y comparar las decisiones democráticas con la recomendación objetiva de Stockfish.</w:t>
+      </w:r>
+    </w:p>
+    <w:p>
+      <w:pPr>
+        <w:pStyle w:val="Heading3"/>
+        <w:keepNext/>
+        <w:spacing w:before="280" w:after="120"/>
+      </w:pPr>
+      <w:r>
+        <w:rPr>
+          <w:rFonts w:ascii="Times New Roman" w:hAnsi="Times New Roman"/>
+          <w:b/>
+          <w:color w:val="000000"/>
+          <w:sz w:val="24"/>
+        </w:rPr>
+        <w:t>Eje 7: Ludificación, Social y Personalización UX</w:t>
+      </w:r>
+    </w:p>
+    <w:p>
+      <w:pPr>
+        <w:pStyle w:val="ListBullet"/>
+        <w:spacing w:after="80"/>
+        <w:ind w:left="360"/>
+      </w:pPr>
+      <w:r>
+        <w:rPr>
+          <w:b/>
+        </w:rPr>
+        <w:t>Módulo 36: Progresión de XP e Historial del Perfil (`PerfilUsuario.jsx`, `GraficoXP.jsx`)</w:t>
+      </w:r>
+    </w:p>
+    <w:p>
+      <w:pPr>
+        <w:pStyle w:val="ListBullet"/>
+        <w:spacing w:after="80"/>
+        <w:ind w:left="1080"/>
+      </w:pPr>
+      <w:r>
+        <w:rPr>
+          <w:i/>
+        </w:rPr>
+        <w:t>Objetivo Pedagógico:</w:t>
+      </w:r>
+      <w:r>
+        <w:t xml:space="preserve"> Motivar al alumno a entrenar de forma constante mediante mecánicas de recompensa.</w:t>
+      </w:r>
+    </w:p>
+    <w:p>
+      <w:pPr>
+        <w:pStyle w:val="ListBullet"/>
+        <w:spacing w:after="80"/>
+        <w:ind w:left="1080"/>
+      </w:pPr>
+      <w:r>
+        <w:rPr>
+          <w:i/>
+        </w:rPr>
+        <w:t>Mecánica:</w:t>
+      </w:r>
+      <w:r>
+        <w:t xml:space="preserve"> Rastrear los puntos de experiencia (XP) ganados en todos los modos de juego. Muestra un gráfico lineal interactivo (</w:t>
       </w:r>
       <w:r>
         <w:rPr>
@@ -2598,10 +4620,291 @@
           <w:color w:val="000000"/>
           <w:sz w:val="20"/>
         </w:rPr>
-        <w:t>docker compose up --build</w:t>
-      </w:r>
-      <w:r>
-        <w:t>.</w:t>
+        <w:t>Recharts</w:t>
+      </w:r>
+      <w:r>
+        <w:t>) de evolución de XP a lo largo de las semanas, su nivel actual, logros desbloqueados y el calendario visual de actividad.</w:t>
+      </w:r>
+    </w:p>
+    <w:p>
+      <w:pPr>
+        <w:pStyle w:val="ListBullet"/>
+        <w:spacing w:after="80"/>
+        <w:ind w:left="360"/>
+      </w:pPr>
+      <w:r>
+        <w:rPr>
+          <w:b/>
+        </w:rPr>
+        <w:t>Módulo 37: Calendario de Rachas Activas (`CalendarioRacha.jsx`)</w:t>
+      </w:r>
+    </w:p>
+    <w:p>
+      <w:pPr>
+        <w:pStyle w:val="ListBullet"/>
+        <w:spacing w:after="80"/>
+        <w:ind w:left="1080"/>
+      </w:pPr>
+      <w:r>
+        <w:rPr>
+          <w:i/>
+        </w:rPr>
+        <w:t>Objetivo Pedagógico:</w:t>
+      </w:r>
+      <w:r>
+        <w:t xml:space="preserve"> Fomentar la constancia diaria del estudio.</w:t>
+      </w:r>
+    </w:p>
+    <w:p>
+      <w:pPr>
+        <w:pStyle w:val="ListBullet"/>
+        <w:spacing w:after="80"/>
+        <w:ind w:left="1080"/>
+      </w:pPr>
+      <w:r>
+        <w:rPr>
+          <w:i/>
+        </w:rPr>
+        <w:t>Mecánica:</w:t>
+      </w:r>
+      <w:r>
+        <w:t xml:space="preserve"> Componente visual inspirado en la cuadrícula de contribuciones de GitHub. Muestra los 365 días del año en curso con celdas interactivas que se iluminan en color dorado de mayor o menor intensidad según el número de minutos de entrenamiento o partidas completadas ese día concreto.</w:t>
+      </w:r>
+    </w:p>
+    <w:p>
+      <w:pPr>
+        <w:pStyle w:val="ListBullet"/>
+        <w:spacing w:after="80"/>
+        <w:ind w:left="360"/>
+      </w:pPr>
+      <w:r>
+        <w:rPr>
+          <w:b/>
+        </w:rPr>
+        <w:t>Módulo 38: Misiones Semanales y Retos Diarios (`MisionesSemanales.jsx`, `RetosDelDia.jsx`)</w:t>
+      </w:r>
+    </w:p>
+    <w:p>
+      <w:pPr>
+        <w:pStyle w:val="ListBullet"/>
+        <w:spacing w:after="80"/>
+        <w:ind w:left="1080"/>
+      </w:pPr>
+      <w:r>
+        <w:rPr>
+          <w:i/>
+        </w:rPr>
+        <w:t>Objetivo Pedagógico:</w:t>
+      </w:r>
+      <w:r>
+        <w:t xml:space="preserve"> Proponer metas a corto plazo variadas para que el entrenamiento no sea monótono.</w:t>
+      </w:r>
+    </w:p>
+    <w:p>
+      <w:pPr>
+        <w:pStyle w:val="ListBullet"/>
+        <w:spacing w:after="80"/>
+        <w:ind w:left="1080"/>
+      </w:pPr>
+      <w:r>
+        <w:rPr>
+          <w:i/>
+        </w:rPr>
+        <w:t>Mecánica:</w:t>
+      </w:r>
+      <w:r>
+        <w:t xml:space="preserve"> Mapea retos diarios del sistema (ej. "Gana a Mikhail Tal con negras hoy" o "Resuelve 5 problemas de mate en 2"). Otorga multiplicadores de XP al completar las misiones dentro del plazo.</w:t>
+      </w:r>
+    </w:p>
+    <w:p>
+      <w:pPr>
+        <w:pStyle w:val="ListBullet"/>
+        <w:spacing w:after="80"/>
+        <w:ind w:left="360"/>
+      </w:pPr>
+      <w:r>
+        <w:rPr>
+          <w:b/>
+        </w:rPr>
+        <w:t>Módulo 39: Red Social y Sistema de Amigos (`SistemaAmigos.jsx`)</w:t>
+      </w:r>
+    </w:p>
+    <w:p>
+      <w:pPr>
+        <w:pStyle w:val="ListBullet"/>
+        <w:spacing w:after="80"/>
+        <w:ind w:left="1080"/>
+      </w:pPr>
+      <w:r>
+        <w:rPr>
+          <w:i/>
+        </w:rPr>
+        <w:t>Objetivo Pedagógico:</w:t>
+      </w:r>
+      <w:r>
+        <w:t xml:space="preserve"> Fomentar la competitividad sana y el aprendizaje cooperativo entre estudiantes.</w:t>
+      </w:r>
+    </w:p>
+    <w:p>
+      <w:pPr>
+        <w:pStyle w:val="ListBullet"/>
+        <w:spacing w:after="80"/>
+        <w:ind w:left="1080"/>
+      </w:pPr>
+      <w:r>
+        <w:rPr>
+          <w:i/>
+        </w:rPr>
+        <w:t>Mecánica:</w:t>
+      </w:r>
+      <w:r>
+        <w:t xml:space="preserve"> Interfaz completa que permite buscar alumnos de la universidad por nombre de usuario, enviar solicitudes de amistad, ver su estado de conexión en tiempo real, comparar estadísticas de juego y competir en un ranking de clasificación semanal por XP.</w:t>
+      </w:r>
+    </w:p>
+    <w:p>
+      <w:pPr>
+        <w:pStyle w:val="ListBullet"/>
+        <w:spacing w:after="80"/>
+        <w:ind w:left="360"/>
+      </w:pPr>
+      <w:r>
+        <w:rPr>
+          <w:b/>
+        </w:rPr>
+        <w:t>Módulo 40: Tabla de Clasificación Universitaria (`TablaClasificacion.jsx`)</w:t>
+      </w:r>
+    </w:p>
+    <w:p>
+      <w:pPr>
+        <w:pStyle w:val="ListBullet"/>
+        <w:spacing w:after="80"/>
+        <w:ind w:left="1080"/>
+      </w:pPr>
+      <w:r>
+        <w:rPr>
+          <w:i/>
+        </w:rPr>
+        <w:t>Objetivo Pedagógico:</w:t>
+      </w:r>
+      <w:r>
+        <w:t xml:space="preserve"> Estimular la superación personal mediante un ranking de competencia académica visible.</w:t>
+      </w:r>
+    </w:p>
+    <w:p>
+      <w:pPr>
+        <w:pStyle w:val="ListBullet"/>
+        <w:spacing w:after="80"/>
+        <w:ind w:left="1080"/>
+      </w:pPr>
+      <w:r>
+        <w:rPr>
+          <w:i/>
+        </w:rPr>
+        <w:t>Mecánica:</w:t>
+      </w:r>
+      <w:r>
+        <w:t xml:space="preserve"> Muestra la lista ordenada de estudiantes ordenados por sus puntos de experiencia totales o semanales, destacando insignias personalizadas y medallas para los tres primeros puestos.</w:t>
+      </w:r>
+    </w:p>
+    <w:p>
+      <w:pPr>
+        <w:pStyle w:val="ListBullet"/>
+        <w:spacing w:after="80"/>
+        <w:ind w:left="360"/>
+      </w:pPr>
+      <w:r>
+        <w:rPr>
+          <w:b/>
+        </w:rPr>
+        <w:t>Módulo 41: Panel de Personalización Estética (`PanelPersonalizacion.jsx`)</w:t>
+      </w:r>
+    </w:p>
+    <w:p>
+      <w:pPr>
+        <w:pStyle w:val="ListBullet"/>
+        <w:spacing w:after="80"/>
+        <w:ind w:left="1080"/>
+      </w:pPr>
+      <w:r>
+        <w:rPr>
+          <w:i/>
+        </w:rPr>
+        <w:t>Objetivo Pedagógico:</w:t>
+      </w:r>
+      <w:r>
+        <w:t xml:space="preserve"> Proveer una UX inmersiva y cómoda reduciendo la fatiga visual.</w:t>
+      </w:r>
+    </w:p>
+    <w:p>
+      <w:pPr>
+        <w:pStyle w:val="ListBullet"/>
+        <w:spacing w:after="80"/>
+        <w:ind w:left="1080"/>
+      </w:pPr>
+      <w:r>
+        <w:rPr>
+          <w:i/>
+        </w:rPr>
+        <w:t>Mecánica:</w:t>
+      </w:r>
+      <w:r>
+        <w:t xml:space="preserve"> Permite cambiar en tiempo real los temas del tablero (madera vintage, modo oscuro de neón, clásico torneo en blanco y negro), sets de piezas vectoriales e incorporar packs de sonidos personalizados para el movimiento y captura de piezas.</w:t>
+      </w:r>
+    </w:p>
+    <w:p>
+      <w:pPr>
+        <w:pStyle w:val="ListBullet"/>
+        <w:spacing w:after="80"/>
+        <w:ind w:left="360"/>
+      </w:pPr>
+      <w:r>
+        <w:rPr>
+          <w:b/>
+        </w:rPr>
+        <w:t>Módulo 42: Analíticas y Estadísticas Avanzadas (`Estadisticas.jsx`, `EstadisticasJuego.jsx`, `MapaCalor.jsx`)</w:t>
+      </w:r>
+    </w:p>
+    <w:p>
+      <w:pPr>
+        <w:pStyle w:val="ListBullet"/>
+        <w:spacing w:after="80"/>
+        <w:ind w:left="1080"/>
+      </w:pPr>
+      <w:r>
+        <w:rPr>
+          <w:i/>
+        </w:rPr>
+        <w:t>Objetivo Pedagógico:</w:t>
+      </w:r>
+      <w:r>
+        <w:t xml:space="preserve"> Estudiar científicamente el propio juego del estudiante para detectar sesgos espaciales.</w:t>
+      </w:r>
+    </w:p>
+    <w:p>
+      <w:pPr>
+        <w:pStyle w:val="ListBullet"/>
+        <w:spacing w:after="80"/>
+        <w:ind w:left="1080"/>
+      </w:pPr>
+      <w:r>
+        <w:rPr>
+          <w:i/>
+        </w:rPr>
+        <w:t>Mecánica:</w:t>
+      </w:r>
+      <w:r>
+        <w:t xml:space="preserve"> Provee gráficos circulares de efectividad por color de piezas, aperturas predilectas y un mapa de calor (</w:t>
+      </w:r>
+      <w:r>
+        <w:rPr>
+          <w:rFonts w:ascii="Courier New" w:hAnsi="Courier New"/>
+          <w:color w:val="000000"/>
+          <w:sz w:val="20"/>
+        </w:rPr>
+        <w:t>MapaCalor.jsx</w:t>
+      </w:r>
+      <w:r>
+        <w:t>) interactivo que pinta con intensidades de rojo o verde las casillas donde el alumno comete más capturas o deja piezas desprotegidas en sus partidas.</w:t>
       </w:r>
     </w:p>
     <w:p>
@@ -2693,6 +4996,15 @@
       </w:pPr>
       <w:r>
         <w:t>La base de datos relacional ligera SQLite de ~24 MB almacena de manera robusta y rápida más de 40,000 partidas y la ludificación de XP de los estudiantes.</w:t>
+      </w:r>
+    </w:p>
+    <w:p>
+      <w:pPr>
+        <w:pStyle w:val="ListNumber"/>
+        <w:spacing w:after="80"/>
+      </w:pPr>
+      <w:r>
+        <w:t>El inmenso catálogo de 42 módulos de entrenamiento desarrollados dota a la plataforma de una riqueza pedagógica sin precedentes, cubriendo desde táctica, estrategia, visualización mental hasta progresión social.</w:t>
       </w:r>
     </w:p>
     <w:p>

</xml_diff>

<commit_message>
fix: resolve transient ER diagram timeout and add robust image fallback during Word compilation
</commit_message>
<xml_diff>
--- a/T5 - Proyecto-20260527/DOCUMENTACION_COMPLETA.docx
+++ b/T5 - Proyecto-20260527/DOCUMENTACION_COMPLETA.docx
@@ -2575,112 +2575,58 @@
     </w:p>
     <w:p>
       <w:pPr>
-        <w:ind w:left="720"/>
+        <w:spacing w:before="240" w:after="80"/>
+        <w:jc w:val="center"/>
+      </w:pPr>
+      <w:r>
+        <w:drawing>
+          <wp:inline xmlns:a="http://schemas.openxmlformats.org/drawingml/2006/main" xmlns:pic="http://schemas.openxmlformats.org/drawingml/2006/picture">
+            <wp:extent cx="5486400" cy="11467143"/>
+            <wp:docPr id="3" name="Picture 3"/>
+            <wp:cNvGraphicFramePr>
+              <a:graphicFrameLocks noChangeAspect="1"/>
+            </wp:cNvGraphicFramePr>
+            <a:graphic>
+              <a:graphicData uri="http://schemas.openxmlformats.org/drawingml/2006/picture">
+                <pic:pic>
+                  <pic:nvPicPr>
+                    <pic:cNvPr id="0" name="diagrama_3.png"/>
+                    <pic:cNvPicPr/>
+                  </pic:nvPicPr>
+                  <pic:blipFill>
+                    <a:blip r:embed="rId11"/>
+                    <a:stretch>
+                      <a:fillRect/>
+                    </a:stretch>
+                  </pic:blipFill>
+                  <pic:spPr>
+                    <a:xfrm>
+                      <a:off x="0" y="0"/>
+                      <a:ext cx="5486400" cy="11467143"/>
+                    </a:xfrm>
+                    <a:prstGeom prst="rect"/>
+                  </pic:spPr>
+                </pic:pic>
+              </a:graphicData>
+            </a:graphic>
+          </wp:inline>
+        </w:drawing>
+      </w:r>
+    </w:p>
+    <w:p>
+      <w:pPr>
+        <w:keepNext/>
+        <w:spacing w:after="240"/>
+        <w:jc w:val="center"/>
       </w:pPr>
       <w:r>
         <w:rPr>
-          <w:rFonts w:ascii="Courier New" w:hAnsi="Courier New"/>
+          <w:rFonts w:ascii="Times New Roman" w:hAnsi="Times New Roman"/>
+          <w:i/>
+          <w:color w:val="505050"/>
           <w:sz w:val="19"/>
         </w:rPr>
-        <w:t>erDiagram</w:t>
-        <w:br/>
-        <w:t xml:space="preserve">    JUGADORES ||--o{ PARTIDAS : "disputa"</w:t>
-        <w:br/>
-        <w:t xml:space="preserve">    JUGADORES {</w:t>
-        <w:br/>
-        <w:t xml:space="preserve">        int Id PK</w:t>
-        <w:br/>
-        <w:t xml:space="preserve">        string Nombre</w:t>
-        <w:br/>
-        <w:t xml:space="preserve">        int AnioNacimiento</w:t>
-        <w:br/>
-        <w:t xml:space="preserve">        string Pais</w:t>
-        <w:br/>
-        <w:t xml:space="preserve">        float PesoSacrificio</w:t>
-        <w:br/>
-        <w:t xml:space="preserve">        float PesoAtaqueRey</w:t>
-        <w:br/>
-        <w:t xml:space="preserve">        float PesoSimplificacion</w:t>
-        <w:br/>
-        <w:t xml:space="preserve">        float PesoFinales</w:t>
-        <w:br/>
-        <w:t xml:space="preserve">        float PesoControlCentro</w:t>
-        <w:br/>
-        <w:t xml:space="preserve">    }</w:t>
-        <w:br/>
-        <w:t xml:space="preserve">    PARTIDAS ||--o{ POSICIONES : "contiene"</w:t>
-        <w:br/>
-        <w:t xml:space="preserve">    PARTIDAS {</w:t>
-        <w:br/>
-        <w:t xml:space="preserve">        int Id PK</w:t>
-        <w:br/>
-        <w:t xml:space="preserve">        int JugadorId FK</w:t>
-        <w:br/>
-        <w:t xml:space="preserve">        string Oponente</w:t>
-        <w:br/>
-        <w:t xml:space="preserve">        int Anio</w:t>
-        <w:br/>
-        <w:t xml:space="preserve">        string Evento</w:t>
-        <w:br/>
-        <w:t xml:space="preserve">        string CodigoECO</w:t>
-        <w:br/>
-        <w:t xml:space="preserve">        string AperturaNombre</w:t>
-        <w:br/>
-        <w:t xml:space="preserve">        string VarianteNombre</w:t>
-        <w:br/>
-        <w:t xml:space="preserve">        string PGN</w:t>
-        <w:br/>
-        <w:t xml:space="preserve">        string ColorJugador</w:t>
-        <w:br/>
-        <w:t xml:space="preserve">        string Resultado</w:t>
-        <w:br/>
-        <w:t xml:space="preserve">    }</w:t>
-        <w:br/>
-        <w:t xml:space="preserve">    POSICIONES {</w:t>
-        <w:br/>
-        <w:t xml:space="preserve">        int Id PK</w:t>
-        <w:br/>
-        <w:t xml:space="preserve">        int PartidaId FK</w:t>
-        <w:br/>
-        <w:t xml:space="preserve">        string FEN</w:t>
-        <w:br/>
-        <w:t xml:space="preserve">        string MovimientoHistorico</w:t>
-        <w:br/>
-        <w:t xml:space="preserve">        string TipoPosicion</w:t>
-        <w:br/>
-        <w:t xml:space="preserve">    }</w:t>
-        <w:br/>
-        <w:t xml:space="preserve">    USUARIOS ||--o{ LOGROS : "obtiene"</w:t>
-        <w:br/>
-        <w:t xml:space="preserve">    USUARIOS {</w:t>
-        <w:br/>
-        <w:t xml:space="preserve">        int Id PK</w:t>
-        <w:br/>
-        <w:t xml:space="preserve">        string Username</w:t>
-        <w:br/>
-        <w:t xml:space="preserve">        string PasswordHash</w:t>
-        <w:br/>
-        <w:t xml:space="preserve">        int XP</w:t>
-        <w:br/>
-        <w:t xml:space="preserve">        int RachaDias</w:t>
-        <w:br/>
-        <w:t xml:space="preserve">        string UltimaActividad</w:t>
-        <w:br/>
-        <w:t xml:space="preserve">    }</w:t>
-        <w:br/>
-        <w:t xml:space="preserve">    LOGROS {</w:t>
-        <w:br/>
-        <w:t xml:space="preserve">        int Id PK</w:t>
-        <w:br/>
-        <w:t xml:space="preserve">        int UsuarioId FK</w:t>
-        <w:br/>
-        <w:t xml:space="preserve">        string Codigo</w:t>
-        <w:br/>
-        <w:t xml:space="preserve">        string Titulo</w:t>
-        <w:br/>
-        <w:t xml:space="preserve">        string FechaLogro</w:t>
-        <w:br/>
-        <w:t xml:space="preserve">    }</w:t>
+        <w:t>Figura 4.3. Modelo Conceptual Base de Datos Relacional (Diagrama Entidad-Relacion).</w:t>
       </w:r>
     </w:p>
     <w:p>
@@ -2708,7 +2654,7 @@
         <w:drawing>
           <wp:inline xmlns:a="http://schemas.openxmlformats.org/drawingml/2006/main" xmlns:pic="http://schemas.openxmlformats.org/drawingml/2006/picture">
             <wp:extent cx="5486400" cy="5749888"/>
-            <wp:docPr id="3" name="Picture 3"/>
+            <wp:docPr id="4" name="Picture 4"/>
             <wp:cNvGraphicFramePr>
               <a:graphicFrameLocks noChangeAspect="1"/>
             </wp:cNvGraphicFramePr>
@@ -2720,7 +2666,7 @@
                     <pic:cNvPicPr/>
                   </pic:nvPicPr>
                   <pic:blipFill>
-                    <a:blip r:embed="rId11"/>
+                    <a:blip r:embed="rId12"/>
                     <a:stretch>
                       <a:fillRect/>
                     </a:stretch>
@@ -2789,7 +2735,7 @@
         <w:drawing>
           <wp:inline xmlns:a="http://schemas.openxmlformats.org/drawingml/2006/main" xmlns:pic="http://schemas.openxmlformats.org/drawingml/2006/picture">
             <wp:extent cx="5486400" cy="2189950"/>
-            <wp:docPr id="4" name="Picture 4"/>
+            <wp:docPr id="5" name="Picture 5"/>
             <wp:cNvGraphicFramePr>
               <a:graphicFrameLocks noChangeAspect="1"/>
             </wp:cNvGraphicFramePr>
@@ -2801,7 +2747,7 @@
                     <pic:cNvPicPr/>
                   </pic:nvPicPr>
                   <pic:blipFill>
-                    <a:blip r:embed="rId12"/>
+                    <a:blip r:embed="rId13"/>
                     <a:stretch>
                       <a:fillRect/>
                     </a:stretch>

</xml_diff>

<commit_message>
fix: change diagram extensions to JPG to match binary signature, resolving MS Word display error
</commit_message>
<xml_diff>
--- a/T5 - Proyecto-20260527/DOCUMENTACION_COMPLETA.docx
+++ b/T5 - Proyecto-20260527/DOCUMENTACION_COMPLETA.docx
@@ -2360,7 +2360,7 @@
               <a:graphicData uri="http://schemas.openxmlformats.org/drawingml/2006/picture">
                 <pic:pic>
                   <pic:nvPicPr>
-                    <pic:cNvPr id="0" name="diagrama_1.png"/>
+                    <pic:cNvPr id="0" name="diagrama_1.jpg"/>
                     <pic:cNvPicPr/>
                   </pic:nvPicPr>
                   <pic:blipFill>
@@ -2484,7 +2484,7 @@
               <a:graphicData uri="http://schemas.openxmlformats.org/drawingml/2006/picture">
                 <pic:pic>
                   <pic:nvPicPr>
-                    <pic:cNvPr id="0" name="diagrama_2.png"/>
+                    <pic:cNvPr id="0" name="diagrama_2.jpg"/>
                     <pic:cNvPicPr/>
                   </pic:nvPicPr>
                   <pic:blipFill>
@@ -2590,7 +2590,7 @@
               <a:graphicData uri="http://schemas.openxmlformats.org/drawingml/2006/picture">
                 <pic:pic>
                   <pic:nvPicPr>
-                    <pic:cNvPr id="0" name="diagrama_3.png"/>
+                    <pic:cNvPr id="0" name="diagrama_3.jpg"/>
                     <pic:cNvPicPr/>
                   </pic:nvPicPr>
                   <pic:blipFill>
@@ -2662,7 +2662,7 @@
               <a:graphicData uri="http://schemas.openxmlformats.org/drawingml/2006/picture">
                 <pic:pic>
                   <pic:nvPicPr>
-                    <pic:cNvPr id="0" name="diagrama_4.png"/>
+                    <pic:cNvPr id="0" name="diagrama_4.jpg"/>
                     <pic:cNvPicPr/>
                   </pic:nvPicPr>
                   <pic:blipFill>
@@ -2743,7 +2743,7 @@
               <a:graphicData uri="http://schemas.openxmlformats.org/drawingml/2006/picture">
                 <pic:pic>
                   <pic:nvPicPr>
-                    <pic:cNvPr id="0" name="diagrama_5.png"/>
+                    <pic:cNvPr id="0" name="diagrama_5.jpg"/>
                     <pic:cNvPicPr/>
                   </pic:nvPicPr>
                   <pic:blipFill>

</xml_diff>